<commit_message>
Evolución y solución de incidencias, evolución y seguimiento del proyecto
</commit_message>
<xml_diff>
--- a/Documentacion/UT_7_2024_2025.docx
+++ b/Documentacion/UT_7_2024_2025.docx
@@ -306,7 +306,7 @@
                     </wp:inline>
                   </w:drawing>
                 </mc:Choice>
-                <mc:Fallback xmlns:cx1="http://schemas.microsoft.com/office/drawing/2015/9/8/chartex" xmlns:cx2="http://schemas.microsoft.com/office/drawing/2015/10/21/chartex" xmlns:cx3="http://schemas.microsoft.com/office/drawing/2016/5/9/chartex" xmlns:cx4="http://schemas.microsoft.com/office/drawing/2016/5/10/chartex" xmlns:cx5="http://schemas.microsoft.com/office/drawing/2016/5/11/chartex" xmlns:cx6="http://schemas.microsoft.com/office/drawing/2016/5/12/chartex" xmlns:cx7="http://schemas.microsoft.com/office/drawing/2016/5/13/chartex" xmlns:cx8="http://schemas.microsoft.com/office/drawing/2016/5/14/chartex" xmlns:aink="http://schemas.microsoft.com/office/drawing/2016/ink" xmlns:am3d="http://schemas.microsoft.com/office/drawing/2017/model3d" xmlns:oel="http://schemas.microsoft.com/office/2019/extlst" xmlns:w16cex="http://schemas.microsoft.com/office/word/2018/wordml/cex" xmlns:w16cid="http://schemas.microsoft.com/office/word/2016/wordml/cid" xmlns:w16="http://schemas.microsoft.com/office/word/2018/wordml" xmlns:w16sdtdh="http://schemas.microsoft.com/office/word/2020/wordml/sdtdatahash">
+                <mc:Fallback xmlns:w16sdtdh="http://schemas.microsoft.com/office/word/2020/wordml/sdtdatahash" xmlns:w16="http://schemas.microsoft.com/office/word/2018/wordml" xmlns:w16cid="http://schemas.microsoft.com/office/word/2016/wordml/cid" xmlns:w16cex="http://schemas.microsoft.com/office/word/2018/wordml/cex" xmlns:oel="http://schemas.microsoft.com/office/2019/extlst" xmlns:am3d="http://schemas.microsoft.com/office/drawing/2017/model3d" xmlns:aink="http://schemas.microsoft.com/office/drawing/2016/ink" xmlns:cx8="http://schemas.microsoft.com/office/drawing/2016/5/14/chartex" xmlns:cx7="http://schemas.microsoft.com/office/drawing/2016/5/13/chartex" xmlns:cx6="http://schemas.microsoft.com/office/drawing/2016/5/12/chartex" xmlns:cx5="http://schemas.microsoft.com/office/drawing/2016/5/11/chartex" xmlns:cx4="http://schemas.microsoft.com/office/drawing/2016/5/10/chartex" xmlns:cx3="http://schemas.microsoft.com/office/drawing/2016/5/9/chartex" xmlns:cx2="http://schemas.microsoft.com/office/drawing/2015/10/21/chartex" xmlns:cx1="http://schemas.microsoft.com/office/drawing/2015/9/8/chartex">
                   <w:pict>
                     <v:line w14:anchorId="159F9B0C" id="Conector recto 6" o:spid="_x0000_s1026" alt="divisor de texto" style="visibility:visible;mso-wrap-style:square;mso-left-percent:-10001;mso-top-percent:-10001;mso-position-horizontal:absolute;mso-position-horizontal-relative:char;mso-position-vertical:absolute;mso-position-vertical-relative:line;mso-left-percent:-10001;mso-top-percent:-10001" from="0,0" to="117.65pt,0" o:gfxdata="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" strokecolor="#082a75 [3215]" strokeweight="3pt">
                       <w10:anchorlock/>
@@ -547,7 +547,7 @@
               </wp:anchor>
             </w:drawing>
           </mc:Choice>
-          <mc:Fallback xmlns:cx1="http://schemas.microsoft.com/office/drawing/2015/9/8/chartex" xmlns:cx2="http://schemas.microsoft.com/office/drawing/2015/10/21/chartex" xmlns:cx3="http://schemas.microsoft.com/office/drawing/2016/5/9/chartex" xmlns:cx4="http://schemas.microsoft.com/office/drawing/2016/5/10/chartex" xmlns:cx5="http://schemas.microsoft.com/office/drawing/2016/5/11/chartex" xmlns:cx6="http://schemas.microsoft.com/office/drawing/2016/5/12/chartex" xmlns:cx7="http://schemas.microsoft.com/office/drawing/2016/5/13/chartex" xmlns:cx8="http://schemas.microsoft.com/office/drawing/2016/5/14/chartex" xmlns:aink="http://schemas.microsoft.com/office/drawing/2016/ink" xmlns:am3d="http://schemas.microsoft.com/office/drawing/2017/model3d" xmlns:oel="http://schemas.microsoft.com/office/2019/extlst" xmlns:w16cex="http://schemas.microsoft.com/office/word/2018/wordml/cex" xmlns:w16cid="http://schemas.microsoft.com/office/word/2016/wordml/cid" xmlns:w16="http://schemas.microsoft.com/office/word/2018/wordml" xmlns:w16sdtdh="http://schemas.microsoft.com/office/word/2020/wordml/sdtdatahash">
+          <mc:Fallback xmlns:w16sdtdh="http://schemas.microsoft.com/office/word/2020/wordml/sdtdatahash" xmlns:w16="http://schemas.microsoft.com/office/word/2018/wordml" xmlns:w16cid="http://schemas.microsoft.com/office/word/2016/wordml/cid" xmlns:w16cex="http://schemas.microsoft.com/office/word/2018/wordml/cex" xmlns:oel="http://schemas.microsoft.com/office/2019/extlst" xmlns:am3d="http://schemas.microsoft.com/office/drawing/2017/model3d" xmlns:aink="http://schemas.microsoft.com/office/drawing/2016/ink" xmlns:cx8="http://schemas.microsoft.com/office/drawing/2016/5/14/chartex" xmlns:cx7="http://schemas.microsoft.com/office/drawing/2016/5/13/chartex" xmlns:cx6="http://schemas.microsoft.com/office/drawing/2016/5/12/chartex" xmlns:cx5="http://schemas.microsoft.com/office/drawing/2016/5/11/chartex" xmlns:cx4="http://schemas.microsoft.com/office/drawing/2016/5/10/chartex" xmlns:cx3="http://schemas.microsoft.com/office/drawing/2016/5/9/chartex" xmlns:cx2="http://schemas.microsoft.com/office/drawing/2015/10/21/chartex" xmlns:cx1="http://schemas.microsoft.com/office/drawing/2015/9/8/chartex">
             <w:pict>
               <v:rect w14:anchorId="569A6C51" id="Rectángulo 3" o:spid="_x0000_s1026" alt="rectángulo blanco para texto en portada" style="position:absolute;margin-left:-16.05pt;margin-top:78pt;width:310.15pt;height:447pt;z-index:-251654144;visibility:visible;mso-wrap-style:square;mso-width-percent:0;mso-height-percent:0;mso-wrap-distance-left:9pt;mso-wrap-distance-top:0;mso-wrap-distance-right:9pt;mso-wrap-distance-bottom:0;mso-position-horizontal:absolute;mso-position-horizontal-relative:text;mso-position-vertical:absolute;mso-position-vertical-relative:page;mso-width-percent:0;mso-height-percent:0;mso-width-relative:margin;mso-height-relative:margin;v-text-anchor:middle" o:gfxdata="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" fillcolor="white [3212]" stroked="f" strokeweight="2pt">
                 <w10:wrap anchory="page"/>
@@ -627,7 +627,7 @@
               </wp:anchor>
             </w:drawing>
           </mc:Choice>
-          <mc:Fallback xmlns:cx1="http://schemas.microsoft.com/office/drawing/2015/9/8/chartex" xmlns:cx2="http://schemas.microsoft.com/office/drawing/2015/10/21/chartex" xmlns:cx3="http://schemas.microsoft.com/office/drawing/2016/5/9/chartex" xmlns:cx4="http://schemas.microsoft.com/office/drawing/2016/5/10/chartex" xmlns:cx5="http://schemas.microsoft.com/office/drawing/2016/5/11/chartex" xmlns:cx6="http://schemas.microsoft.com/office/drawing/2016/5/12/chartex" xmlns:cx7="http://schemas.microsoft.com/office/drawing/2016/5/13/chartex" xmlns:cx8="http://schemas.microsoft.com/office/drawing/2016/5/14/chartex" xmlns:aink="http://schemas.microsoft.com/office/drawing/2016/ink" xmlns:am3d="http://schemas.microsoft.com/office/drawing/2017/model3d" xmlns:oel="http://schemas.microsoft.com/office/2019/extlst" xmlns:w16cex="http://schemas.microsoft.com/office/word/2018/wordml/cex" xmlns:w16cid="http://schemas.microsoft.com/office/word/2016/wordml/cid" xmlns:w16="http://schemas.microsoft.com/office/word/2018/wordml" xmlns:w16sdtdh="http://schemas.microsoft.com/office/word/2020/wordml/sdtdatahash">
+          <mc:Fallback xmlns:w16sdtdh="http://schemas.microsoft.com/office/word/2020/wordml/sdtdatahash" xmlns:w16="http://schemas.microsoft.com/office/word/2018/wordml" xmlns:w16cid="http://schemas.microsoft.com/office/word/2016/wordml/cid" xmlns:w16cex="http://schemas.microsoft.com/office/word/2018/wordml/cex" xmlns:oel="http://schemas.microsoft.com/office/2019/extlst" xmlns:am3d="http://schemas.microsoft.com/office/drawing/2017/model3d" xmlns:aink="http://schemas.microsoft.com/office/drawing/2016/ink" xmlns:cx8="http://schemas.microsoft.com/office/drawing/2016/5/14/chartex" xmlns:cx7="http://schemas.microsoft.com/office/drawing/2016/5/13/chartex" xmlns:cx6="http://schemas.microsoft.com/office/drawing/2016/5/12/chartex" xmlns:cx5="http://schemas.microsoft.com/office/drawing/2016/5/11/chartex" xmlns:cx4="http://schemas.microsoft.com/office/drawing/2016/5/10/chartex" xmlns:cx3="http://schemas.microsoft.com/office/drawing/2016/5/9/chartex" xmlns:cx2="http://schemas.microsoft.com/office/drawing/2015/10/21/chartex" xmlns:cx1="http://schemas.microsoft.com/office/drawing/2015/9/8/chartex">
             <w:pict>
               <v:rect w14:anchorId="2FF08AF8" id="Rectángulo 2" o:spid="_x0000_s1026" alt="rectángulo de color" style="position:absolute;margin-left:-58.8pt;margin-top:1.5pt;width:611.1pt;height:840pt;z-index:-251659265;visibility:visible;mso-wrap-style:square;mso-height-percent:0;mso-wrap-distance-left:9pt;mso-wrap-distance-top:0;mso-wrap-distance-right:9pt;mso-wrap-distance-bottom:0;mso-position-horizontal:absolute;mso-position-horizontal-relative:text;mso-position-vertical:absolute;mso-position-vertical-relative:page;mso-height-percent:0;mso-height-relative:margin;v-text-anchor:middle" o:gfxdata="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" fillcolor="#34aba2 [3206]" stroked="f" strokeweight="2pt">
                 <w10:wrap anchory="page"/>
@@ -5826,9 +5826,9 @@
       </w:r>
     </w:p>
     <w:p/>
-    <w:bookmarkStart w:id="6" w:name="_Toc170148316" w:displacedByCustomXml="next"/>
+    <w:bookmarkStart w:id="6" w:name="_Toc170148631" w:displacedByCustomXml="next"/>
     <w:bookmarkStart w:id="7" w:name="_Toc49341785" w:displacedByCustomXml="next"/>
-    <w:bookmarkStart w:id="8" w:name="_Toc170148631" w:displacedByCustomXml="next"/>
+    <w:bookmarkStart w:id="8" w:name="_Toc170148316" w:displacedByCustomXml="next"/>
     <w:sdt>
       <w:sdtPr>
         <w:rPr>
@@ -7435,7 +7435,7 @@
                 <v:path o:extrusionok="f" gradientshapeok="t" o:connecttype="rect"/>
                 <o:lock v:ext="edit" aspectratio="t"/>
               </v:shapetype>
-              <v:shape id="_x0000_i1025" type="#_x0000_t75" style="width:465.4pt;height:205.05pt">
+              <v:shape id="_x0000_i1025" type="#_x0000_t75" style="width:465pt;height:204.75pt">
                 <v:imagedata r:id="rId13" o:title="SecuencaciónFasesProyecto"/>
               </v:shape>
             </w:pict>
@@ -7462,7 +7462,7 @@
           </w:pPr>
           <w:r>
             <w:pict w14:anchorId="5636CC0F">
-              <v:shape id="_x0000_i1026" type="#_x0000_t75" style="width:383.6pt;height:241.9pt">
+              <v:shape id="_x0000_i1026" type="#_x0000_t75" style="width:384pt;height:241.5pt">
                 <v:imagedata r:id="rId14" o:title="PlanificaciónRecursosProyectos"/>
               </v:shape>
             </w:pict>
@@ -11986,7 +11986,7 @@
       </w:pPr>
       <w:r>
         <w:pict w14:anchorId="119133E6">
-          <v:shape id="_x0000_i1027" type="#_x0000_t75" style="width:252.85pt;height:468.85pt">
+          <v:shape id="_x0000_i1027" type="#_x0000_t75" style="width:252.75pt;height:468.75pt">
             <v:imagedata r:id="rId22" o:title="DA_Login"/>
           </v:shape>
         </w:pict>
@@ -12081,7 +12081,7 @@
     <w:p>
       <w:r>
         <w:pict w14:anchorId="3BC76BB7">
-          <v:shape id="_x0000_i1028" type="#_x0000_t75" style="width:2in;height:523.6pt">
+          <v:shape id="_x0000_i1028" type="#_x0000_t75" style="width:2in;height:523.5pt">
             <v:imagedata r:id="rId24" o:title="DA_VaciarBBDD"/>
           </v:shape>
         </w:pict>
@@ -12094,7 +12094,7 @@
       </w:r>
       <w:r>
         <w:pict w14:anchorId="6C7C2997">
-          <v:shape id="_x0000_i1029" type="#_x0000_t75" style="width:145.15pt;height:430.25pt">
+          <v:shape id="_x0000_i1029" type="#_x0000_t75" style="width:144.75pt;height:430.5pt">
             <v:imagedata r:id="rId25" o:title="DA_GestiónErrores"/>
           </v:shape>
         </w:pict>
@@ -34254,15 +34254,7 @@
                 <w:sz w:val="16"/>
                 <w:szCs w:val="16"/>
               </w:rPr>
-              <w:t xml:space="preserve">Exportar todos los datos en </w:t>
-            </w:r>
-            <w:r>
-              <w:rPr>
-                <w:rFonts w:cstheme="minorHAnsi"/>
-                <w:sz w:val="16"/>
-                <w:szCs w:val="16"/>
-              </w:rPr>
-              <w:t>CSV</w:t>
+              <w:t>Exportar todos los datos en CSV</w:t>
             </w:r>
           </w:p>
         </w:tc>
@@ -34284,15 +34276,7 @@
                 <w:sz w:val="16"/>
                 <w:szCs w:val="16"/>
               </w:rPr>
-              <w:t xml:space="preserve">Formato: </w:t>
-            </w:r>
-            <w:r>
-              <w:rPr>
-                <w:rFonts w:cstheme="minorHAnsi"/>
-                <w:sz w:val="16"/>
-                <w:szCs w:val="16"/>
-              </w:rPr>
-              <w:t>CSV</w:t>
+              <w:t>Formato: CSV</w:t>
             </w:r>
           </w:p>
         </w:tc>
@@ -34314,23 +34298,7 @@
                 <w:sz w:val="16"/>
                 <w:szCs w:val="16"/>
               </w:rPr>
-              <w:t xml:space="preserve">Fichero </w:t>
-            </w:r>
-            <w:r>
-              <w:rPr>
-                <w:rFonts w:cstheme="minorHAnsi"/>
-                <w:sz w:val="16"/>
-                <w:szCs w:val="16"/>
-              </w:rPr>
-              <w:t>CSV</w:t>
-            </w:r>
-            <w:r>
-              <w:rPr>
-                <w:rFonts w:cstheme="minorHAnsi"/>
-                <w:sz w:val="16"/>
-                <w:szCs w:val="16"/>
-              </w:rPr>
-              <w:t xml:space="preserve"> generado correctamente</w:t>
+              <w:t>Fichero CSV generado correctamente</w:t>
             </w:r>
           </w:p>
         </w:tc>
@@ -34393,15 +34361,7 @@
                 <w:sz w:val="16"/>
                 <w:szCs w:val="16"/>
               </w:rPr>
-              <w:t xml:space="preserve">Exportar todos los datos en </w:t>
-            </w:r>
-            <w:r>
-              <w:rPr>
-                <w:rFonts w:cstheme="minorHAnsi"/>
-                <w:sz w:val="16"/>
-                <w:szCs w:val="16"/>
-              </w:rPr>
-              <w:t>SQL</w:t>
+              <w:t>Exportar todos los datos en SQL</w:t>
             </w:r>
           </w:p>
         </w:tc>
@@ -34423,15 +34383,7 @@
                 <w:sz w:val="16"/>
                 <w:szCs w:val="16"/>
               </w:rPr>
-              <w:t xml:space="preserve">Formato: </w:t>
-            </w:r>
-            <w:r>
-              <w:rPr>
-                <w:rFonts w:cstheme="minorHAnsi"/>
-                <w:sz w:val="16"/>
-                <w:szCs w:val="16"/>
-              </w:rPr>
-              <w:t>SQL</w:t>
+              <w:t>Formato: SQL</w:t>
             </w:r>
           </w:p>
         </w:tc>
@@ -34453,23 +34405,7 @@
                 <w:sz w:val="16"/>
                 <w:szCs w:val="16"/>
               </w:rPr>
-              <w:t xml:space="preserve">Fichero </w:t>
-            </w:r>
-            <w:r>
-              <w:rPr>
-                <w:rFonts w:cstheme="minorHAnsi"/>
-                <w:sz w:val="16"/>
-                <w:szCs w:val="16"/>
-              </w:rPr>
-              <w:t>SQL</w:t>
-            </w:r>
-            <w:r>
-              <w:rPr>
-                <w:rFonts w:cstheme="minorHAnsi"/>
-                <w:sz w:val="16"/>
-                <w:szCs w:val="16"/>
-              </w:rPr>
-              <w:t xml:space="preserve"> generado correctamente</w:t>
+              <w:t>Fichero SQL generado correctamente</w:t>
             </w:r>
           </w:p>
         </w:tc>
@@ -34639,15 +34575,7 @@
                 <w:sz w:val="16"/>
                 <w:szCs w:val="16"/>
               </w:rPr>
-              <w:t xml:space="preserve">Exportar datos seleccionados en </w:t>
-            </w:r>
-            <w:r>
-              <w:rPr>
-                <w:rFonts w:cstheme="minorHAnsi"/>
-                <w:sz w:val="16"/>
-                <w:szCs w:val="16"/>
-              </w:rPr>
-              <w:t>CSV</w:t>
+              <w:t>Exportar datos seleccionados en CSV</w:t>
             </w:r>
           </w:p>
         </w:tc>
@@ -34669,15 +34597,7 @@
                 <w:sz w:val="16"/>
                 <w:szCs w:val="16"/>
               </w:rPr>
-              <w:t xml:space="preserve">Tablas seleccionadas, Formato: </w:t>
-            </w:r>
-            <w:r>
-              <w:rPr>
-                <w:rFonts w:cstheme="minorHAnsi"/>
-                <w:sz w:val="16"/>
-                <w:szCs w:val="16"/>
-              </w:rPr>
-              <w:t>CSV</w:t>
+              <w:t>Tablas seleccionadas, Formato: CSV</w:t>
             </w:r>
           </w:p>
         </w:tc>
@@ -34699,39 +34619,7 @@
                 <w:sz w:val="16"/>
                 <w:szCs w:val="16"/>
               </w:rPr>
-              <w:t xml:space="preserve">Fichero </w:t>
-            </w:r>
-            <w:r>
-              <w:rPr>
-                <w:rFonts w:cstheme="minorHAnsi"/>
-                <w:sz w:val="16"/>
-                <w:szCs w:val="16"/>
-              </w:rPr>
-              <w:t>C</w:t>
-            </w:r>
-            <w:r>
-              <w:rPr>
-                <w:rFonts w:cstheme="minorHAnsi"/>
-                <w:sz w:val="16"/>
-                <w:szCs w:val="16"/>
-              </w:rPr>
-              <w:t>S</w:t>
-            </w:r>
-            <w:r>
-              <w:rPr>
-                <w:rFonts w:cstheme="minorHAnsi"/>
-                <w:sz w:val="16"/>
-                <w:szCs w:val="16"/>
-              </w:rPr>
-              <w:t>V</w:t>
-            </w:r>
-            <w:r>
-              <w:rPr>
-                <w:rFonts w:cstheme="minorHAnsi"/>
-                <w:sz w:val="16"/>
-                <w:szCs w:val="16"/>
-              </w:rPr>
-              <w:t xml:space="preserve"> generado correctamente</w:t>
+              <w:t>Fichero CSV generado correctamente</w:t>
             </w:r>
           </w:p>
         </w:tc>
@@ -34794,15 +34682,7 @@
                 <w:sz w:val="16"/>
                 <w:szCs w:val="16"/>
               </w:rPr>
-              <w:t>Exportar datos seleccionados en S</w:t>
-            </w:r>
-            <w:r>
-              <w:rPr>
-                <w:rFonts w:cstheme="minorHAnsi"/>
-                <w:sz w:val="16"/>
-                <w:szCs w:val="16"/>
-              </w:rPr>
-              <w:t>QL</w:t>
+              <w:t>Exportar datos seleccionados en SQL</w:t>
             </w:r>
           </w:p>
         </w:tc>
@@ -34824,15 +34704,7 @@
                 <w:sz w:val="16"/>
                 <w:szCs w:val="16"/>
               </w:rPr>
-              <w:t xml:space="preserve">Tablas seleccionadas, Formato: </w:t>
-            </w:r>
-            <w:r>
-              <w:rPr>
-                <w:rFonts w:cstheme="minorHAnsi"/>
-                <w:sz w:val="16"/>
-                <w:szCs w:val="16"/>
-              </w:rPr>
-              <w:t>SQL-92</w:t>
+              <w:t>Tablas seleccionadas, Formato: SQL-92</w:t>
             </w:r>
           </w:p>
         </w:tc>
@@ -34854,23 +34726,7 @@
                 <w:sz w:val="16"/>
                 <w:szCs w:val="16"/>
               </w:rPr>
-              <w:t>Fichero S</w:t>
-            </w:r>
-            <w:r>
-              <w:rPr>
-                <w:rFonts w:cstheme="minorHAnsi"/>
-                <w:sz w:val="16"/>
-                <w:szCs w:val="16"/>
-              </w:rPr>
-              <w:t>QL</w:t>
-            </w:r>
-            <w:r>
-              <w:rPr>
-                <w:rFonts w:cstheme="minorHAnsi"/>
-                <w:sz w:val="16"/>
-                <w:szCs w:val="16"/>
-              </w:rPr>
-              <w:t xml:space="preserve"> generado correctamente</w:t>
+              <w:t>Fichero SQL generado correctamente</w:t>
             </w:r>
           </w:p>
         </w:tc>
@@ -35361,15 +35217,7 @@
                 <w:sz w:val="16"/>
                 <w:szCs w:val="16"/>
               </w:rPr>
-              <w:t xml:space="preserve">Verificar integridad fichero </w:t>
-            </w:r>
-            <w:r>
-              <w:rPr>
-                <w:rFonts w:cstheme="minorHAnsi"/>
-                <w:sz w:val="16"/>
-                <w:szCs w:val="16"/>
-              </w:rPr>
-              <w:t>CSV</w:t>
+              <w:t>Verificar integridad fichero CSV</w:t>
             </w:r>
           </w:p>
         </w:tc>
@@ -35391,39 +35239,7 @@
                 <w:sz w:val="16"/>
                 <w:szCs w:val="16"/>
               </w:rPr>
-              <w:t xml:space="preserve">Fichero </w:t>
-            </w:r>
-            <w:r>
-              <w:rPr>
-                <w:rFonts w:cstheme="minorHAnsi"/>
-                <w:sz w:val="16"/>
-                <w:szCs w:val="16"/>
-              </w:rPr>
-              <w:t>C</w:t>
-            </w:r>
-            <w:r>
-              <w:rPr>
-                <w:rFonts w:cstheme="minorHAnsi"/>
-                <w:sz w:val="16"/>
-                <w:szCs w:val="16"/>
-              </w:rPr>
-              <w:t>S</w:t>
-            </w:r>
-            <w:r>
-              <w:rPr>
-                <w:rFonts w:cstheme="minorHAnsi"/>
-                <w:sz w:val="16"/>
-                <w:szCs w:val="16"/>
-              </w:rPr>
-              <w:t>V</w:t>
-            </w:r>
-            <w:r>
-              <w:rPr>
-                <w:rFonts w:cstheme="minorHAnsi"/>
-                <w:sz w:val="16"/>
-                <w:szCs w:val="16"/>
-              </w:rPr>
-              <w:t xml:space="preserve"> generado</w:t>
+              <w:t>Fichero CSV generado</w:t>
             </w:r>
           </w:p>
         </w:tc>
@@ -35445,39 +35261,7 @@
                 <w:sz w:val="16"/>
                 <w:szCs w:val="16"/>
               </w:rPr>
-              <w:t xml:space="preserve">Fichero </w:t>
-            </w:r>
-            <w:r>
-              <w:rPr>
-                <w:rFonts w:cstheme="minorHAnsi"/>
-                <w:sz w:val="16"/>
-                <w:szCs w:val="16"/>
-              </w:rPr>
-              <w:t>C</w:t>
-            </w:r>
-            <w:r>
-              <w:rPr>
-                <w:rFonts w:cstheme="minorHAnsi"/>
-                <w:sz w:val="16"/>
-                <w:szCs w:val="16"/>
-              </w:rPr>
-              <w:t>S</w:t>
-            </w:r>
-            <w:r>
-              <w:rPr>
-                <w:rFonts w:cstheme="minorHAnsi"/>
-                <w:sz w:val="16"/>
-                <w:szCs w:val="16"/>
-              </w:rPr>
-              <w:t>V</w:t>
-            </w:r>
-            <w:r>
-              <w:rPr>
-                <w:rFonts w:cstheme="minorHAnsi"/>
-                <w:sz w:val="16"/>
-                <w:szCs w:val="16"/>
-              </w:rPr>
-              <w:t xml:space="preserve"> válido y completo</w:t>
+              <w:t>Fichero CSV válido y completo</w:t>
             </w:r>
           </w:p>
         </w:tc>
@@ -35540,15 +35324,7 @@
                 <w:sz w:val="16"/>
                 <w:szCs w:val="16"/>
               </w:rPr>
-              <w:t>Verificar integridad fichero S</w:t>
-            </w:r>
-            <w:r>
-              <w:rPr>
-                <w:rFonts w:cstheme="minorHAnsi"/>
-                <w:sz w:val="16"/>
-                <w:szCs w:val="16"/>
-              </w:rPr>
-              <w:t>QL</w:t>
+              <w:t>Verificar integridad fichero SQL</w:t>
             </w:r>
           </w:p>
         </w:tc>
@@ -35570,23 +35346,7 @@
                 <w:sz w:val="16"/>
                 <w:szCs w:val="16"/>
               </w:rPr>
-              <w:t>Fichero S</w:t>
-            </w:r>
-            <w:r>
-              <w:rPr>
-                <w:rFonts w:cstheme="minorHAnsi"/>
-                <w:sz w:val="16"/>
-                <w:szCs w:val="16"/>
-              </w:rPr>
-              <w:t>QL</w:t>
-            </w:r>
-            <w:r>
-              <w:rPr>
-                <w:rFonts w:cstheme="minorHAnsi"/>
-                <w:sz w:val="16"/>
-                <w:szCs w:val="16"/>
-              </w:rPr>
-              <w:t xml:space="preserve"> generado</w:t>
+              <w:t>Fichero SQL generado</w:t>
             </w:r>
           </w:p>
         </w:tc>
@@ -35608,23 +35368,7 @@
                 <w:sz w:val="16"/>
                 <w:szCs w:val="16"/>
               </w:rPr>
-              <w:t>Fichero S</w:t>
-            </w:r>
-            <w:r>
-              <w:rPr>
-                <w:rFonts w:cstheme="minorHAnsi"/>
-                <w:sz w:val="16"/>
-                <w:szCs w:val="16"/>
-              </w:rPr>
-              <w:t>QL</w:t>
-            </w:r>
-            <w:r>
-              <w:rPr>
-                <w:rFonts w:cstheme="minorHAnsi"/>
-                <w:sz w:val="16"/>
-                <w:szCs w:val="16"/>
-              </w:rPr>
-              <w:t xml:space="preserve"> válido y completo</w:t>
+              <w:t>Fichero SQL válido y completo</w:t>
             </w:r>
           </w:p>
         </w:tc>
@@ -35674,88 +35418,473 @@
     <w:p/>
     <w:p/>
     <w:p/>
+    <w:p/>
     <w:p>
-      <w:bookmarkStart w:id="145" w:name="_GoBack"/>
+      <w:pPr>
+        <w:pStyle w:val="Ttulo2"/>
+      </w:pPr>
+      <w:bookmarkStart w:id="145" w:name="_Toc170148370"/>
+      <w:bookmarkStart w:id="146" w:name="_Toc170148684"/>
+      <w:r>
+        <w:lastRenderedPageBreak/>
+        <w:t>Evaluación y solución de incidencias</w:t>
+      </w:r>
+      <w:bookmarkEnd w:id="144"/>
       <w:bookmarkEnd w:id="145"/>
+      <w:bookmarkEnd w:id="146"/>
     </w:p>
     <w:p>
       <w:pPr>
-        <w:pStyle w:val="Ttulo2"/>
-      </w:pPr>
-      <w:bookmarkStart w:id="146" w:name="_Toc170148370"/>
-      <w:bookmarkStart w:id="147" w:name="_Toc170148684"/>
-      <w:r>
-        <w:lastRenderedPageBreak/>
-        <w:t>Evaluación y solución de incidencias</w:t>
-      </w:r>
-      <w:bookmarkEnd w:id="144"/>
-      <w:bookmarkEnd w:id="146"/>
-      <w:bookmarkEnd w:id="147"/>
+        <w:ind w:left="720"/>
+        <w:jc w:val="left"/>
+      </w:pPr>
+      <w:r>
+        <w:t>Cuando se detecte algún fallo en la batería de pruebas se procederá de la siguiente manera:</w:t>
+      </w:r>
     </w:p>
     <w:p>
       <w:pPr>
-        <w:rPr>
-          <w:color w:val="FF0000"/>
-        </w:rPr>
-      </w:pPr>
-      <w:r>
-        <w:rPr>
-          <w:color w:val="FF0000"/>
-        </w:rPr>
-        <w:t>Rellenar</w:t>
+        <w:ind w:left="720"/>
+        <w:jc w:val="left"/>
+      </w:pPr>
+    </w:p>
+    <w:p>
+      <w:pPr>
+        <w:pStyle w:val="Prrafodelista"/>
+        <w:numPr>
+          <w:ilvl w:val="0"/>
+          <w:numId w:val="15"/>
+        </w:numPr>
+        <w:jc w:val="left"/>
+      </w:pPr>
+      <w:r>
+        <w:t>Identificación: si identifica el error encontrado y se escribe en la columna “obtenido” de la tabla batería de pruebas y marcando el resultado como “Fallo”.</w:t>
+      </w:r>
+    </w:p>
+    <w:p>
+      <w:pPr>
+        <w:pStyle w:val="Prrafodelista"/>
+        <w:numPr>
+          <w:ilvl w:val="0"/>
+          <w:numId w:val="15"/>
+        </w:numPr>
+        <w:jc w:val="left"/>
+      </w:pPr>
+      <w:r>
+        <w:t>Clasificación: los errores se clasificarán de la siguiente manera:</w:t>
+      </w:r>
+    </w:p>
+    <w:p>
+      <w:pPr>
+        <w:pStyle w:val="Prrafodelista"/>
+        <w:numPr>
+          <w:ilvl w:val="1"/>
+          <w:numId w:val="15"/>
+        </w:numPr>
+        <w:jc w:val="left"/>
+      </w:pPr>
+      <w:r>
+        <w:t>Crítico</w:t>
+      </w:r>
+      <w:r>
+        <w:t xml:space="preserve">: la aplicación no funciona, tiene que resolverse de inmediato.  </w:t>
+      </w:r>
+    </w:p>
+    <w:p>
+      <w:pPr>
+        <w:pStyle w:val="Prrafodelista"/>
+        <w:numPr>
+          <w:ilvl w:val="1"/>
+          <w:numId w:val="15"/>
+        </w:numPr>
+        <w:jc w:val="left"/>
+      </w:pPr>
+      <w:r>
+        <w:t xml:space="preserve">Grave: una funcionalidad no funciona. </w:t>
+      </w:r>
+    </w:p>
+    <w:p>
+      <w:pPr>
+        <w:pStyle w:val="Prrafodelista"/>
+        <w:numPr>
+          <w:ilvl w:val="1"/>
+          <w:numId w:val="15"/>
+        </w:numPr>
+        <w:jc w:val="left"/>
+      </w:pPr>
+      <w:r>
+        <w:t xml:space="preserve">Leve: pequeño error que no afecta al funcionamiento general. </w:t>
+      </w:r>
+    </w:p>
+    <w:p>
+      <w:pPr>
+        <w:pStyle w:val="Prrafodelista"/>
+        <w:numPr>
+          <w:ilvl w:val="0"/>
+          <w:numId w:val="15"/>
+        </w:numPr>
+        <w:jc w:val="left"/>
+      </w:pPr>
+      <w:r>
+        <w:t xml:space="preserve">Solución: se corrige los errores </w:t>
+      </w:r>
+      <w:r>
+        <w:t xml:space="preserve">y se vuelve ejecutar la prueba hasta obtener el resultado que se espera. </w:t>
+      </w:r>
+    </w:p>
+    <w:p>
+      <w:pPr>
+        <w:pStyle w:val="Prrafodelista"/>
+        <w:numPr>
+          <w:ilvl w:val="0"/>
+          <w:numId w:val="15"/>
+        </w:numPr>
+        <w:jc w:val="left"/>
+      </w:pPr>
+      <w:r>
+        <w:t xml:space="preserve">Verificación: </w:t>
+      </w:r>
+      <w:r>
+        <w:t xml:space="preserve">una vez que está corregido se marcará como “OK” en la tabla de batería de pruebas.  </w:t>
+      </w:r>
+    </w:p>
+    <w:p/>
+    <w:p/>
+    <w:p/>
+    <w:p/>
+    <w:p/>
+    <w:p/>
+    <w:p/>
+    <w:p/>
+    <w:p/>
+    <w:p/>
+    <w:p/>
+    <w:p/>
+    <w:p/>
+    <w:p/>
+    <w:p/>
+    <w:p/>
+    <w:p/>
+    <w:p/>
+    <w:p/>
+    <w:p/>
+    <w:p/>
+    <w:p/>
+    <w:p/>
+    <w:p/>
+    <w:p/>
+    <w:p/>
+    <w:p/>
+    <w:p>
+      <w:pPr>
+        <w:pStyle w:val="Ttulo2"/>
+      </w:pPr>
+      <w:bookmarkStart w:id="147" w:name="_Toc49341861"/>
+      <w:bookmarkStart w:id="148" w:name="_Toc170148371"/>
+      <w:bookmarkStart w:id="149" w:name="_Toc170148685"/>
+      <w:r>
+        <w:lastRenderedPageBreak/>
+        <w:t>Evaluación y seguimiento del</w:t>
+      </w:r>
+      <w:r>
+        <w:t xml:space="preserve"> proyecto</w:t>
+      </w:r>
+      <w:bookmarkEnd w:id="147"/>
+      <w:bookmarkEnd w:id="148"/>
+      <w:bookmarkEnd w:id="149"/>
+    </w:p>
+    <w:p>
+      <w:pPr>
+        <w:ind w:left="720"/>
+      </w:pPr>
+      <w:r>
+        <w:t>El seguimiento se ha realizado siguiendo las fases definidas en la planificación inicial:</w:t>
+      </w:r>
+    </w:p>
+    <w:p>
+      <w:pPr>
+        <w:ind w:left="720"/>
+      </w:pPr>
+    </w:p>
+    <w:p>
+      <w:pPr>
+        <w:pStyle w:val="Prrafodelista"/>
+        <w:numPr>
+          <w:ilvl w:val="0"/>
+          <w:numId w:val="16"/>
+        </w:numPr>
+      </w:pPr>
+      <w:r>
+        <w:t xml:space="preserve">Análisis inicial: </w:t>
+      </w:r>
+    </w:p>
+    <w:p>
+      <w:pPr>
+        <w:pStyle w:val="Prrafodelista"/>
+        <w:numPr>
+          <w:ilvl w:val="0"/>
+          <w:numId w:val="17"/>
+        </w:numPr>
+      </w:pPr>
+      <w:r>
+        <w:t xml:space="preserve">Duración: 5 días. </w:t>
+      </w:r>
+    </w:p>
+    <w:p>
+      <w:pPr>
+        <w:pStyle w:val="Prrafodelista"/>
+        <w:numPr>
+          <w:ilvl w:val="0"/>
+          <w:numId w:val="17"/>
+        </w:numPr>
+      </w:pPr>
+      <w:r>
+        <w:t xml:space="preserve">El docente responsable proporcionó el documento de base con las necesidades del centro y los requisitos funcionales. </w:t>
+      </w:r>
+    </w:p>
+    <w:p>
+      <w:pPr>
+        <w:pStyle w:val="Prrafodelista"/>
+        <w:numPr>
+          <w:ilvl w:val="0"/>
+          <w:numId w:val="17"/>
+        </w:numPr>
+      </w:pPr>
+      <w:r>
+        <w:t>Resultado: completado.</w:t>
+      </w:r>
+    </w:p>
+    <w:p>
+      <w:pPr>
+        <w:pStyle w:val="Prrafodelista"/>
+        <w:ind w:left="2520"/>
+      </w:pPr>
+    </w:p>
+    <w:p>
+      <w:pPr>
+        <w:pStyle w:val="Prrafodelista"/>
+        <w:numPr>
+          <w:ilvl w:val="0"/>
+          <w:numId w:val="16"/>
+        </w:numPr>
+      </w:pPr>
+      <w:r>
+        <w:t xml:space="preserve">Análisis: </w:t>
+      </w:r>
+    </w:p>
+    <w:p>
+      <w:pPr>
+        <w:pStyle w:val="Prrafodelista"/>
+        <w:numPr>
+          <w:ilvl w:val="0"/>
+          <w:numId w:val="18"/>
+        </w:numPr>
+      </w:pPr>
+      <w:r>
+        <w:t xml:space="preserve">Duración: dos semanas. </w:t>
+      </w:r>
+    </w:p>
+    <w:p>
+      <w:pPr>
+        <w:pStyle w:val="Prrafodelista"/>
+        <w:numPr>
+          <w:ilvl w:val="0"/>
+          <w:numId w:val="18"/>
+        </w:numPr>
+      </w:pPr>
+      <w:r>
+        <w:t>Se creó la estructura inicial de proyecto y se estudió el documento proporcionado por el docente.</w:t>
+      </w:r>
+    </w:p>
+    <w:p>
+      <w:pPr>
+        <w:pStyle w:val="Prrafodelista"/>
+        <w:numPr>
+          <w:ilvl w:val="0"/>
+          <w:numId w:val="18"/>
+        </w:numPr>
+      </w:pPr>
+      <w:r>
+        <w:t>Resultado: completado.</w:t>
+      </w:r>
+    </w:p>
+    <w:p>
+      <w:pPr>
+        <w:pStyle w:val="Prrafodelista"/>
+        <w:ind w:left="2520"/>
+      </w:pPr>
+    </w:p>
+    <w:p>
+      <w:pPr>
+        <w:pStyle w:val="Prrafodelista"/>
+        <w:numPr>
+          <w:ilvl w:val="0"/>
+          <w:numId w:val="16"/>
+        </w:numPr>
+      </w:pPr>
+      <w:r>
+        <w:t>Diseño:</w:t>
+      </w:r>
+    </w:p>
+    <w:p>
+      <w:pPr>
+        <w:pStyle w:val="Prrafodelista"/>
+        <w:numPr>
+          <w:ilvl w:val="0"/>
+          <w:numId w:val="19"/>
+        </w:numPr>
+      </w:pPr>
+      <w:r>
+        <w:t>Duración: una semana</w:t>
+      </w:r>
+    </w:p>
+    <w:p>
+      <w:pPr>
+        <w:pStyle w:val="Prrafodelista"/>
+        <w:numPr>
+          <w:ilvl w:val="0"/>
+          <w:numId w:val="19"/>
+        </w:numPr>
+      </w:pPr>
+      <w:r>
+        <w:t xml:space="preserve">Se implementó la base de datos y se completó la documentación. </w:t>
+      </w:r>
+    </w:p>
+    <w:p>
+      <w:pPr>
+        <w:pStyle w:val="Prrafodelista"/>
+        <w:numPr>
+          <w:ilvl w:val="0"/>
+          <w:numId w:val="19"/>
+        </w:numPr>
+      </w:pPr>
+      <w:r>
+        <w:t xml:space="preserve">Resultado: completado. </w:t>
+      </w:r>
+    </w:p>
+    <w:p>
+      <w:pPr>
+        <w:pStyle w:val="Prrafodelista"/>
+        <w:ind w:left="2520"/>
+      </w:pPr>
+    </w:p>
+    <w:p>
+      <w:pPr>
+        <w:pStyle w:val="Prrafodelista"/>
+        <w:numPr>
+          <w:ilvl w:val="0"/>
+          <w:numId w:val="16"/>
+        </w:numPr>
+      </w:pPr>
+      <w:r>
+        <w:t>Desarrollo:</w:t>
+      </w:r>
+    </w:p>
+    <w:p>
+      <w:pPr>
+        <w:pStyle w:val="Prrafodelista"/>
+        <w:numPr>
+          <w:ilvl w:val="0"/>
+          <w:numId w:val="20"/>
+        </w:numPr>
+      </w:pPr>
+      <w:r>
+        <w:t>Duración: cuatro semanas</w:t>
+      </w:r>
+    </w:p>
+    <w:p>
+      <w:pPr>
+        <w:pStyle w:val="Prrafodelista"/>
+        <w:numPr>
+          <w:ilvl w:val="0"/>
+          <w:numId w:val="20"/>
+        </w:numPr>
+      </w:pPr>
+      <w:r>
+        <w:t xml:space="preserve">Implementación de la aplicación en Python con POO y conexión </w:t>
+      </w:r>
+      <w:r>
+        <w:t xml:space="preserve">con </w:t>
+      </w:r>
+      <w:proofErr w:type="spellStart"/>
+      <w:r>
+        <w:t>MySQL</w:t>
+      </w:r>
+      <w:proofErr w:type="spellEnd"/>
+    </w:p>
+    <w:p>
+      <w:pPr>
+        <w:pStyle w:val="Prrafodelista"/>
+        <w:numPr>
+          <w:ilvl w:val="0"/>
+          <w:numId w:val="20"/>
+        </w:numPr>
+      </w:pPr>
+      <w:r>
+        <w:t>Resultado: completado</w:t>
+      </w:r>
+    </w:p>
+    <w:p>
+      <w:pPr>
+        <w:pStyle w:val="Prrafodelista"/>
+        <w:ind w:left="2520"/>
+      </w:pPr>
+    </w:p>
+    <w:p>
+      <w:pPr>
+        <w:pStyle w:val="Prrafodelista"/>
+        <w:numPr>
+          <w:ilvl w:val="0"/>
+          <w:numId w:val="16"/>
+        </w:numPr>
+      </w:pPr>
+      <w:r>
+        <w:t>Implantación.</w:t>
+      </w:r>
+    </w:p>
+    <w:p>
+      <w:pPr>
+        <w:pStyle w:val="Prrafodelista"/>
+        <w:numPr>
+          <w:ilvl w:val="0"/>
+          <w:numId w:val="22"/>
+        </w:numPr>
+      </w:pPr>
+      <w:r>
+        <w:t xml:space="preserve">Duración: tres semanas </w:t>
+      </w:r>
+    </w:p>
+    <w:p>
+      <w:pPr>
+        <w:pStyle w:val="Prrafodelista"/>
+        <w:numPr>
+          <w:ilvl w:val="0"/>
+          <w:numId w:val="22"/>
+        </w:numPr>
+      </w:pPr>
+      <w:r>
+        <w:t xml:space="preserve">Instalación y puesta en marcha en el instituto. </w:t>
+      </w:r>
+    </w:p>
+    <w:p>
+      <w:pPr>
+        <w:pStyle w:val="Prrafodelista"/>
+        <w:numPr>
+          <w:ilvl w:val="0"/>
+          <w:numId w:val="22"/>
+        </w:numPr>
+      </w:pPr>
+      <w:r>
+        <w:t xml:space="preserve">Resultado: pendiente. </w:t>
       </w:r>
     </w:p>
     <w:p/>
     <w:p>
       <w:pPr>
-        <w:pStyle w:val="Ttulo2"/>
-      </w:pPr>
-      <w:bookmarkStart w:id="148" w:name="_Toc49341861"/>
-      <w:bookmarkStart w:id="149" w:name="_Toc170148371"/>
-      <w:bookmarkStart w:id="150" w:name="_Toc170148685"/>
-      <w:r>
-        <w:t>Evaluación y seguimiento del</w:t>
-      </w:r>
-      <w:r>
-        <w:t xml:space="preserve"> proyecto</w:t>
-      </w:r>
-      <w:bookmarkEnd w:id="148"/>
-      <w:bookmarkEnd w:id="149"/>
-      <w:bookmarkEnd w:id="150"/>
-    </w:p>
-    <w:p>
-      <w:pPr>
-        <w:rPr>
-          <w:color w:val="FF0000"/>
-        </w:rPr>
-      </w:pPr>
-      <w:r>
-        <w:rPr>
-          <w:color w:val="FF0000"/>
-        </w:rPr>
-        <w:t>Rellenar</w:t>
-      </w:r>
+        <w:jc w:val="center"/>
+      </w:pPr>
     </w:p>
     <w:p/>
-    <w:p/>
-    <w:p>
-      <w:pPr>
-        <w:jc w:val="center"/>
-      </w:pPr>
-    </w:p>
-    <w:p/>
-    <w:p>
-      <w:pPr>
-        <w:autoSpaceDE w:val="0"/>
-        <w:autoSpaceDN w:val="0"/>
-        <w:adjustRightInd w:val="0"/>
-        <w:spacing w:line="240" w:lineRule="auto"/>
-        <w:jc w:val="left"/>
-        <w:rPr>
-          <w:rFonts w:ascii="Calibri" w:eastAsiaTheme="minorHAnsi" w:hAnsi="Calibri" w:cs="Calibri"/>
-        </w:rPr>
-      </w:pPr>
-    </w:p>
     <w:p>
       <w:pPr>
         <w:spacing w:after="200"/>
@@ -35768,50 +35897,30 @@
           <w:szCs w:val="144"/>
         </w:rPr>
       </w:pPr>
+      <w:bookmarkStart w:id="150" w:name="_Toc49341863"/>
     </w:p>
     <w:p>
       <w:pPr>
-        <w:spacing w:after="200"/>
-        <w:jc w:val="left"/>
-        <w:rPr>
-          <w:rFonts w:asciiTheme="majorHAnsi" w:eastAsiaTheme="majorEastAsia" w:hAnsiTheme="majorHAnsi" w:cstheme="majorBidi"/>
-          <w:color w:val="061F57" w:themeColor="text2" w:themeShade="BF"/>
-          <w:kern w:val="28"/>
+        <w:pStyle w:val="Ttulo1"/>
+        <w:jc w:val="center"/>
+        <w:rPr>
           <w:sz w:val="144"/>
           <w:szCs w:val="144"/>
         </w:rPr>
       </w:pPr>
-      <w:bookmarkStart w:id="151" w:name="_Toc49341863"/>
+      <w:bookmarkStart w:id="151" w:name="_Toc170148373"/>
+      <w:bookmarkStart w:id="152" w:name="_Toc170148686"/>
       <w:r>
         <w:rPr>
           <w:sz w:val="144"/>
           <w:szCs w:val="144"/>
         </w:rPr>
-        <w:br w:type="page"/>
-      </w:r>
-    </w:p>
-    <w:p>
-      <w:pPr>
-        <w:pStyle w:val="Ttulo1"/>
-        <w:jc w:val="center"/>
-        <w:rPr>
-          <w:sz w:val="144"/>
-          <w:szCs w:val="144"/>
-        </w:rPr>
-      </w:pPr>
-      <w:bookmarkStart w:id="152" w:name="_Toc170148373"/>
-      <w:bookmarkStart w:id="153" w:name="_Toc170148686"/>
-      <w:r>
-        <w:rPr>
-          <w:sz w:val="144"/>
-          <w:szCs w:val="144"/>
-        </w:rPr>
         <w:lastRenderedPageBreak/>
         <w:t>Implantación del Proyecto</w:t>
       </w:r>
+      <w:bookmarkEnd w:id="150"/>
       <w:bookmarkEnd w:id="151"/>
       <w:bookmarkEnd w:id="152"/>
-      <w:bookmarkEnd w:id="153"/>
     </w:p>
     <w:p>
       <w:pPr>
@@ -35832,16 +35941,16 @@
       <w:pPr>
         <w:pStyle w:val="Ttulo2"/>
       </w:pPr>
-      <w:bookmarkStart w:id="154" w:name="_Toc49341864"/>
-      <w:bookmarkStart w:id="155" w:name="_Toc170148374"/>
-      <w:bookmarkStart w:id="156" w:name="_Toc170148687"/>
+      <w:bookmarkStart w:id="153" w:name="_Toc49341864"/>
+      <w:bookmarkStart w:id="154" w:name="_Toc170148374"/>
+      <w:bookmarkStart w:id="155" w:name="_Toc170148687"/>
       <w:r>
         <w:lastRenderedPageBreak/>
         <w:t>Plan de implantación</w:t>
       </w:r>
+      <w:bookmarkEnd w:id="153"/>
       <w:bookmarkEnd w:id="154"/>
       <w:bookmarkEnd w:id="155"/>
-      <w:bookmarkEnd w:id="156"/>
     </w:p>
     <w:p>
       <w:pPr>
@@ -35993,6 +36102,8 @@
       <w:r>
         <w:t xml:space="preserve"> día</w:t>
       </w:r>
+      <w:bookmarkStart w:id="156" w:name="_GoBack"/>
+      <w:bookmarkEnd w:id="156"/>
       <w:r>
         <w:tab/>
       </w:r>
@@ -44391,7 +44502,7 @@
         <w:noProof/>
         <w:color w:val="024F75" w:themeColor="accent1"/>
       </w:rPr>
-      <w:t>40</w:t>
+      <w:t>49</w:t>
     </w:r>
     <w:r>
       <w:rPr>
@@ -44513,7 +44624,7 @@
             </wp:anchor>
           </w:drawing>
         </mc:Choice>
-        <mc:Fallback xmlns:cx1="http://schemas.microsoft.com/office/drawing/2015/9/8/chartex" xmlns:cx2="http://schemas.microsoft.com/office/drawing/2015/10/21/chartex" xmlns:cx3="http://schemas.microsoft.com/office/drawing/2016/5/9/chartex" xmlns:cx4="http://schemas.microsoft.com/office/drawing/2016/5/10/chartex" xmlns:cx5="http://schemas.microsoft.com/office/drawing/2016/5/11/chartex" xmlns:cx6="http://schemas.microsoft.com/office/drawing/2016/5/12/chartex" xmlns:cx7="http://schemas.microsoft.com/office/drawing/2016/5/13/chartex" xmlns:cx8="http://schemas.microsoft.com/office/drawing/2016/5/14/chartex" xmlns:aink="http://schemas.microsoft.com/office/drawing/2016/ink" xmlns:am3d="http://schemas.microsoft.com/office/drawing/2017/model3d" xmlns:oel="http://schemas.microsoft.com/office/2019/extlst" xmlns:w16cex="http://schemas.microsoft.com/office/word/2018/wordml/cex" xmlns:w16cid="http://schemas.microsoft.com/office/word/2016/wordml/cid" xmlns:w16="http://schemas.microsoft.com/office/word/2018/wordml" xmlns:w16sdtdh="http://schemas.microsoft.com/office/word/2020/wordml/sdtdatahash">
+        <mc:Fallback xmlns:w16sdtdh="http://schemas.microsoft.com/office/word/2020/wordml/sdtdatahash" xmlns:w16="http://schemas.microsoft.com/office/word/2018/wordml" xmlns:w16cid="http://schemas.microsoft.com/office/word/2016/wordml/cid" xmlns:w16cex="http://schemas.microsoft.com/office/word/2018/wordml/cex" xmlns:oel="http://schemas.microsoft.com/office/2019/extlst" xmlns:am3d="http://schemas.microsoft.com/office/drawing/2017/model3d" xmlns:aink="http://schemas.microsoft.com/office/drawing/2016/ink" xmlns:cx8="http://schemas.microsoft.com/office/drawing/2016/5/14/chartex" xmlns:cx7="http://schemas.microsoft.com/office/drawing/2016/5/13/chartex" xmlns:cx6="http://schemas.microsoft.com/office/drawing/2016/5/12/chartex" xmlns:cx5="http://schemas.microsoft.com/office/drawing/2016/5/11/chartex" xmlns:cx4="http://schemas.microsoft.com/office/drawing/2016/5/10/chartex" xmlns:cx3="http://schemas.microsoft.com/office/drawing/2016/5/9/chartex" xmlns:cx2="http://schemas.microsoft.com/office/drawing/2015/10/21/chartex" xmlns:cx1="http://schemas.microsoft.com/office/drawing/2015/9/8/chartex">
           <w:pict>
             <v:line w14:anchorId="497A84A7" id="Conector recto 88" o:spid="_x0000_s1026" style="position:absolute;z-index:251659264;visibility:visible;mso-wrap-style:square;mso-height-percent:0;mso-wrap-distance-left:9pt;mso-wrap-distance-top:0;mso-wrap-distance-right:9pt;mso-wrap-distance-bottom:0;mso-position-horizontal:absolute;mso-position-horizontal-relative:text;mso-position-vertical:absolute;mso-position-vertical-relative:text;mso-height-percent:0;mso-height-relative:margin" from="2.1pt,19.7pt" to="504.75pt,19.7pt" o:gfxdata="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" strokecolor="#34aba2 [3209]" strokeweight="2.25pt"/>
           </w:pict>
@@ -44616,102 +44727,16 @@
     </w:lvl>
   </w:abstractNum>
   <w:abstractNum w:abstractNumId="1" w15:restartNumberingAfterBreak="0">
-    <w:nsid w:val="0FB075BD"/>
+    <w:nsid w:val="092A3C3E"/>
     <w:multiLevelType w:val="hybridMultilevel"/>
-    <w:tmpl w:val="31DE7E7C"/>
-    <w:lvl w:ilvl="0" w:tplc="0C0A000F">
-      <w:start w:val="1"/>
-      <w:numFmt w:val="decimal"/>
-      <w:lvlText w:val="%1."/>
-      <w:lvlJc w:val="left"/>
-      <w:pPr>
-        <w:ind w:left="720" w:hanging="360"/>
-      </w:pPr>
-    </w:lvl>
-    <w:lvl w:ilvl="1" w:tplc="0C0A0019" w:tentative="1">
-      <w:start w:val="1"/>
-      <w:numFmt w:val="lowerLetter"/>
-      <w:lvlText w:val="%2."/>
-      <w:lvlJc w:val="left"/>
-      <w:pPr>
-        <w:ind w:left="1440" w:hanging="360"/>
-      </w:pPr>
-    </w:lvl>
-    <w:lvl w:ilvl="2" w:tplc="0C0A001B" w:tentative="1">
-      <w:start w:val="1"/>
-      <w:numFmt w:val="lowerRoman"/>
-      <w:lvlText w:val="%3."/>
-      <w:lvlJc w:val="right"/>
-      <w:pPr>
-        <w:ind w:left="2160" w:hanging="180"/>
-      </w:pPr>
-    </w:lvl>
-    <w:lvl w:ilvl="3" w:tplc="0C0A000F" w:tentative="1">
-      <w:start w:val="1"/>
-      <w:numFmt w:val="decimal"/>
-      <w:lvlText w:val="%4."/>
-      <w:lvlJc w:val="left"/>
-      <w:pPr>
-        <w:ind w:left="2880" w:hanging="360"/>
-      </w:pPr>
-    </w:lvl>
-    <w:lvl w:ilvl="4" w:tplc="0C0A0019" w:tentative="1">
-      <w:start w:val="1"/>
-      <w:numFmt w:val="lowerLetter"/>
-      <w:lvlText w:val="%5."/>
-      <w:lvlJc w:val="left"/>
-      <w:pPr>
-        <w:ind w:left="3600" w:hanging="360"/>
-      </w:pPr>
-    </w:lvl>
-    <w:lvl w:ilvl="5" w:tplc="0C0A001B" w:tentative="1">
-      <w:start w:val="1"/>
-      <w:numFmt w:val="lowerRoman"/>
-      <w:lvlText w:val="%6."/>
-      <w:lvlJc w:val="right"/>
-      <w:pPr>
-        <w:ind w:left="4320" w:hanging="180"/>
-      </w:pPr>
-    </w:lvl>
-    <w:lvl w:ilvl="6" w:tplc="0C0A000F" w:tentative="1">
-      <w:start w:val="1"/>
-      <w:numFmt w:val="decimal"/>
-      <w:lvlText w:val="%7."/>
-      <w:lvlJc w:val="left"/>
-      <w:pPr>
-        <w:ind w:left="5040" w:hanging="360"/>
-      </w:pPr>
-    </w:lvl>
-    <w:lvl w:ilvl="7" w:tplc="0C0A0019" w:tentative="1">
-      <w:start w:val="1"/>
-      <w:numFmt w:val="lowerLetter"/>
-      <w:lvlText w:val="%8."/>
-      <w:lvlJc w:val="left"/>
-      <w:pPr>
-        <w:ind w:left="5760" w:hanging="360"/>
-      </w:pPr>
-    </w:lvl>
-    <w:lvl w:ilvl="8" w:tplc="0C0A001B" w:tentative="1">
-      <w:start w:val="1"/>
-      <w:numFmt w:val="lowerRoman"/>
-      <w:lvlText w:val="%9."/>
-      <w:lvlJc w:val="right"/>
-      <w:pPr>
-        <w:ind w:left="6480" w:hanging="180"/>
-      </w:pPr>
-    </w:lvl>
-  </w:abstractNum>
-  <w:abstractNum w:abstractNumId="2" w15:restartNumberingAfterBreak="0">
-    <w:nsid w:val="1BC0572C"/>
-    <w:multiLevelType w:val="hybridMultilevel"/>
-    <w:tmpl w:val="8580F39E"/>
+    <w:tmpl w:val="88F6CDBE"/>
     <w:lvl w:ilvl="0" w:tplc="0C0A0001">
       <w:start w:val="1"/>
       <w:numFmt w:val="bullet"/>
       <w:lvlText w:val=""/>
       <w:lvlJc w:val="left"/>
       <w:pPr>
-        <w:ind w:left="1080" w:hanging="360"/>
+        <w:ind w:left="2520" w:hanging="360"/>
       </w:pPr>
       <w:rPr>
         <w:rFonts w:ascii="Symbol" w:hAnsi="Symbol" w:hint="default"/>
@@ -44723,7 +44748,7 @@
       <w:lvlText w:val="o"/>
       <w:lvlJc w:val="left"/>
       <w:pPr>
-        <w:ind w:left="1800" w:hanging="360"/>
+        <w:ind w:left="3240" w:hanging="360"/>
       </w:pPr>
       <w:rPr>
         <w:rFonts w:ascii="Courier New" w:hAnsi="Courier New" w:cs="Courier New" w:hint="default"/>
@@ -44735,7 +44760,7 @@
       <w:lvlText w:val=""/>
       <w:lvlJc w:val="left"/>
       <w:pPr>
-        <w:ind w:left="2520" w:hanging="360"/>
+        <w:ind w:left="3960" w:hanging="360"/>
       </w:pPr>
       <w:rPr>
         <w:rFonts w:ascii="Wingdings" w:hAnsi="Wingdings" w:hint="default"/>
@@ -44747,7 +44772,7 @@
       <w:lvlText w:val=""/>
       <w:lvlJc w:val="left"/>
       <w:pPr>
-        <w:ind w:left="3240" w:hanging="360"/>
+        <w:ind w:left="4680" w:hanging="360"/>
       </w:pPr>
       <w:rPr>
         <w:rFonts w:ascii="Symbol" w:hAnsi="Symbol" w:hint="default"/>
@@ -44759,7 +44784,7 @@
       <w:lvlText w:val="o"/>
       <w:lvlJc w:val="left"/>
       <w:pPr>
-        <w:ind w:left="3960" w:hanging="360"/>
+        <w:ind w:left="5400" w:hanging="360"/>
       </w:pPr>
       <w:rPr>
         <w:rFonts w:ascii="Courier New" w:hAnsi="Courier New" w:cs="Courier New" w:hint="default"/>
@@ -44771,7 +44796,7 @@
       <w:lvlText w:val=""/>
       <w:lvlJc w:val="left"/>
       <w:pPr>
-        <w:ind w:left="4680" w:hanging="360"/>
+        <w:ind w:left="6120" w:hanging="360"/>
       </w:pPr>
       <w:rPr>
         <w:rFonts w:ascii="Wingdings" w:hAnsi="Wingdings" w:hint="default"/>
@@ -44783,7 +44808,7 @@
       <w:lvlText w:val=""/>
       <w:lvlJc w:val="left"/>
       <w:pPr>
-        <w:ind w:left="5400" w:hanging="360"/>
+        <w:ind w:left="6840" w:hanging="360"/>
       </w:pPr>
       <w:rPr>
         <w:rFonts w:ascii="Symbol" w:hAnsi="Symbol" w:hint="default"/>
@@ -44795,7 +44820,7 @@
       <w:lvlText w:val="o"/>
       <w:lvlJc w:val="left"/>
       <w:pPr>
-        <w:ind w:left="6120" w:hanging="360"/>
+        <w:ind w:left="7560" w:hanging="360"/>
       </w:pPr>
       <w:rPr>
         <w:rFonts w:ascii="Courier New" w:hAnsi="Courier New" w:cs="Courier New" w:hint="default"/>
@@ -44807,17 +44832,192 @@
       <w:lvlText w:val=""/>
       <w:lvlJc w:val="left"/>
       <w:pPr>
-        <w:ind w:left="6840" w:hanging="360"/>
+        <w:ind w:left="8280" w:hanging="360"/>
       </w:pPr>
       <w:rPr>
         <w:rFonts w:ascii="Wingdings" w:hAnsi="Wingdings" w:hint="default"/>
       </w:rPr>
     </w:lvl>
   </w:abstractNum>
+  <w:abstractNum w:abstractNumId="2" w15:restartNumberingAfterBreak="0">
+    <w:nsid w:val="0B530E0C"/>
+    <w:multiLevelType w:val="hybridMultilevel"/>
+    <w:tmpl w:val="ADB8013C"/>
+    <w:lvl w:ilvl="0" w:tplc="628AE638">
+      <w:start w:val="1"/>
+      <w:numFmt w:val="decimal"/>
+      <w:lvlText w:val="%1."/>
+      <w:lvlJc w:val="left"/>
+      <w:pPr>
+        <w:ind w:left="1800" w:hanging="360"/>
+      </w:pPr>
+      <w:rPr>
+        <w:rFonts w:hint="default"/>
+      </w:rPr>
+    </w:lvl>
+    <w:lvl w:ilvl="1" w:tplc="0C0A0019" w:tentative="1">
+      <w:start w:val="1"/>
+      <w:numFmt w:val="lowerLetter"/>
+      <w:lvlText w:val="%2."/>
+      <w:lvlJc w:val="left"/>
+      <w:pPr>
+        <w:ind w:left="2520" w:hanging="360"/>
+      </w:pPr>
+    </w:lvl>
+    <w:lvl w:ilvl="2" w:tplc="0C0A001B" w:tentative="1">
+      <w:start w:val="1"/>
+      <w:numFmt w:val="lowerRoman"/>
+      <w:lvlText w:val="%3."/>
+      <w:lvlJc w:val="right"/>
+      <w:pPr>
+        <w:ind w:left="3240" w:hanging="180"/>
+      </w:pPr>
+    </w:lvl>
+    <w:lvl w:ilvl="3" w:tplc="0C0A000F" w:tentative="1">
+      <w:start w:val="1"/>
+      <w:numFmt w:val="decimal"/>
+      <w:lvlText w:val="%4."/>
+      <w:lvlJc w:val="left"/>
+      <w:pPr>
+        <w:ind w:left="3960" w:hanging="360"/>
+      </w:pPr>
+    </w:lvl>
+    <w:lvl w:ilvl="4" w:tplc="0C0A0019" w:tentative="1">
+      <w:start w:val="1"/>
+      <w:numFmt w:val="lowerLetter"/>
+      <w:lvlText w:val="%5."/>
+      <w:lvlJc w:val="left"/>
+      <w:pPr>
+        <w:ind w:left="4680" w:hanging="360"/>
+      </w:pPr>
+    </w:lvl>
+    <w:lvl w:ilvl="5" w:tplc="0C0A001B" w:tentative="1">
+      <w:start w:val="1"/>
+      <w:numFmt w:val="lowerRoman"/>
+      <w:lvlText w:val="%6."/>
+      <w:lvlJc w:val="right"/>
+      <w:pPr>
+        <w:ind w:left="5400" w:hanging="180"/>
+      </w:pPr>
+    </w:lvl>
+    <w:lvl w:ilvl="6" w:tplc="0C0A000F" w:tentative="1">
+      <w:start w:val="1"/>
+      <w:numFmt w:val="decimal"/>
+      <w:lvlText w:val="%7."/>
+      <w:lvlJc w:val="left"/>
+      <w:pPr>
+        <w:ind w:left="6120" w:hanging="360"/>
+      </w:pPr>
+    </w:lvl>
+    <w:lvl w:ilvl="7" w:tplc="0C0A0019" w:tentative="1">
+      <w:start w:val="1"/>
+      <w:numFmt w:val="lowerLetter"/>
+      <w:lvlText w:val="%8."/>
+      <w:lvlJc w:val="left"/>
+      <w:pPr>
+        <w:ind w:left="6840" w:hanging="360"/>
+      </w:pPr>
+    </w:lvl>
+    <w:lvl w:ilvl="8" w:tplc="0C0A001B" w:tentative="1">
+      <w:start w:val="1"/>
+      <w:numFmt w:val="lowerRoman"/>
+      <w:lvlText w:val="%9."/>
+      <w:lvlJc w:val="right"/>
+      <w:pPr>
+        <w:ind w:left="7560" w:hanging="180"/>
+      </w:pPr>
+    </w:lvl>
+  </w:abstractNum>
   <w:abstractNum w:abstractNumId="3" w15:restartNumberingAfterBreak="0">
-    <w:nsid w:val="30031545"/>
+    <w:nsid w:val="0FB075BD"/>
     <w:multiLevelType w:val="hybridMultilevel"/>
-    <w:tmpl w:val="3A9E44FA"/>
+    <w:tmpl w:val="31DE7E7C"/>
+    <w:lvl w:ilvl="0" w:tplc="0C0A000F">
+      <w:start w:val="1"/>
+      <w:numFmt w:val="decimal"/>
+      <w:lvlText w:val="%1."/>
+      <w:lvlJc w:val="left"/>
+      <w:pPr>
+        <w:ind w:left="720" w:hanging="360"/>
+      </w:pPr>
+    </w:lvl>
+    <w:lvl w:ilvl="1" w:tplc="0C0A0019" w:tentative="1">
+      <w:start w:val="1"/>
+      <w:numFmt w:val="lowerLetter"/>
+      <w:lvlText w:val="%2."/>
+      <w:lvlJc w:val="left"/>
+      <w:pPr>
+        <w:ind w:left="1440" w:hanging="360"/>
+      </w:pPr>
+    </w:lvl>
+    <w:lvl w:ilvl="2" w:tplc="0C0A001B" w:tentative="1">
+      <w:start w:val="1"/>
+      <w:numFmt w:val="lowerRoman"/>
+      <w:lvlText w:val="%3."/>
+      <w:lvlJc w:val="right"/>
+      <w:pPr>
+        <w:ind w:left="2160" w:hanging="180"/>
+      </w:pPr>
+    </w:lvl>
+    <w:lvl w:ilvl="3" w:tplc="0C0A000F" w:tentative="1">
+      <w:start w:val="1"/>
+      <w:numFmt w:val="decimal"/>
+      <w:lvlText w:val="%4."/>
+      <w:lvlJc w:val="left"/>
+      <w:pPr>
+        <w:ind w:left="2880" w:hanging="360"/>
+      </w:pPr>
+    </w:lvl>
+    <w:lvl w:ilvl="4" w:tplc="0C0A0019" w:tentative="1">
+      <w:start w:val="1"/>
+      <w:numFmt w:val="lowerLetter"/>
+      <w:lvlText w:val="%5."/>
+      <w:lvlJc w:val="left"/>
+      <w:pPr>
+        <w:ind w:left="3600" w:hanging="360"/>
+      </w:pPr>
+    </w:lvl>
+    <w:lvl w:ilvl="5" w:tplc="0C0A001B" w:tentative="1">
+      <w:start w:val="1"/>
+      <w:numFmt w:val="lowerRoman"/>
+      <w:lvlText w:val="%6."/>
+      <w:lvlJc w:val="right"/>
+      <w:pPr>
+        <w:ind w:left="4320" w:hanging="180"/>
+      </w:pPr>
+    </w:lvl>
+    <w:lvl w:ilvl="6" w:tplc="0C0A000F" w:tentative="1">
+      <w:start w:val="1"/>
+      <w:numFmt w:val="decimal"/>
+      <w:lvlText w:val="%7."/>
+      <w:lvlJc w:val="left"/>
+      <w:pPr>
+        <w:ind w:left="5040" w:hanging="360"/>
+      </w:pPr>
+    </w:lvl>
+    <w:lvl w:ilvl="7" w:tplc="0C0A0019" w:tentative="1">
+      <w:start w:val="1"/>
+      <w:numFmt w:val="lowerLetter"/>
+      <w:lvlText w:val="%8."/>
+      <w:lvlJc w:val="left"/>
+      <w:pPr>
+        <w:ind w:left="5760" w:hanging="360"/>
+      </w:pPr>
+    </w:lvl>
+    <w:lvl w:ilvl="8" w:tplc="0C0A001B" w:tentative="1">
+      <w:start w:val="1"/>
+      <w:numFmt w:val="lowerRoman"/>
+      <w:lvlText w:val="%9."/>
+      <w:lvlJc w:val="right"/>
+      <w:pPr>
+        <w:ind w:left="6480" w:hanging="180"/>
+      </w:pPr>
+    </w:lvl>
+  </w:abstractNum>
+  <w:abstractNum w:abstractNumId="4" w15:restartNumberingAfterBreak="0">
+    <w:nsid w:val="1BC0572C"/>
+    <w:multiLevelType w:val="hybridMultilevel"/>
+    <w:tmpl w:val="8580F39E"/>
     <w:lvl w:ilvl="0" w:tplc="0C0A0001">
       <w:start w:val="1"/>
       <w:numFmt w:val="bullet"/>
@@ -44927,7 +45127,233 @@
       </w:rPr>
     </w:lvl>
   </w:abstractNum>
-  <w:abstractNum w:abstractNumId="4" w15:restartNumberingAfterBreak="0">
+  <w:abstractNum w:abstractNumId="5" w15:restartNumberingAfterBreak="0">
+    <w:nsid w:val="266F1D46"/>
+    <w:multiLevelType w:val="hybridMultilevel"/>
+    <w:tmpl w:val="86D651EE"/>
+    <w:lvl w:ilvl="0" w:tplc="0C0A0001">
+      <w:start w:val="1"/>
+      <w:numFmt w:val="bullet"/>
+      <w:lvlText w:val=""/>
+      <w:lvlJc w:val="left"/>
+      <w:pPr>
+        <w:ind w:left="2520" w:hanging="360"/>
+      </w:pPr>
+      <w:rPr>
+        <w:rFonts w:ascii="Symbol" w:hAnsi="Symbol" w:hint="default"/>
+      </w:rPr>
+    </w:lvl>
+    <w:lvl w:ilvl="1" w:tplc="0C0A0003" w:tentative="1">
+      <w:start w:val="1"/>
+      <w:numFmt w:val="bullet"/>
+      <w:lvlText w:val="o"/>
+      <w:lvlJc w:val="left"/>
+      <w:pPr>
+        <w:ind w:left="3240" w:hanging="360"/>
+      </w:pPr>
+      <w:rPr>
+        <w:rFonts w:ascii="Courier New" w:hAnsi="Courier New" w:cs="Courier New" w:hint="default"/>
+      </w:rPr>
+    </w:lvl>
+    <w:lvl w:ilvl="2" w:tplc="0C0A0005" w:tentative="1">
+      <w:start w:val="1"/>
+      <w:numFmt w:val="bullet"/>
+      <w:lvlText w:val=""/>
+      <w:lvlJc w:val="left"/>
+      <w:pPr>
+        <w:ind w:left="3960" w:hanging="360"/>
+      </w:pPr>
+      <w:rPr>
+        <w:rFonts w:ascii="Wingdings" w:hAnsi="Wingdings" w:hint="default"/>
+      </w:rPr>
+    </w:lvl>
+    <w:lvl w:ilvl="3" w:tplc="0C0A0001" w:tentative="1">
+      <w:start w:val="1"/>
+      <w:numFmt w:val="bullet"/>
+      <w:lvlText w:val=""/>
+      <w:lvlJc w:val="left"/>
+      <w:pPr>
+        <w:ind w:left="4680" w:hanging="360"/>
+      </w:pPr>
+      <w:rPr>
+        <w:rFonts w:ascii="Symbol" w:hAnsi="Symbol" w:hint="default"/>
+      </w:rPr>
+    </w:lvl>
+    <w:lvl w:ilvl="4" w:tplc="0C0A0003" w:tentative="1">
+      <w:start w:val="1"/>
+      <w:numFmt w:val="bullet"/>
+      <w:lvlText w:val="o"/>
+      <w:lvlJc w:val="left"/>
+      <w:pPr>
+        <w:ind w:left="5400" w:hanging="360"/>
+      </w:pPr>
+      <w:rPr>
+        <w:rFonts w:ascii="Courier New" w:hAnsi="Courier New" w:cs="Courier New" w:hint="default"/>
+      </w:rPr>
+    </w:lvl>
+    <w:lvl w:ilvl="5" w:tplc="0C0A0005" w:tentative="1">
+      <w:start w:val="1"/>
+      <w:numFmt w:val="bullet"/>
+      <w:lvlText w:val=""/>
+      <w:lvlJc w:val="left"/>
+      <w:pPr>
+        <w:ind w:left="6120" w:hanging="360"/>
+      </w:pPr>
+      <w:rPr>
+        <w:rFonts w:ascii="Wingdings" w:hAnsi="Wingdings" w:hint="default"/>
+      </w:rPr>
+    </w:lvl>
+    <w:lvl w:ilvl="6" w:tplc="0C0A0001" w:tentative="1">
+      <w:start w:val="1"/>
+      <w:numFmt w:val="bullet"/>
+      <w:lvlText w:val=""/>
+      <w:lvlJc w:val="left"/>
+      <w:pPr>
+        <w:ind w:left="6840" w:hanging="360"/>
+      </w:pPr>
+      <w:rPr>
+        <w:rFonts w:ascii="Symbol" w:hAnsi="Symbol" w:hint="default"/>
+      </w:rPr>
+    </w:lvl>
+    <w:lvl w:ilvl="7" w:tplc="0C0A0003" w:tentative="1">
+      <w:start w:val="1"/>
+      <w:numFmt w:val="bullet"/>
+      <w:lvlText w:val="o"/>
+      <w:lvlJc w:val="left"/>
+      <w:pPr>
+        <w:ind w:left="7560" w:hanging="360"/>
+      </w:pPr>
+      <w:rPr>
+        <w:rFonts w:ascii="Courier New" w:hAnsi="Courier New" w:cs="Courier New" w:hint="default"/>
+      </w:rPr>
+    </w:lvl>
+    <w:lvl w:ilvl="8" w:tplc="0C0A0005" w:tentative="1">
+      <w:start w:val="1"/>
+      <w:numFmt w:val="bullet"/>
+      <w:lvlText w:val=""/>
+      <w:lvlJc w:val="left"/>
+      <w:pPr>
+        <w:ind w:left="8280" w:hanging="360"/>
+      </w:pPr>
+      <w:rPr>
+        <w:rFonts w:ascii="Wingdings" w:hAnsi="Wingdings" w:hint="default"/>
+      </w:rPr>
+    </w:lvl>
+  </w:abstractNum>
+  <w:abstractNum w:abstractNumId="6" w15:restartNumberingAfterBreak="0">
+    <w:nsid w:val="30031545"/>
+    <w:multiLevelType w:val="hybridMultilevel"/>
+    <w:tmpl w:val="3A9E44FA"/>
+    <w:lvl w:ilvl="0" w:tplc="0C0A0001">
+      <w:start w:val="1"/>
+      <w:numFmt w:val="bullet"/>
+      <w:lvlText w:val=""/>
+      <w:lvlJc w:val="left"/>
+      <w:pPr>
+        <w:ind w:left="1080" w:hanging="360"/>
+      </w:pPr>
+      <w:rPr>
+        <w:rFonts w:ascii="Symbol" w:hAnsi="Symbol" w:hint="default"/>
+      </w:rPr>
+    </w:lvl>
+    <w:lvl w:ilvl="1" w:tplc="0C0A0003" w:tentative="1">
+      <w:start w:val="1"/>
+      <w:numFmt w:val="bullet"/>
+      <w:lvlText w:val="o"/>
+      <w:lvlJc w:val="left"/>
+      <w:pPr>
+        <w:ind w:left="1800" w:hanging="360"/>
+      </w:pPr>
+      <w:rPr>
+        <w:rFonts w:ascii="Courier New" w:hAnsi="Courier New" w:cs="Courier New" w:hint="default"/>
+      </w:rPr>
+    </w:lvl>
+    <w:lvl w:ilvl="2" w:tplc="0C0A0005" w:tentative="1">
+      <w:start w:val="1"/>
+      <w:numFmt w:val="bullet"/>
+      <w:lvlText w:val=""/>
+      <w:lvlJc w:val="left"/>
+      <w:pPr>
+        <w:ind w:left="2520" w:hanging="360"/>
+      </w:pPr>
+      <w:rPr>
+        <w:rFonts w:ascii="Wingdings" w:hAnsi="Wingdings" w:hint="default"/>
+      </w:rPr>
+    </w:lvl>
+    <w:lvl w:ilvl="3" w:tplc="0C0A0001" w:tentative="1">
+      <w:start w:val="1"/>
+      <w:numFmt w:val="bullet"/>
+      <w:lvlText w:val=""/>
+      <w:lvlJc w:val="left"/>
+      <w:pPr>
+        <w:ind w:left="3240" w:hanging="360"/>
+      </w:pPr>
+      <w:rPr>
+        <w:rFonts w:ascii="Symbol" w:hAnsi="Symbol" w:hint="default"/>
+      </w:rPr>
+    </w:lvl>
+    <w:lvl w:ilvl="4" w:tplc="0C0A0003" w:tentative="1">
+      <w:start w:val="1"/>
+      <w:numFmt w:val="bullet"/>
+      <w:lvlText w:val="o"/>
+      <w:lvlJc w:val="left"/>
+      <w:pPr>
+        <w:ind w:left="3960" w:hanging="360"/>
+      </w:pPr>
+      <w:rPr>
+        <w:rFonts w:ascii="Courier New" w:hAnsi="Courier New" w:cs="Courier New" w:hint="default"/>
+      </w:rPr>
+    </w:lvl>
+    <w:lvl w:ilvl="5" w:tplc="0C0A0005" w:tentative="1">
+      <w:start w:val="1"/>
+      <w:numFmt w:val="bullet"/>
+      <w:lvlText w:val=""/>
+      <w:lvlJc w:val="left"/>
+      <w:pPr>
+        <w:ind w:left="4680" w:hanging="360"/>
+      </w:pPr>
+      <w:rPr>
+        <w:rFonts w:ascii="Wingdings" w:hAnsi="Wingdings" w:hint="default"/>
+      </w:rPr>
+    </w:lvl>
+    <w:lvl w:ilvl="6" w:tplc="0C0A0001" w:tentative="1">
+      <w:start w:val="1"/>
+      <w:numFmt w:val="bullet"/>
+      <w:lvlText w:val=""/>
+      <w:lvlJc w:val="left"/>
+      <w:pPr>
+        <w:ind w:left="5400" w:hanging="360"/>
+      </w:pPr>
+      <w:rPr>
+        <w:rFonts w:ascii="Symbol" w:hAnsi="Symbol" w:hint="default"/>
+      </w:rPr>
+    </w:lvl>
+    <w:lvl w:ilvl="7" w:tplc="0C0A0003" w:tentative="1">
+      <w:start w:val="1"/>
+      <w:numFmt w:val="bullet"/>
+      <w:lvlText w:val="o"/>
+      <w:lvlJc w:val="left"/>
+      <w:pPr>
+        <w:ind w:left="6120" w:hanging="360"/>
+      </w:pPr>
+      <w:rPr>
+        <w:rFonts w:ascii="Courier New" w:hAnsi="Courier New" w:cs="Courier New" w:hint="default"/>
+      </w:rPr>
+    </w:lvl>
+    <w:lvl w:ilvl="8" w:tplc="0C0A0005" w:tentative="1">
+      <w:start w:val="1"/>
+      <w:numFmt w:val="bullet"/>
+      <w:lvlText w:val=""/>
+      <w:lvlJc w:val="left"/>
+      <w:pPr>
+        <w:ind w:left="6840" w:hanging="360"/>
+      </w:pPr>
+      <w:rPr>
+        <w:rFonts w:ascii="Wingdings" w:hAnsi="Wingdings" w:hint="default"/>
+      </w:rPr>
+    </w:lvl>
+  </w:abstractNum>
+  <w:abstractNum w:abstractNumId="7" w15:restartNumberingAfterBreak="0">
     <w:nsid w:val="408734B4"/>
     <w:multiLevelType w:val="hybridMultilevel"/>
     <w:tmpl w:val="2D56C700"/>
@@ -45040,7 +45466,7 @@
       </w:rPr>
     </w:lvl>
   </w:abstractNum>
-  <w:abstractNum w:abstractNumId="5" w15:restartNumberingAfterBreak="0">
+  <w:abstractNum w:abstractNumId="8" w15:restartNumberingAfterBreak="0">
     <w:nsid w:val="415F2157"/>
     <w:multiLevelType w:val="hybridMultilevel"/>
     <w:tmpl w:val="8C52AE3E"/>
@@ -45153,7 +45579,7 @@
       </w:rPr>
     </w:lvl>
   </w:abstractNum>
-  <w:abstractNum w:abstractNumId="6" w15:restartNumberingAfterBreak="0">
+  <w:abstractNum w:abstractNumId="9" w15:restartNumberingAfterBreak="0">
     <w:nsid w:val="46D2207E"/>
     <w:multiLevelType w:val="hybridMultilevel"/>
     <w:tmpl w:val="7F6A73AA"/>
@@ -45266,7 +45692,7 @@
       </w:rPr>
     </w:lvl>
   </w:abstractNum>
-  <w:abstractNum w:abstractNumId="7" w15:restartNumberingAfterBreak="0">
+  <w:abstractNum w:abstractNumId="10" w15:restartNumberingAfterBreak="0">
     <w:nsid w:val="49174A88"/>
     <w:multiLevelType w:val="hybridMultilevel"/>
     <w:tmpl w:val="A3DEF222"/>
@@ -45379,7 +45805,7 @@
       </w:rPr>
     </w:lvl>
   </w:abstractNum>
-  <w:abstractNum w:abstractNumId="8" w15:restartNumberingAfterBreak="0">
+  <w:abstractNum w:abstractNumId="11" w15:restartNumberingAfterBreak="0">
     <w:nsid w:val="4C27462A"/>
     <w:multiLevelType w:val="hybridMultilevel"/>
     <w:tmpl w:val="D5AE26E6"/>
@@ -45492,7 +45918,7 @@
       </w:rPr>
     </w:lvl>
   </w:abstractNum>
-  <w:abstractNum w:abstractNumId="9" w15:restartNumberingAfterBreak="0">
+  <w:abstractNum w:abstractNumId="12" w15:restartNumberingAfterBreak="0">
     <w:nsid w:val="54E76D80"/>
     <w:multiLevelType w:val="hybridMultilevel"/>
     <w:tmpl w:val="4CAAA5CC"/>
@@ -45605,7 +46031,7 @@
       </w:rPr>
     </w:lvl>
   </w:abstractNum>
-  <w:abstractNum w:abstractNumId="10" w15:restartNumberingAfterBreak="0">
+  <w:abstractNum w:abstractNumId="13" w15:restartNumberingAfterBreak="0">
     <w:nsid w:val="56DC0F4F"/>
     <w:multiLevelType w:val="hybridMultilevel"/>
     <w:tmpl w:val="DBDE6AE6"/>
@@ -45718,7 +46144,7 @@
       </w:rPr>
     </w:lvl>
   </w:abstractNum>
-  <w:abstractNum w:abstractNumId="11" w15:restartNumberingAfterBreak="0">
+  <w:abstractNum w:abstractNumId="14" w15:restartNumberingAfterBreak="0">
     <w:nsid w:val="584108BF"/>
     <w:multiLevelType w:val="hybridMultilevel"/>
     <w:tmpl w:val="720A6B12"/>
@@ -45831,17 +46257,17 @@
       </w:rPr>
     </w:lvl>
   </w:abstractNum>
-  <w:abstractNum w:abstractNumId="12" w15:restartNumberingAfterBreak="0">
-    <w:nsid w:val="780E04D7"/>
+  <w:abstractNum w:abstractNumId="15" w15:restartNumberingAfterBreak="0">
+    <w:nsid w:val="60056615"/>
     <w:multiLevelType w:val="hybridMultilevel"/>
-    <w:tmpl w:val="AAA02FD2"/>
+    <w:tmpl w:val="1DA212B2"/>
     <w:lvl w:ilvl="0" w:tplc="0C0A0001">
       <w:start w:val="1"/>
       <w:numFmt w:val="bullet"/>
       <w:lvlText w:val=""/>
       <w:lvlJc w:val="left"/>
       <w:pPr>
-        <w:ind w:left="720" w:hanging="360"/>
+        <w:ind w:left="2520" w:hanging="360"/>
       </w:pPr>
       <w:rPr>
         <w:rFonts w:ascii="Symbol" w:hAnsi="Symbol" w:hint="default"/>
@@ -45853,7 +46279,7 @@
       <w:lvlText w:val="o"/>
       <w:lvlJc w:val="left"/>
       <w:pPr>
-        <w:ind w:left="1440" w:hanging="360"/>
+        <w:ind w:left="3240" w:hanging="360"/>
       </w:pPr>
       <w:rPr>
         <w:rFonts w:ascii="Courier New" w:hAnsi="Courier New" w:cs="Courier New" w:hint="default"/>
@@ -45865,7 +46291,7 @@
       <w:lvlText w:val=""/>
       <w:lvlJc w:val="left"/>
       <w:pPr>
-        <w:ind w:left="2160" w:hanging="360"/>
+        <w:ind w:left="3960" w:hanging="360"/>
       </w:pPr>
       <w:rPr>
         <w:rFonts w:ascii="Wingdings" w:hAnsi="Wingdings" w:hint="default"/>
@@ -45877,7 +46303,7 @@
       <w:lvlText w:val=""/>
       <w:lvlJc w:val="left"/>
       <w:pPr>
-        <w:ind w:left="2880" w:hanging="360"/>
+        <w:ind w:left="4680" w:hanging="360"/>
       </w:pPr>
       <w:rPr>
         <w:rFonts w:ascii="Symbol" w:hAnsi="Symbol" w:hint="default"/>
@@ -45889,7 +46315,7 @@
       <w:lvlText w:val="o"/>
       <w:lvlJc w:val="left"/>
       <w:pPr>
-        <w:ind w:left="3600" w:hanging="360"/>
+        <w:ind w:left="5400" w:hanging="360"/>
       </w:pPr>
       <w:rPr>
         <w:rFonts w:ascii="Courier New" w:hAnsi="Courier New" w:cs="Courier New" w:hint="default"/>
@@ -45901,7 +46327,7 @@
       <w:lvlText w:val=""/>
       <w:lvlJc w:val="left"/>
       <w:pPr>
-        <w:ind w:left="4320" w:hanging="360"/>
+        <w:ind w:left="6120" w:hanging="360"/>
       </w:pPr>
       <w:rPr>
         <w:rFonts w:ascii="Wingdings" w:hAnsi="Wingdings" w:hint="default"/>
@@ -45913,7 +46339,7 @@
       <w:lvlText w:val=""/>
       <w:lvlJc w:val="left"/>
       <w:pPr>
-        <w:ind w:left="5040" w:hanging="360"/>
+        <w:ind w:left="6840" w:hanging="360"/>
       </w:pPr>
       <w:rPr>
         <w:rFonts w:ascii="Symbol" w:hAnsi="Symbol" w:hint="default"/>
@@ -45925,7 +46351,7 @@
       <w:lvlText w:val="o"/>
       <w:lvlJc w:val="left"/>
       <w:pPr>
-        <w:ind w:left="5760" w:hanging="360"/>
+        <w:ind w:left="7560" w:hanging="360"/>
       </w:pPr>
       <w:rPr>
         <w:rFonts w:ascii="Courier New" w:hAnsi="Courier New" w:cs="Courier New" w:hint="default"/>
@@ -45937,24 +46363,24 @@
       <w:lvlText w:val=""/>
       <w:lvlJc w:val="left"/>
       <w:pPr>
-        <w:ind w:left="6480" w:hanging="360"/>
+        <w:ind w:left="8280" w:hanging="360"/>
       </w:pPr>
       <w:rPr>
         <w:rFonts w:ascii="Wingdings" w:hAnsi="Wingdings" w:hint="default"/>
       </w:rPr>
     </w:lvl>
   </w:abstractNum>
-  <w:abstractNum w:abstractNumId="13" w15:restartNumberingAfterBreak="0">
-    <w:nsid w:val="79306B18"/>
+  <w:abstractNum w:abstractNumId="16" w15:restartNumberingAfterBreak="0">
+    <w:nsid w:val="63C01A14"/>
     <w:multiLevelType w:val="hybridMultilevel"/>
-    <w:tmpl w:val="B02AD490"/>
+    <w:tmpl w:val="664020B8"/>
     <w:lvl w:ilvl="0" w:tplc="0C0A0001">
       <w:start w:val="1"/>
       <w:numFmt w:val="bullet"/>
       <w:lvlText w:val=""/>
       <w:lvlJc w:val="left"/>
       <w:pPr>
-        <w:ind w:left="1080" w:hanging="360"/>
+        <w:ind w:left="2520" w:hanging="360"/>
       </w:pPr>
       <w:rPr>
         <w:rFonts w:ascii="Symbol" w:hAnsi="Symbol" w:hint="default"/>
@@ -45966,7 +46392,7 @@
       <w:lvlText w:val="o"/>
       <w:lvlJc w:val="left"/>
       <w:pPr>
-        <w:ind w:left="1800" w:hanging="360"/>
+        <w:ind w:left="3240" w:hanging="360"/>
       </w:pPr>
       <w:rPr>
         <w:rFonts w:ascii="Courier New" w:hAnsi="Courier New" w:cs="Courier New" w:hint="default"/>
@@ -45978,7 +46404,7 @@
       <w:lvlText w:val=""/>
       <w:lvlJc w:val="left"/>
       <w:pPr>
-        <w:ind w:left="2520" w:hanging="360"/>
+        <w:ind w:left="3960" w:hanging="360"/>
       </w:pPr>
       <w:rPr>
         <w:rFonts w:ascii="Wingdings" w:hAnsi="Wingdings" w:hint="default"/>
@@ -45990,7 +46416,7 @@
       <w:lvlText w:val=""/>
       <w:lvlJc w:val="left"/>
       <w:pPr>
-        <w:ind w:left="3240" w:hanging="360"/>
+        <w:ind w:left="4680" w:hanging="360"/>
       </w:pPr>
       <w:rPr>
         <w:rFonts w:ascii="Symbol" w:hAnsi="Symbol" w:hint="default"/>
@@ -46002,7 +46428,7 @@
       <w:lvlText w:val="o"/>
       <w:lvlJc w:val="left"/>
       <w:pPr>
-        <w:ind w:left="3960" w:hanging="360"/>
+        <w:ind w:left="5400" w:hanging="360"/>
       </w:pPr>
       <w:rPr>
         <w:rFonts w:ascii="Courier New" w:hAnsi="Courier New" w:cs="Courier New" w:hint="default"/>
@@ -46014,7 +46440,7 @@
       <w:lvlText w:val=""/>
       <w:lvlJc w:val="left"/>
       <w:pPr>
-        <w:ind w:left="4680" w:hanging="360"/>
+        <w:ind w:left="6120" w:hanging="360"/>
       </w:pPr>
       <w:rPr>
         <w:rFonts w:ascii="Wingdings" w:hAnsi="Wingdings" w:hint="default"/>
@@ -46026,7 +46452,7 @@
       <w:lvlText w:val=""/>
       <w:lvlJc w:val="left"/>
       <w:pPr>
-        <w:ind w:left="5400" w:hanging="360"/>
+        <w:ind w:left="6840" w:hanging="360"/>
       </w:pPr>
       <w:rPr>
         <w:rFonts w:ascii="Symbol" w:hAnsi="Symbol" w:hint="default"/>
@@ -46038,7 +46464,7 @@
       <w:lvlText w:val="o"/>
       <w:lvlJc w:val="left"/>
       <w:pPr>
-        <w:ind w:left="6120" w:hanging="360"/>
+        <w:ind w:left="7560" w:hanging="360"/>
       </w:pPr>
       <w:rPr>
         <w:rFonts w:ascii="Courier New" w:hAnsi="Courier New" w:cs="Courier New" w:hint="default"/>
@@ -46050,6 +46476,547 @@
       <w:lvlText w:val=""/>
       <w:lvlJc w:val="left"/>
       <w:pPr>
+        <w:ind w:left="8280" w:hanging="360"/>
+      </w:pPr>
+      <w:rPr>
+        <w:rFonts w:ascii="Wingdings" w:hAnsi="Wingdings" w:hint="default"/>
+      </w:rPr>
+    </w:lvl>
+  </w:abstractNum>
+  <w:abstractNum w:abstractNumId="17" w15:restartNumberingAfterBreak="0">
+    <w:nsid w:val="6C750F61"/>
+    <w:multiLevelType w:val="hybridMultilevel"/>
+    <w:tmpl w:val="66AC513E"/>
+    <w:lvl w:ilvl="0" w:tplc="76AC05B6">
+      <w:start w:val="1"/>
+      <w:numFmt w:val="decimal"/>
+      <w:lvlText w:val="%1."/>
+      <w:lvlJc w:val="left"/>
+      <w:pPr>
+        <w:ind w:left="1800" w:hanging="360"/>
+      </w:pPr>
+      <w:rPr>
+        <w:rFonts w:hint="default"/>
+      </w:rPr>
+    </w:lvl>
+    <w:lvl w:ilvl="1" w:tplc="0C0A0019">
+      <w:start w:val="1"/>
+      <w:numFmt w:val="lowerLetter"/>
+      <w:lvlText w:val="%2."/>
+      <w:lvlJc w:val="left"/>
+      <w:pPr>
+        <w:ind w:left="2520" w:hanging="360"/>
+      </w:pPr>
+    </w:lvl>
+    <w:lvl w:ilvl="2" w:tplc="0C0A001B" w:tentative="1">
+      <w:start w:val="1"/>
+      <w:numFmt w:val="lowerRoman"/>
+      <w:lvlText w:val="%3."/>
+      <w:lvlJc w:val="right"/>
+      <w:pPr>
+        <w:ind w:left="3240" w:hanging="180"/>
+      </w:pPr>
+    </w:lvl>
+    <w:lvl w:ilvl="3" w:tplc="0C0A000F" w:tentative="1">
+      <w:start w:val="1"/>
+      <w:numFmt w:val="decimal"/>
+      <w:lvlText w:val="%4."/>
+      <w:lvlJc w:val="left"/>
+      <w:pPr>
+        <w:ind w:left="3960" w:hanging="360"/>
+      </w:pPr>
+    </w:lvl>
+    <w:lvl w:ilvl="4" w:tplc="0C0A0019" w:tentative="1">
+      <w:start w:val="1"/>
+      <w:numFmt w:val="lowerLetter"/>
+      <w:lvlText w:val="%5."/>
+      <w:lvlJc w:val="left"/>
+      <w:pPr>
+        <w:ind w:left="4680" w:hanging="360"/>
+      </w:pPr>
+    </w:lvl>
+    <w:lvl w:ilvl="5" w:tplc="0C0A001B" w:tentative="1">
+      <w:start w:val="1"/>
+      <w:numFmt w:val="lowerRoman"/>
+      <w:lvlText w:val="%6."/>
+      <w:lvlJc w:val="right"/>
+      <w:pPr>
+        <w:ind w:left="5400" w:hanging="180"/>
+      </w:pPr>
+    </w:lvl>
+    <w:lvl w:ilvl="6" w:tplc="0C0A000F" w:tentative="1">
+      <w:start w:val="1"/>
+      <w:numFmt w:val="decimal"/>
+      <w:lvlText w:val="%7."/>
+      <w:lvlJc w:val="left"/>
+      <w:pPr>
+        <w:ind w:left="6120" w:hanging="360"/>
+      </w:pPr>
+    </w:lvl>
+    <w:lvl w:ilvl="7" w:tplc="0C0A0019" w:tentative="1">
+      <w:start w:val="1"/>
+      <w:numFmt w:val="lowerLetter"/>
+      <w:lvlText w:val="%8."/>
+      <w:lvlJc w:val="left"/>
+      <w:pPr>
+        <w:ind w:left="6840" w:hanging="360"/>
+      </w:pPr>
+    </w:lvl>
+    <w:lvl w:ilvl="8" w:tplc="0C0A001B" w:tentative="1">
+      <w:start w:val="1"/>
+      <w:numFmt w:val="lowerRoman"/>
+      <w:lvlText w:val="%9."/>
+      <w:lvlJc w:val="right"/>
+      <w:pPr>
+        <w:ind w:left="7560" w:hanging="180"/>
+      </w:pPr>
+    </w:lvl>
+  </w:abstractNum>
+  <w:abstractNum w:abstractNumId="18" w15:restartNumberingAfterBreak="0">
+    <w:nsid w:val="71A93B23"/>
+    <w:multiLevelType w:val="hybridMultilevel"/>
+    <w:tmpl w:val="F6AA92EA"/>
+    <w:lvl w:ilvl="0" w:tplc="0C0A0001">
+      <w:start w:val="1"/>
+      <w:numFmt w:val="bullet"/>
+      <w:lvlText w:val=""/>
+      <w:lvlJc w:val="left"/>
+      <w:pPr>
+        <w:ind w:left="2520" w:hanging="360"/>
+      </w:pPr>
+      <w:rPr>
+        <w:rFonts w:ascii="Symbol" w:hAnsi="Symbol" w:hint="default"/>
+      </w:rPr>
+    </w:lvl>
+    <w:lvl w:ilvl="1" w:tplc="0C0A0003" w:tentative="1">
+      <w:start w:val="1"/>
+      <w:numFmt w:val="bullet"/>
+      <w:lvlText w:val="o"/>
+      <w:lvlJc w:val="left"/>
+      <w:pPr>
+        <w:ind w:left="3240" w:hanging="360"/>
+      </w:pPr>
+      <w:rPr>
+        <w:rFonts w:ascii="Courier New" w:hAnsi="Courier New" w:cs="Courier New" w:hint="default"/>
+      </w:rPr>
+    </w:lvl>
+    <w:lvl w:ilvl="2" w:tplc="0C0A0005" w:tentative="1">
+      <w:start w:val="1"/>
+      <w:numFmt w:val="bullet"/>
+      <w:lvlText w:val=""/>
+      <w:lvlJc w:val="left"/>
+      <w:pPr>
+        <w:ind w:left="3960" w:hanging="360"/>
+      </w:pPr>
+      <w:rPr>
+        <w:rFonts w:ascii="Wingdings" w:hAnsi="Wingdings" w:hint="default"/>
+      </w:rPr>
+    </w:lvl>
+    <w:lvl w:ilvl="3" w:tplc="0C0A0001" w:tentative="1">
+      <w:start w:val="1"/>
+      <w:numFmt w:val="bullet"/>
+      <w:lvlText w:val=""/>
+      <w:lvlJc w:val="left"/>
+      <w:pPr>
+        <w:ind w:left="4680" w:hanging="360"/>
+      </w:pPr>
+      <w:rPr>
+        <w:rFonts w:ascii="Symbol" w:hAnsi="Symbol" w:hint="default"/>
+      </w:rPr>
+    </w:lvl>
+    <w:lvl w:ilvl="4" w:tplc="0C0A0003" w:tentative="1">
+      <w:start w:val="1"/>
+      <w:numFmt w:val="bullet"/>
+      <w:lvlText w:val="o"/>
+      <w:lvlJc w:val="left"/>
+      <w:pPr>
+        <w:ind w:left="5400" w:hanging="360"/>
+      </w:pPr>
+      <w:rPr>
+        <w:rFonts w:ascii="Courier New" w:hAnsi="Courier New" w:cs="Courier New" w:hint="default"/>
+      </w:rPr>
+    </w:lvl>
+    <w:lvl w:ilvl="5" w:tplc="0C0A0005" w:tentative="1">
+      <w:start w:val="1"/>
+      <w:numFmt w:val="bullet"/>
+      <w:lvlText w:val=""/>
+      <w:lvlJc w:val="left"/>
+      <w:pPr>
+        <w:ind w:left="6120" w:hanging="360"/>
+      </w:pPr>
+      <w:rPr>
+        <w:rFonts w:ascii="Wingdings" w:hAnsi="Wingdings" w:hint="default"/>
+      </w:rPr>
+    </w:lvl>
+    <w:lvl w:ilvl="6" w:tplc="0C0A0001" w:tentative="1">
+      <w:start w:val="1"/>
+      <w:numFmt w:val="bullet"/>
+      <w:lvlText w:val=""/>
+      <w:lvlJc w:val="left"/>
+      <w:pPr>
+        <w:ind w:left="6840" w:hanging="360"/>
+      </w:pPr>
+      <w:rPr>
+        <w:rFonts w:ascii="Symbol" w:hAnsi="Symbol" w:hint="default"/>
+      </w:rPr>
+    </w:lvl>
+    <w:lvl w:ilvl="7" w:tplc="0C0A0003" w:tentative="1">
+      <w:start w:val="1"/>
+      <w:numFmt w:val="bullet"/>
+      <w:lvlText w:val="o"/>
+      <w:lvlJc w:val="left"/>
+      <w:pPr>
+        <w:ind w:left="7560" w:hanging="360"/>
+      </w:pPr>
+      <w:rPr>
+        <w:rFonts w:ascii="Courier New" w:hAnsi="Courier New" w:cs="Courier New" w:hint="default"/>
+      </w:rPr>
+    </w:lvl>
+    <w:lvl w:ilvl="8" w:tplc="0C0A0005" w:tentative="1">
+      <w:start w:val="1"/>
+      <w:numFmt w:val="bullet"/>
+      <w:lvlText w:val=""/>
+      <w:lvlJc w:val="left"/>
+      <w:pPr>
+        <w:ind w:left="8280" w:hanging="360"/>
+      </w:pPr>
+      <w:rPr>
+        <w:rFonts w:ascii="Wingdings" w:hAnsi="Wingdings" w:hint="default"/>
+      </w:rPr>
+    </w:lvl>
+  </w:abstractNum>
+  <w:abstractNum w:abstractNumId="19" w15:restartNumberingAfterBreak="0">
+    <w:nsid w:val="755472A8"/>
+    <w:multiLevelType w:val="hybridMultilevel"/>
+    <w:tmpl w:val="BFEEAE78"/>
+    <w:lvl w:ilvl="0" w:tplc="0C0A0001">
+      <w:start w:val="1"/>
+      <w:numFmt w:val="bullet"/>
+      <w:lvlText w:val=""/>
+      <w:lvlJc w:val="left"/>
+      <w:pPr>
+        <w:ind w:left="1080" w:hanging="360"/>
+      </w:pPr>
+      <w:rPr>
+        <w:rFonts w:ascii="Symbol" w:hAnsi="Symbol" w:hint="default"/>
+      </w:rPr>
+    </w:lvl>
+    <w:lvl w:ilvl="1" w:tplc="0C0A0003" w:tentative="1">
+      <w:start w:val="1"/>
+      <w:numFmt w:val="bullet"/>
+      <w:lvlText w:val="o"/>
+      <w:lvlJc w:val="left"/>
+      <w:pPr>
+        <w:ind w:left="1800" w:hanging="360"/>
+      </w:pPr>
+      <w:rPr>
+        <w:rFonts w:ascii="Courier New" w:hAnsi="Courier New" w:cs="Courier New" w:hint="default"/>
+      </w:rPr>
+    </w:lvl>
+    <w:lvl w:ilvl="2" w:tplc="0C0A0005" w:tentative="1">
+      <w:start w:val="1"/>
+      <w:numFmt w:val="bullet"/>
+      <w:lvlText w:val=""/>
+      <w:lvlJc w:val="left"/>
+      <w:pPr>
+        <w:ind w:left="2520" w:hanging="360"/>
+      </w:pPr>
+      <w:rPr>
+        <w:rFonts w:ascii="Wingdings" w:hAnsi="Wingdings" w:hint="default"/>
+      </w:rPr>
+    </w:lvl>
+    <w:lvl w:ilvl="3" w:tplc="0C0A0001" w:tentative="1">
+      <w:start w:val="1"/>
+      <w:numFmt w:val="bullet"/>
+      <w:lvlText w:val=""/>
+      <w:lvlJc w:val="left"/>
+      <w:pPr>
+        <w:ind w:left="3240" w:hanging="360"/>
+      </w:pPr>
+      <w:rPr>
+        <w:rFonts w:ascii="Symbol" w:hAnsi="Symbol" w:hint="default"/>
+      </w:rPr>
+    </w:lvl>
+    <w:lvl w:ilvl="4" w:tplc="0C0A0003" w:tentative="1">
+      <w:start w:val="1"/>
+      <w:numFmt w:val="bullet"/>
+      <w:lvlText w:val="o"/>
+      <w:lvlJc w:val="left"/>
+      <w:pPr>
+        <w:ind w:left="3960" w:hanging="360"/>
+      </w:pPr>
+      <w:rPr>
+        <w:rFonts w:ascii="Courier New" w:hAnsi="Courier New" w:cs="Courier New" w:hint="default"/>
+      </w:rPr>
+    </w:lvl>
+    <w:lvl w:ilvl="5" w:tplc="0C0A0005" w:tentative="1">
+      <w:start w:val="1"/>
+      <w:numFmt w:val="bullet"/>
+      <w:lvlText w:val=""/>
+      <w:lvlJc w:val="left"/>
+      <w:pPr>
+        <w:ind w:left="4680" w:hanging="360"/>
+      </w:pPr>
+      <w:rPr>
+        <w:rFonts w:ascii="Wingdings" w:hAnsi="Wingdings" w:hint="default"/>
+      </w:rPr>
+    </w:lvl>
+    <w:lvl w:ilvl="6" w:tplc="0C0A0001" w:tentative="1">
+      <w:start w:val="1"/>
+      <w:numFmt w:val="bullet"/>
+      <w:lvlText w:val=""/>
+      <w:lvlJc w:val="left"/>
+      <w:pPr>
+        <w:ind w:left="5400" w:hanging="360"/>
+      </w:pPr>
+      <w:rPr>
+        <w:rFonts w:ascii="Symbol" w:hAnsi="Symbol" w:hint="default"/>
+      </w:rPr>
+    </w:lvl>
+    <w:lvl w:ilvl="7" w:tplc="0C0A0003" w:tentative="1">
+      <w:start w:val="1"/>
+      <w:numFmt w:val="bullet"/>
+      <w:lvlText w:val="o"/>
+      <w:lvlJc w:val="left"/>
+      <w:pPr>
+        <w:ind w:left="6120" w:hanging="360"/>
+      </w:pPr>
+      <w:rPr>
+        <w:rFonts w:ascii="Courier New" w:hAnsi="Courier New" w:cs="Courier New" w:hint="default"/>
+      </w:rPr>
+    </w:lvl>
+    <w:lvl w:ilvl="8" w:tplc="0C0A0005" w:tentative="1">
+      <w:start w:val="1"/>
+      <w:numFmt w:val="bullet"/>
+      <w:lvlText w:val=""/>
+      <w:lvlJc w:val="left"/>
+      <w:pPr>
+        <w:ind w:left="6840" w:hanging="360"/>
+      </w:pPr>
+      <w:rPr>
+        <w:rFonts w:ascii="Wingdings" w:hAnsi="Wingdings" w:hint="default"/>
+      </w:rPr>
+    </w:lvl>
+  </w:abstractNum>
+  <w:abstractNum w:abstractNumId="20" w15:restartNumberingAfterBreak="0">
+    <w:nsid w:val="780E04D7"/>
+    <w:multiLevelType w:val="hybridMultilevel"/>
+    <w:tmpl w:val="AAA02FD2"/>
+    <w:lvl w:ilvl="0" w:tplc="0C0A0001">
+      <w:start w:val="1"/>
+      <w:numFmt w:val="bullet"/>
+      <w:lvlText w:val=""/>
+      <w:lvlJc w:val="left"/>
+      <w:pPr>
+        <w:ind w:left="720" w:hanging="360"/>
+      </w:pPr>
+      <w:rPr>
+        <w:rFonts w:ascii="Symbol" w:hAnsi="Symbol" w:hint="default"/>
+      </w:rPr>
+    </w:lvl>
+    <w:lvl w:ilvl="1" w:tplc="0C0A0003" w:tentative="1">
+      <w:start w:val="1"/>
+      <w:numFmt w:val="bullet"/>
+      <w:lvlText w:val="o"/>
+      <w:lvlJc w:val="left"/>
+      <w:pPr>
+        <w:ind w:left="1440" w:hanging="360"/>
+      </w:pPr>
+      <w:rPr>
+        <w:rFonts w:ascii="Courier New" w:hAnsi="Courier New" w:cs="Courier New" w:hint="default"/>
+      </w:rPr>
+    </w:lvl>
+    <w:lvl w:ilvl="2" w:tplc="0C0A0005" w:tentative="1">
+      <w:start w:val="1"/>
+      <w:numFmt w:val="bullet"/>
+      <w:lvlText w:val=""/>
+      <w:lvlJc w:val="left"/>
+      <w:pPr>
+        <w:ind w:left="2160" w:hanging="360"/>
+      </w:pPr>
+      <w:rPr>
+        <w:rFonts w:ascii="Wingdings" w:hAnsi="Wingdings" w:hint="default"/>
+      </w:rPr>
+    </w:lvl>
+    <w:lvl w:ilvl="3" w:tplc="0C0A0001" w:tentative="1">
+      <w:start w:val="1"/>
+      <w:numFmt w:val="bullet"/>
+      <w:lvlText w:val=""/>
+      <w:lvlJc w:val="left"/>
+      <w:pPr>
+        <w:ind w:left="2880" w:hanging="360"/>
+      </w:pPr>
+      <w:rPr>
+        <w:rFonts w:ascii="Symbol" w:hAnsi="Symbol" w:hint="default"/>
+      </w:rPr>
+    </w:lvl>
+    <w:lvl w:ilvl="4" w:tplc="0C0A0003" w:tentative="1">
+      <w:start w:val="1"/>
+      <w:numFmt w:val="bullet"/>
+      <w:lvlText w:val="o"/>
+      <w:lvlJc w:val="left"/>
+      <w:pPr>
+        <w:ind w:left="3600" w:hanging="360"/>
+      </w:pPr>
+      <w:rPr>
+        <w:rFonts w:ascii="Courier New" w:hAnsi="Courier New" w:cs="Courier New" w:hint="default"/>
+      </w:rPr>
+    </w:lvl>
+    <w:lvl w:ilvl="5" w:tplc="0C0A0005" w:tentative="1">
+      <w:start w:val="1"/>
+      <w:numFmt w:val="bullet"/>
+      <w:lvlText w:val=""/>
+      <w:lvlJc w:val="left"/>
+      <w:pPr>
+        <w:ind w:left="4320" w:hanging="360"/>
+      </w:pPr>
+      <w:rPr>
+        <w:rFonts w:ascii="Wingdings" w:hAnsi="Wingdings" w:hint="default"/>
+      </w:rPr>
+    </w:lvl>
+    <w:lvl w:ilvl="6" w:tplc="0C0A0001" w:tentative="1">
+      <w:start w:val="1"/>
+      <w:numFmt w:val="bullet"/>
+      <w:lvlText w:val=""/>
+      <w:lvlJc w:val="left"/>
+      <w:pPr>
+        <w:ind w:left="5040" w:hanging="360"/>
+      </w:pPr>
+      <w:rPr>
+        <w:rFonts w:ascii="Symbol" w:hAnsi="Symbol" w:hint="default"/>
+      </w:rPr>
+    </w:lvl>
+    <w:lvl w:ilvl="7" w:tplc="0C0A0003" w:tentative="1">
+      <w:start w:val="1"/>
+      <w:numFmt w:val="bullet"/>
+      <w:lvlText w:val="o"/>
+      <w:lvlJc w:val="left"/>
+      <w:pPr>
+        <w:ind w:left="5760" w:hanging="360"/>
+      </w:pPr>
+      <w:rPr>
+        <w:rFonts w:ascii="Courier New" w:hAnsi="Courier New" w:cs="Courier New" w:hint="default"/>
+      </w:rPr>
+    </w:lvl>
+    <w:lvl w:ilvl="8" w:tplc="0C0A0005" w:tentative="1">
+      <w:start w:val="1"/>
+      <w:numFmt w:val="bullet"/>
+      <w:lvlText w:val=""/>
+      <w:lvlJc w:val="left"/>
+      <w:pPr>
+        <w:ind w:left="6480" w:hanging="360"/>
+      </w:pPr>
+      <w:rPr>
+        <w:rFonts w:ascii="Wingdings" w:hAnsi="Wingdings" w:hint="default"/>
+      </w:rPr>
+    </w:lvl>
+  </w:abstractNum>
+  <w:abstractNum w:abstractNumId="21" w15:restartNumberingAfterBreak="0">
+    <w:nsid w:val="79306B18"/>
+    <w:multiLevelType w:val="hybridMultilevel"/>
+    <w:tmpl w:val="B02AD490"/>
+    <w:lvl w:ilvl="0" w:tplc="0C0A0001">
+      <w:start w:val="1"/>
+      <w:numFmt w:val="bullet"/>
+      <w:lvlText w:val=""/>
+      <w:lvlJc w:val="left"/>
+      <w:pPr>
+        <w:ind w:left="1080" w:hanging="360"/>
+      </w:pPr>
+      <w:rPr>
+        <w:rFonts w:ascii="Symbol" w:hAnsi="Symbol" w:hint="default"/>
+      </w:rPr>
+    </w:lvl>
+    <w:lvl w:ilvl="1" w:tplc="0C0A0003" w:tentative="1">
+      <w:start w:val="1"/>
+      <w:numFmt w:val="bullet"/>
+      <w:lvlText w:val="o"/>
+      <w:lvlJc w:val="left"/>
+      <w:pPr>
+        <w:ind w:left="1800" w:hanging="360"/>
+      </w:pPr>
+      <w:rPr>
+        <w:rFonts w:ascii="Courier New" w:hAnsi="Courier New" w:cs="Courier New" w:hint="default"/>
+      </w:rPr>
+    </w:lvl>
+    <w:lvl w:ilvl="2" w:tplc="0C0A0005" w:tentative="1">
+      <w:start w:val="1"/>
+      <w:numFmt w:val="bullet"/>
+      <w:lvlText w:val=""/>
+      <w:lvlJc w:val="left"/>
+      <w:pPr>
+        <w:ind w:left="2520" w:hanging="360"/>
+      </w:pPr>
+      <w:rPr>
+        <w:rFonts w:ascii="Wingdings" w:hAnsi="Wingdings" w:hint="default"/>
+      </w:rPr>
+    </w:lvl>
+    <w:lvl w:ilvl="3" w:tplc="0C0A0001" w:tentative="1">
+      <w:start w:val="1"/>
+      <w:numFmt w:val="bullet"/>
+      <w:lvlText w:val=""/>
+      <w:lvlJc w:val="left"/>
+      <w:pPr>
+        <w:ind w:left="3240" w:hanging="360"/>
+      </w:pPr>
+      <w:rPr>
+        <w:rFonts w:ascii="Symbol" w:hAnsi="Symbol" w:hint="default"/>
+      </w:rPr>
+    </w:lvl>
+    <w:lvl w:ilvl="4" w:tplc="0C0A0003" w:tentative="1">
+      <w:start w:val="1"/>
+      <w:numFmt w:val="bullet"/>
+      <w:lvlText w:val="o"/>
+      <w:lvlJc w:val="left"/>
+      <w:pPr>
+        <w:ind w:left="3960" w:hanging="360"/>
+      </w:pPr>
+      <w:rPr>
+        <w:rFonts w:ascii="Courier New" w:hAnsi="Courier New" w:cs="Courier New" w:hint="default"/>
+      </w:rPr>
+    </w:lvl>
+    <w:lvl w:ilvl="5" w:tplc="0C0A0005" w:tentative="1">
+      <w:start w:val="1"/>
+      <w:numFmt w:val="bullet"/>
+      <w:lvlText w:val=""/>
+      <w:lvlJc w:val="left"/>
+      <w:pPr>
+        <w:ind w:left="4680" w:hanging="360"/>
+      </w:pPr>
+      <w:rPr>
+        <w:rFonts w:ascii="Wingdings" w:hAnsi="Wingdings" w:hint="default"/>
+      </w:rPr>
+    </w:lvl>
+    <w:lvl w:ilvl="6" w:tplc="0C0A0001" w:tentative="1">
+      <w:start w:val="1"/>
+      <w:numFmt w:val="bullet"/>
+      <w:lvlText w:val=""/>
+      <w:lvlJc w:val="left"/>
+      <w:pPr>
+        <w:ind w:left="5400" w:hanging="360"/>
+      </w:pPr>
+      <w:rPr>
+        <w:rFonts w:ascii="Symbol" w:hAnsi="Symbol" w:hint="default"/>
+      </w:rPr>
+    </w:lvl>
+    <w:lvl w:ilvl="7" w:tplc="0C0A0003" w:tentative="1">
+      <w:start w:val="1"/>
+      <w:numFmt w:val="bullet"/>
+      <w:lvlText w:val="o"/>
+      <w:lvlJc w:val="left"/>
+      <w:pPr>
+        <w:ind w:left="6120" w:hanging="360"/>
+      </w:pPr>
+      <w:rPr>
+        <w:rFonts w:ascii="Courier New" w:hAnsi="Courier New" w:cs="Courier New" w:hint="default"/>
+      </w:rPr>
+    </w:lvl>
+    <w:lvl w:ilvl="8" w:tplc="0C0A0005" w:tentative="1">
+      <w:start w:val="1"/>
+      <w:numFmt w:val="bullet"/>
+      <w:lvlText w:val=""/>
+      <w:lvlJc w:val="left"/>
+      <w:pPr>
         <w:ind w:left="6840" w:hanging="360"/>
       </w:pPr>
       <w:rPr>
@@ -46058,46 +47025,70 @@
     </w:lvl>
   </w:abstractNum>
   <w:num w:numId="1">
+    <w:abstractNumId w:val="20"/>
+  </w:num>
+  <w:num w:numId="2">
     <w:abstractNumId w:val="12"/>
   </w:num>
-  <w:num w:numId="2">
+  <w:num w:numId="3">
+    <w:abstractNumId w:val="3"/>
+  </w:num>
+  <w:num w:numId="4">
+    <w:abstractNumId w:val="10"/>
+  </w:num>
+  <w:num w:numId="5">
+    <w:abstractNumId w:val="8"/>
+  </w:num>
+  <w:num w:numId="6">
+    <w:abstractNumId w:val="4"/>
+  </w:num>
+  <w:num w:numId="7">
+    <w:abstractNumId w:val="14"/>
+  </w:num>
+  <w:num w:numId="8">
+    <w:abstractNumId w:val="6"/>
+  </w:num>
+  <w:num w:numId="9">
     <w:abstractNumId w:val="9"/>
   </w:num>
-  <w:num w:numId="3">
-    <w:abstractNumId w:val="1"/>
+  <w:num w:numId="10">
+    <w:abstractNumId w:val="13"/>
   </w:num>
-  <w:num w:numId="4">
-    <w:abstractNumId w:val="7"/>
-  </w:num>
-  <w:num w:numId="5">
-    <w:abstractNumId w:val="5"/>
-  </w:num>
-  <w:num w:numId="6">
-    <w:abstractNumId w:val="2"/>
-  </w:num>
-  <w:num w:numId="7">
+  <w:num w:numId="11">
     <w:abstractNumId w:val="11"/>
   </w:num>
-  <w:num w:numId="8">
-    <w:abstractNumId w:val="3"/>
-  </w:num>
-  <w:num w:numId="9">
-    <w:abstractNumId w:val="6"/>
-  </w:num>
-  <w:num w:numId="10">
-    <w:abstractNumId w:val="10"/>
-  </w:num>
-  <w:num w:numId="11">
-    <w:abstractNumId w:val="8"/>
-  </w:num>
   <w:num w:numId="12">
-    <w:abstractNumId w:val="13"/>
+    <w:abstractNumId w:val="21"/>
   </w:num>
   <w:num w:numId="13">
     <w:abstractNumId w:val="0"/>
   </w:num>
   <w:num w:numId="14">
-    <w:abstractNumId w:val="4"/>
+    <w:abstractNumId w:val="7"/>
+  </w:num>
+  <w:num w:numId="15">
+    <w:abstractNumId w:val="17"/>
+  </w:num>
+  <w:num w:numId="16">
+    <w:abstractNumId w:val="2"/>
+  </w:num>
+  <w:num w:numId="17">
+    <w:abstractNumId w:val="18"/>
+  </w:num>
+  <w:num w:numId="18">
+    <w:abstractNumId w:val="5"/>
+  </w:num>
+  <w:num w:numId="19">
+    <w:abstractNumId w:val="15"/>
+  </w:num>
+  <w:num w:numId="20">
+    <w:abstractNumId w:val="1"/>
+  </w:num>
+  <w:num w:numId="21">
+    <w:abstractNumId w:val="19"/>
+  </w:num>
+  <w:num w:numId="22">
+    <w:abstractNumId w:val="16"/>
   </w:num>
   <w:numIdMacAtCleanup w:val="9"/>
 </w:numbering>
@@ -47992,6 +48983,7 @@
     <w:rsid w:val="00684424"/>
     <w:rsid w:val="006A6D69"/>
     <w:rsid w:val="00734B22"/>
+    <w:rsid w:val="007571C9"/>
     <w:rsid w:val="00760466"/>
     <w:rsid w:val="0078114E"/>
     <w:rsid w:val="00783082"/>
@@ -48845,7 +49837,7 @@
 </file>
 
 <file path=customXml/itemProps2.xml><?xml version="1.0" encoding="utf-8"?>
-<ds:datastoreItem xmlns:ds="http://schemas.openxmlformats.org/officeDocument/2006/customXml" ds:itemID="{83030C91-403E-40DE-89C3-65D20A0058E6}">
+<ds:datastoreItem xmlns:ds="http://schemas.openxmlformats.org/officeDocument/2006/customXml" ds:itemID="{74BE525B-0704-4230-9878-AE555396D811}">
   <ds:schemaRefs>
     <ds:schemaRef ds:uri="http://schemas.openxmlformats.org/officeDocument/2006/bibliography"/>
   </ds:schemaRefs>

</xml_diff>

<commit_message>
Plan de implementación y manual de instalación
</commit_message>
<xml_diff>
--- a/Documentacion/UT_7_2024_2025.docx
+++ b/Documentacion/UT_7_2024_2025.docx
@@ -178,6 +178,7 @@
               </w:placeholder>
               <w15:appearance w15:val="hidden"/>
             </w:sdtPr>
+            <w:sdtEndPr/>
             <w:sdtContent>
               <w:p>
                 <w:pPr>
@@ -393,6 +394,7 @@
                 <w15:appearance w15:val="hidden"/>
                 <w:text w:multiLine="1"/>
               </w:sdtPr>
+              <w:sdtEndPr/>
               <w:sdtContent>
                 <w:r>
                   <w:rPr>
@@ -732,6 +734,7 @@
           <w:docPartUnique/>
         </w:docPartObj>
       </w:sdtPr>
+      <w:sdtEndPr/>
       <w:sdtContent>
         <w:p>
           <w:pPr>
@@ -6168,6 +6171,7 @@
         </w:placeholder>
         <w15:appearance w15:val="hidden"/>
       </w:sdtPr>
+      <w:sdtEndPr/>
       <w:sdtContent>
         <w:p>
           <w:pPr>
@@ -6620,6 +6624,7 @@
         </w:placeholder>
         <w15:appearance w15:val="hidden"/>
       </w:sdtPr>
+      <w:sdtEndPr/>
       <w:sdtContent>
         <w:p/>
         <w:p>
@@ -7435,7 +7440,7 @@
                 <v:path o:extrusionok="f" gradientshapeok="t" o:connecttype="rect"/>
                 <o:lock v:ext="edit" aspectratio="t"/>
               </v:shapetype>
-              <v:shape id="_x0000_i1025" type="#_x0000_t75" style="width:465pt;height:204.75pt">
+              <v:shape id="_x0000_i1025" type="#_x0000_t75" style="width:464.4pt;height:205.2pt">
                 <v:imagedata r:id="rId13" o:title="SecuencaciónFasesProyecto"/>
               </v:shape>
             </w:pict>
@@ -7462,7 +7467,7 @@
           </w:pPr>
           <w:r>
             <w:pict w14:anchorId="5636CC0F">
-              <v:shape id="_x0000_i1026" type="#_x0000_t75" style="width:384pt;height:241.5pt">
+              <v:shape id="_x0000_i1026" type="#_x0000_t75" style="width:384pt;height:241.2pt">
                 <v:imagedata r:id="rId14" o:title="PlanificaciónRecursosProyectos"/>
               </v:shape>
             </w:pict>
@@ -11986,7 +11991,7 @@
       </w:pPr>
       <w:r>
         <w:pict w14:anchorId="119133E6">
-          <v:shape id="_x0000_i1027" type="#_x0000_t75" style="width:252.75pt;height:468.75pt">
+          <v:shape id="_x0000_i1027" type="#_x0000_t75" style="width:253.2pt;height:469.2pt">
             <v:imagedata r:id="rId22" o:title="DA_Login"/>
           </v:shape>
         </w:pict>
@@ -12081,7 +12086,7 @@
     <w:p>
       <w:r>
         <w:pict w14:anchorId="3BC76BB7">
-          <v:shape id="_x0000_i1028" type="#_x0000_t75" style="width:2in;height:523.5pt">
+          <v:shape id="_x0000_i1028" type="#_x0000_t75" style="width:2in;height:523.2pt">
             <v:imagedata r:id="rId24" o:title="DA_VaciarBBDD"/>
           </v:shape>
         </w:pict>
@@ -12094,7 +12099,7 @@
       </w:r>
       <w:r>
         <w:pict w14:anchorId="6C7C2997">
-          <v:shape id="_x0000_i1029" type="#_x0000_t75" style="width:144.75pt;height:430.5pt">
+          <v:shape id="_x0000_i1029" type="#_x0000_t75" style="width:145.2pt;height:430.8pt">
             <v:imagedata r:id="rId25" o:title="DA_GestiónErrores"/>
           </v:shape>
         </w:pict>
@@ -35801,16 +35806,16 @@
         </w:numPr>
       </w:pPr>
       <w:r>
-        <w:t xml:space="preserve">Implementación de la aplicación en Python con POO y conexión </w:t>
-      </w:r>
-      <w:r>
-        <w:t xml:space="preserve">con </w:t>
+        <w:t xml:space="preserve">Implementación de la aplicación en Python con POO y conexión a la base de datos </w:t>
       </w:r>
       <w:proofErr w:type="spellStart"/>
       <w:r>
         <w:t>MySQL</w:t>
       </w:r>
       <w:proofErr w:type="spellEnd"/>
+      <w:r>
+        <w:t xml:space="preserve"> alojada en XAMPP. </w:t>
+      </w:r>
     </w:p>
     <w:p>
       <w:pPr>
@@ -35953,287 +35958,543 @@
       <w:bookmarkEnd w:id="155"/>
     </w:p>
     <w:p>
-      <w:pPr>
-        <w:rPr>
-          <w:color w:val="FF0000"/>
-        </w:rPr>
-      </w:pPr>
-      <w:r>
-        <w:rPr>
-          <w:color w:val="FF0000"/>
-        </w:rPr>
-        <w:t>Rellenar: Esto es un ejemplo NO USAR, hacer el nuestro propio en función de mi proyecto</w:t>
+      <w:r>
+        <w:t>En cuanto a la implantación del software, tendremos en cuenta que se minimizarán las molestias que se puedan realizar al personal existente, por lo que la migración se realizará de noche, estando disponible al día siguiente en el que se realizarán pruebas con el personal y una vez la formación del mismo haya sido terminada. A continuación, el plan de instalació</w:t>
+      </w:r>
+      <w:r>
+        <w:t>n</w:t>
+      </w:r>
+      <w:r>
+        <w:t xml:space="preserve"> para</w:t>
+      </w:r>
+      <w:r>
+        <w:t xml:space="preserve"> el sistema es el siguiente:</w:t>
       </w:r>
     </w:p>
     <w:p/>
     <w:p>
-      <w:r>
-        <w:tab/>
-        <w:t>En cuanto a la implantación del software, tendremos en cuenta que se minimizarán las molestias que se puedan realizar al personal existente, por lo que la migración se realizará de noche, estando disponible al día siguiente en el que se realizarán pruebas con el personal y una vez la formación del mismo haya sido terminada. A continuación, el plan de instalació</w:t>
-      </w:r>
-      <w:r>
-        <w:t>n</w:t>
-      </w:r>
-      <w:r>
-        <w:t xml:space="preserve"> para</w:t>
-      </w:r>
-      <w:r>
-        <w:t xml:space="preserve"> el sistema.</w:t>
-      </w:r>
-    </w:p>
-    <w:p/>
-    <w:p>
-      <w:pPr>
-        <w:tabs>
-          <w:tab w:val="left" w:pos="284"/>
-          <w:tab w:val="left" w:pos="2268"/>
-          <w:tab w:val="left" w:pos="4820"/>
-          <w:tab w:val="left" w:pos="7230"/>
-        </w:tabs>
+      <w:pPr>
+        <w:pStyle w:val="Prrafodelista"/>
+        <w:numPr>
+          <w:ilvl w:val="0"/>
+          <w:numId w:val="23"/>
+        </w:numPr>
+      </w:pPr>
+      <w:r>
         <w:rPr>
           <w:b/>
         </w:rPr>
-      </w:pPr>
-      <w:r>
-        <w:rPr>
-          <w:b/>
-        </w:rPr>
-        <w:tab/>
-        <w:t>Instalación</w:t>
-      </w:r>
-      <w:r>
-        <w:rPr>
-          <w:b/>
-        </w:rPr>
-        <w:tab/>
-        <w:t>Configuración</w:t>
-      </w:r>
-      <w:r>
-        <w:rPr>
-          <w:b/>
-        </w:rPr>
-        <w:tab/>
-        <w:t>Pruebas</w:t>
-      </w:r>
-      <w:r>
-        <w:rPr>
-          <w:b/>
-        </w:rPr>
-        <w:tab/>
-      </w:r>
-      <w:r>
-        <w:rPr>
-          <w:b/>
-        </w:rPr>
-        <w:t>Migración</w:t>
+        <w:t>Instalación (3 días):</w:t>
       </w:r>
     </w:p>
     <w:p>
       <w:pPr>
-        <w:tabs>
-          <w:tab w:val="left" w:pos="284"/>
-          <w:tab w:val="left" w:pos="2268"/>
-          <w:tab w:val="left" w:pos="4820"/>
-          <w:tab w:val="left" w:pos="7230"/>
-        </w:tabs>
-        <w:rPr>
-          <w:b/>
-        </w:rPr>
-      </w:pPr>
-      <w:r>
-        <w:rPr>
-          <w:b/>
-        </w:rPr>
-        <w:tab/>
-        <w:t>Software</w:t>
-      </w:r>
-      <w:r>
-        <w:rPr>
-          <w:b/>
-        </w:rPr>
-        <w:tab/>
-      </w:r>
-      <w:proofErr w:type="spellStart"/>
-      <w:r>
-        <w:rPr>
-          <w:b/>
-        </w:rPr>
-        <w:t>Software</w:t>
-      </w:r>
-      <w:proofErr w:type="spellEnd"/>
-      <w:r>
-        <w:rPr>
-          <w:b/>
-        </w:rPr>
-        <w:tab/>
-        <w:t>Formación</w:t>
+        <w:pStyle w:val="Prrafodelista"/>
+        <w:numPr>
+          <w:ilvl w:val="1"/>
+          <w:numId w:val="23"/>
+        </w:numPr>
+        <w:rPr>
+          <w:rFonts w:cstheme="minorHAnsi"/>
+        </w:rPr>
+      </w:pPr>
+      <w:r>
+        <w:rPr>
+          <w:rFonts w:eastAsia="Times New Roman" w:cstheme="minorHAnsi"/>
+          <w:lang w:eastAsia="es-ES"/>
+        </w:rPr>
+        <w:t xml:space="preserve">Instalar XAMPP en el ordenador del instituto </w:t>
       </w:r>
     </w:p>
     <w:p>
       <w:pPr>
-        <w:tabs>
-          <w:tab w:val="left" w:pos="284"/>
-          <w:tab w:val="left" w:pos="2268"/>
-          <w:tab w:val="left" w:pos="4820"/>
-          <w:tab w:val="left" w:pos="7230"/>
-        </w:tabs>
-      </w:pPr>
-      <w:r>
-        <w:tab/>
-      </w:r>
-      <w:r>
-        <w:t>2</w:t>
-      </w:r>
-      <w:r>
-        <w:t>2</w:t>
-      </w:r>
-      <w:r>
-        <w:t xml:space="preserve"> día</w:t>
-      </w:r>
-      <w:r>
-        <w:tab/>
-      </w:r>
-      <w:r>
-        <w:t>3</w:t>
-      </w:r>
-      <w:r>
-        <w:t>3</w:t>
-      </w:r>
-      <w:r>
-        <w:t xml:space="preserve"> día</w:t>
-      </w:r>
-      <w:bookmarkStart w:id="156" w:name="_GoBack"/>
-      <w:bookmarkEnd w:id="156"/>
-      <w:r>
-        <w:tab/>
-      </w:r>
-      <w:r>
-        <w:t>5</w:t>
-      </w:r>
-      <w:r>
-        <w:t>5</w:t>
-      </w:r>
-      <w:r>
-        <w:t xml:space="preserve"> días</w:t>
-      </w:r>
-      <w:r>
-        <w:tab/>
-      </w:r>
-      <w:r>
-        <w:t>5</w:t>
-      </w:r>
-      <w:r>
-        <w:t>5</w:t>
-      </w:r>
-      <w:r>
-        <w:t xml:space="preserve"> días</w:t>
+        <w:pStyle w:val="Prrafodelista"/>
+        <w:numPr>
+          <w:ilvl w:val="1"/>
+          <w:numId w:val="23"/>
+        </w:numPr>
+        <w:rPr>
+          <w:rFonts w:cstheme="minorHAnsi"/>
+        </w:rPr>
+      </w:pPr>
+      <w:r>
+        <w:rPr>
+          <w:rFonts w:eastAsia="Times New Roman" w:cstheme="minorHAnsi"/>
+          <w:lang w:eastAsia="es-ES"/>
+        </w:rPr>
+        <w:t xml:space="preserve">Crear la base de datos </w:t>
+      </w:r>
+      <w:proofErr w:type="spellStart"/>
+      <w:r>
+        <w:rPr>
+          <w:rFonts w:eastAsia="Times New Roman" w:cstheme="minorHAnsi"/>
+          <w:lang w:eastAsia="es-ES"/>
+        </w:rPr>
+        <w:t>gestion_prestamos_libros</w:t>
+      </w:r>
+      <w:proofErr w:type="spellEnd"/>
+      <w:r>
+        <w:rPr>
+          <w:rFonts w:eastAsia="Times New Roman" w:cstheme="minorHAnsi"/>
+          <w:lang w:eastAsia="es-ES"/>
+        </w:rPr>
+        <w:t xml:space="preserve"> </w:t>
       </w:r>
     </w:p>
     <w:p>
       <w:pPr>
-        <w:tabs>
-          <w:tab w:val="left" w:pos="284"/>
-          <w:tab w:val="left" w:pos="2268"/>
-          <w:tab w:val="left" w:pos="4820"/>
-          <w:tab w:val="left" w:pos="7230"/>
-        </w:tabs>
-      </w:pPr>
-      <w:r>
-        <w:tab/>
-      </w:r>
-      <w:r>
-        <w:t>m</w:t>
-      </w:r>
-      <w:r>
-        <w:t>añana</w:t>
-      </w:r>
-      <w:r>
-        <w:tab/>
-      </w:r>
-      <w:proofErr w:type="spellStart"/>
-      <w:r>
-        <w:t>mañana</w:t>
-      </w:r>
-      <w:proofErr w:type="spellEnd"/>
-      <w:r>
-        <w:tab/>
-      </w:r>
-      <w:proofErr w:type="spellStart"/>
-      <w:r>
-        <w:t>mañana</w:t>
-      </w:r>
-      <w:proofErr w:type="spellEnd"/>
-      <w:r>
-        <w:tab/>
-        <w:t xml:space="preserve">noche </w:t>
-      </w:r>
-      <w:r>
-        <w:t>–</w:t>
-      </w:r>
-      <w:r>
-        <w:t xml:space="preserve"> mañana</w:t>
+        <w:pStyle w:val="Prrafodelista"/>
+        <w:numPr>
+          <w:ilvl w:val="1"/>
+          <w:numId w:val="23"/>
+        </w:numPr>
+        <w:rPr>
+          <w:rFonts w:cstheme="minorHAnsi"/>
+        </w:rPr>
+      </w:pPr>
+      <w:r>
+        <w:rPr>
+          <w:rFonts w:eastAsia="Times New Roman" w:cstheme="minorHAnsi"/>
+          <w:lang w:eastAsia="es-ES"/>
+        </w:rPr>
+        <w:t>Ejecutar el SQL de creación de tablas</w:t>
       </w:r>
     </w:p>
     <w:p>
       <w:pPr>
-        <w:tabs>
-          <w:tab w:val="left" w:pos="284"/>
-          <w:tab w:val="left" w:pos="2268"/>
-          <w:tab w:val="left" w:pos="4820"/>
-          <w:tab w:val="left" w:pos="7230"/>
-        </w:tabs>
-      </w:pPr>
-      <w:r>
-        <w:tab/>
-      </w:r>
-      <w:r>
-        <w:tab/>
-        <w:t>Pruebas de sistema</w:t>
-      </w:r>
-      <w:r>
-        <w:tab/>
-        <w:t>Pruebas de usuario</w:t>
-      </w:r>
-      <w:r>
-        <w:tab/>
-        <w:t>Pruebas de funcionamiento</w:t>
-      </w:r>
+        <w:pStyle w:val="Prrafodelista"/>
+        <w:ind w:left="1440"/>
+      </w:pPr>
     </w:p>
     <w:p>
       <w:pPr>
-        <w:tabs>
-          <w:tab w:val="left" w:pos="284"/>
-          <w:tab w:val="left" w:pos="2268"/>
-          <w:tab w:val="left" w:pos="4820"/>
-          <w:tab w:val="left" w:pos="7230"/>
-        </w:tabs>
-      </w:pPr>
-      <w:r>
-        <w:tab/>
-      </w:r>
-      <w:r>
-        <w:tab/>
-        <w:t>Instalador</w:t>
-      </w:r>
-      <w:r>
-        <w:tab/>
+        <w:pStyle w:val="Prrafodelista"/>
+        <w:numPr>
+          <w:ilvl w:val="0"/>
+          <w:numId w:val="23"/>
+        </w:numPr>
+      </w:pPr>
+      <w:r>
+        <w:rPr>
+          <w:b/>
+        </w:rPr>
+        <w:t>Configuración (4 días):</w:t>
+      </w:r>
+    </w:p>
+    <w:p>
+      <w:pPr>
+        <w:pStyle w:val="Prrafodelista"/>
+        <w:numPr>
+          <w:ilvl w:val="1"/>
+          <w:numId w:val="23"/>
+        </w:numPr>
+        <w:spacing w:line="240" w:lineRule="auto"/>
+        <w:jc w:val="left"/>
+        <w:rPr>
+          <w:rFonts w:eastAsia="Times New Roman" w:cstheme="minorHAnsi"/>
+          <w:lang w:eastAsia="es-ES"/>
+        </w:rPr>
+      </w:pPr>
+      <w:r>
+        <w:rPr>
+          <w:rFonts w:eastAsia="Times New Roman" w:cstheme="minorHAnsi"/>
+          <w:lang w:eastAsia="es-ES"/>
+        </w:rPr>
+        <w:t xml:space="preserve"> Instalar Python 3.13 marcando la opción </w:t>
+      </w:r>
+      <w:r>
+        <w:rPr>
+          <w:rFonts w:eastAsia="Times New Roman" w:cstheme="minorHAnsi"/>
+          <w:b/>
+          <w:bCs/>
+          <w:lang w:eastAsia="es-ES"/>
+        </w:rPr>
+        <w:t>"</w:t>
       </w:r>
       <w:proofErr w:type="spellStart"/>
       <w:r>
-        <w:t>Instalador</w:t>
+        <w:rPr>
+          <w:rFonts w:eastAsia="Times New Roman" w:cstheme="minorHAnsi"/>
+          <w:b/>
+          <w:bCs/>
+          <w:lang w:eastAsia="es-ES"/>
+        </w:rPr>
+        <w:t>Add</w:t>
       </w:r>
       <w:proofErr w:type="spellEnd"/>
       <w:r>
-        <w:tab/>
-        <w:t>Usuario</w:t>
-      </w:r>
-      <w:r>
-        <w:tab/>
-      </w:r>
-      <w:r>
-        <w:tab/>
-      </w:r>
-      <w:r>
+        <w:rPr>
+          <w:rFonts w:eastAsia="Times New Roman" w:cstheme="minorHAnsi"/>
+          <w:b/>
+          <w:bCs/>
+          <w:lang w:eastAsia="es-ES"/>
+        </w:rPr>
+        <w:t xml:space="preserve"> Python to PATH"</w:t>
+      </w:r>
+      <w:r>
+        <w:rPr>
+          <w:rFonts w:eastAsia="Times New Roman" w:cstheme="minorHAnsi"/>
+          <w:lang w:eastAsia="es-ES"/>
+        </w:rPr>
+        <w:t xml:space="preserve"> </w:t>
+      </w:r>
+    </w:p>
+    <w:p>
+      <w:pPr>
+        <w:pStyle w:val="Prrafodelista"/>
+        <w:numPr>
+          <w:ilvl w:val="1"/>
+          <w:numId w:val="23"/>
+        </w:numPr>
+        <w:spacing w:line="240" w:lineRule="auto"/>
+        <w:jc w:val="left"/>
+        <w:rPr>
+          <w:rFonts w:eastAsia="Times New Roman" w:cstheme="minorHAnsi"/>
+          <w:lang w:eastAsia="es-ES"/>
+        </w:rPr>
+      </w:pPr>
+      <w:r>
+        <w:rPr>
+          <w:rFonts w:eastAsia="Times New Roman" w:cstheme="minorHAnsi"/>
+          <w:lang w:eastAsia="es-ES"/>
+        </w:rPr>
+        <w:t xml:space="preserve"> Instalar la librería </w:t>
+      </w:r>
+      <w:proofErr w:type="spellStart"/>
+      <w:r>
+        <w:rPr>
+          <w:rFonts w:eastAsia="Times New Roman" w:cstheme="minorHAnsi"/>
+          <w:lang w:eastAsia="es-ES"/>
+        </w:rPr>
+        <w:t>mysql-connector-python</w:t>
+      </w:r>
+      <w:proofErr w:type="spellEnd"/>
+      <w:r>
+        <w:rPr>
+          <w:rFonts w:eastAsia="Times New Roman" w:cstheme="minorHAnsi"/>
+          <w:lang w:eastAsia="es-ES"/>
+        </w:rPr>
+        <w:t xml:space="preserve"> </w:t>
+      </w:r>
+    </w:p>
+    <w:p>
+      <w:pPr>
+        <w:pStyle w:val="Prrafodelista"/>
+        <w:numPr>
+          <w:ilvl w:val="1"/>
+          <w:numId w:val="23"/>
+        </w:numPr>
+        <w:spacing w:line="240" w:lineRule="auto"/>
+        <w:jc w:val="left"/>
+        <w:rPr>
+          <w:rFonts w:eastAsia="Times New Roman" w:cstheme="minorHAnsi"/>
+          <w:lang w:eastAsia="es-ES"/>
+        </w:rPr>
+      </w:pPr>
+      <w:r>
+        <w:rPr>
+          <w:rFonts w:eastAsia="Times New Roman" w:cstheme="minorHAnsi"/>
+          <w:lang w:eastAsia="es-ES"/>
+        </w:rPr>
+        <w:t xml:space="preserve">Copiar la aplicación en el ordenador del instituto </w:t>
+      </w:r>
+    </w:p>
+    <w:p>
+      <w:pPr>
+        <w:pStyle w:val="Prrafodelista"/>
+        <w:numPr>
+          <w:ilvl w:val="1"/>
+          <w:numId w:val="23"/>
+        </w:numPr>
+        <w:spacing w:line="240" w:lineRule="auto"/>
+        <w:jc w:val="left"/>
+        <w:rPr>
+          <w:rFonts w:eastAsia="Times New Roman" w:cstheme="minorHAnsi"/>
+          <w:lang w:eastAsia="es-ES"/>
+        </w:rPr>
+      </w:pPr>
+      <w:r>
+        <w:rPr>
+          <w:rFonts w:eastAsia="Times New Roman" w:cstheme="minorHAnsi"/>
+          <w:lang w:eastAsia="es-ES"/>
+        </w:rPr>
+        <w:t>Configurar el fichero configuración_base_datos.py con los datos de conexión</w:t>
+      </w:r>
+    </w:p>
+    <w:p>
+      <w:pPr>
+        <w:pStyle w:val="Prrafodelista"/>
+        <w:spacing w:line="240" w:lineRule="auto"/>
+        <w:ind w:left="1440"/>
+        <w:jc w:val="left"/>
+        <w:rPr>
+          <w:rFonts w:ascii="Times New Roman" w:eastAsia="Times New Roman" w:hAnsi="Times New Roman" w:cs="Times New Roman"/>
+          <w:lang w:eastAsia="es-ES"/>
+        </w:rPr>
+      </w:pPr>
+    </w:p>
+    <w:p>
+      <w:pPr>
+        <w:pStyle w:val="Prrafodelista"/>
+        <w:numPr>
+          <w:ilvl w:val="0"/>
+          <w:numId w:val="23"/>
+        </w:numPr>
+      </w:pPr>
+      <w:r>
+        <w:rPr>
+          <w:b/>
+        </w:rPr>
+        <w:t>Pruebas (1 semana):</w:t>
+      </w:r>
+    </w:p>
+    <w:p>
+      <w:pPr>
+        <w:pStyle w:val="Prrafodelista"/>
+        <w:numPr>
+          <w:ilvl w:val="1"/>
+          <w:numId w:val="23"/>
+        </w:numPr>
+        <w:rPr>
+          <w:rFonts w:cstheme="minorHAnsi"/>
+        </w:rPr>
+      </w:pPr>
+      <w:r>
+        <w:rPr>
+          <w:rFonts w:eastAsia="Times New Roman" w:cstheme="minorHAnsi"/>
+          <w:lang w:eastAsia="es-ES"/>
+        </w:rPr>
+        <w:t xml:space="preserve">Verificar la conexión a la base de datos </w:t>
+      </w:r>
+    </w:p>
+    <w:p>
+      <w:pPr>
+        <w:pStyle w:val="Prrafodelista"/>
+        <w:numPr>
+          <w:ilvl w:val="1"/>
+          <w:numId w:val="23"/>
+        </w:numPr>
+        <w:rPr>
+          <w:rFonts w:cstheme="minorHAnsi"/>
+        </w:rPr>
+      </w:pPr>
+      <w:r>
+        <w:rPr>
+          <w:rFonts w:eastAsia="Times New Roman" w:cstheme="minorHAnsi"/>
+          <w:lang w:eastAsia="es-ES"/>
+        </w:rPr>
+        <w:t xml:space="preserve">Ejecutar la batería de pruebas </w:t>
+      </w:r>
+    </w:p>
+    <w:p>
+      <w:pPr>
+        <w:pStyle w:val="Prrafodelista"/>
+        <w:numPr>
+          <w:ilvl w:val="1"/>
+          <w:numId w:val="23"/>
+        </w:numPr>
+        <w:rPr>
+          <w:rFonts w:cstheme="minorHAnsi"/>
+        </w:rPr>
+      </w:pPr>
+      <w:r>
+        <w:rPr>
+          <w:rFonts w:eastAsia="Times New Roman" w:cstheme="minorHAnsi"/>
+          <w:lang w:eastAsia="es-ES"/>
+        </w:rPr>
+        <w:t>Corregir posibles incidencias</w:t>
+      </w:r>
+    </w:p>
+    <w:p>
+      <w:pPr>
+        <w:pStyle w:val="Prrafodelista"/>
+      </w:pPr>
+    </w:p>
+    <w:p>
+      <w:pPr>
+        <w:pStyle w:val="Prrafodelista"/>
+        <w:numPr>
+          <w:ilvl w:val="0"/>
+          <w:numId w:val="23"/>
+        </w:numPr>
+      </w:pPr>
+      <w:r>
+        <w:rPr>
+          <w:b/>
+        </w:rPr>
+        <w:t>Formación (3 días):</w:t>
+      </w:r>
+    </w:p>
+    <w:p>
+      <w:pPr>
+        <w:pStyle w:val="Prrafodelista"/>
+        <w:numPr>
+          <w:ilvl w:val="1"/>
+          <w:numId w:val="23"/>
+        </w:numPr>
+        <w:spacing w:line="240" w:lineRule="auto"/>
+        <w:jc w:val="left"/>
+        <w:rPr>
+          <w:rFonts w:eastAsia="Times New Roman" w:cstheme="minorHAnsi"/>
+          <w:lang w:eastAsia="es-ES"/>
+        </w:rPr>
+      </w:pPr>
+      <w:r>
+        <w:rPr>
+          <w:rFonts w:eastAsia="Times New Roman" w:cstheme="minorHAnsi"/>
+          <w:lang w:eastAsia="es-ES"/>
+        </w:rPr>
+        <w:t xml:space="preserve">Explicar al personal de secretaría el funcionamiento de la aplicación </w:t>
+      </w:r>
+    </w:p>
+    <w:p>
+      <w:pPr>
+        <w:pStyle w:val="Prrafodelista"/>
+        <w:numPr>
+          <w:ilvl w:val="1"/>
+          <w:numId w:val="23"/>
+        </w:numPr>
+        <w:spacing w:line="240" w:lineRule="auto"/>
+        <w:jc w:val="left"/>
+        <w:rPr>
+          <w:rFonts w:eastAsia="Times New Roman" w:cstheme="minorHAnsi"/>
+          <w:lang w:eastAsia="es-ES"/>
+        </w:rPr>
+      </w:pPr>
+      <w:r>
+        <w:rPr>
+          <w:rFonts w:eastAsia="Times New Roman" w:cstheme="minorHAnsi"/>
+          <w:lang w:eastAsia="es-ES"/>
+        </w:rPr>
+        <w:t>Entregar el manual de usuario</w:t>
+      </w:r>
+    </w:p>
+    <w:p>
+      <w:pPr>
+        <w:pStyle w:val="Prrafodelista"/>
+        <w:spacing w:line="240" w:lineRule="auto"/>
+        <w:ind w:left="1440"/>
+        <w:jc w:val="left"/>
+        <w:rPr>
+          <w:rFonts w:eastAsia="Times New Roman" w:cstheme="minorHAnsi"/>
+          <w:lang w:eastAsia="es-ES"/>
+        </w:rPr>
+      </w:pPr>
+    </w:p>
+    <w:p>
+      <w:pPr>
+        <w:pStyle w:val="Prrafodelista"/>
+        <w:numPr>
+          <w:ilvl w:val="0"/>
+          <w:numId w:val="23"/>
+        </w:numPr>
+        <w:spacing w:line="240" w:lineRule="auto"/>
+        <w:jc w:val="left"/>
+        <w:rPr>
+          <w:rFonts w:eastAsia="Times New Roman" w:cstheme="minorHAnsi"/>
+          <w:lang w:eastAsia="es-ES"/>
+        </w:rPr>
+      </w:pPr>
+      <w:r>
+        <w:rPr>
+          <w:rFonts w:eastAsia="Times New Roman" w:cstheme="minorHAnsi"/>
+          <w:b/>
+          <w:lang w:eastAsia="es-ES"/>
+        </w:rPr>
+        <w:t>Migración (4 días):</w:t>
+      </w:r>
+    </w:p>
+    <w:p>
+      <w:pPr>
+        <w:pStyle w:val="Prrafodelista"/>
+        <w:numPr>
+          <w:ilvl w:val="1"/>
+          <w:numId w:val="23"/>
+        </w:numPr>
+        <w:spacing w:line="240" w:lineRule="auto"/>
+        <w:jc w:val="left"/>
+        <w:rPr>
+          <w:rFonts w:eastAsia="Times New Roman" w:cstheme="minorHAnsi"/>
+          <w:lang w:eastAsia="es-ES"/>
+        </w:rPr>
+      </w:pPr>
+      <w:r>
+        <w:rPr>
+          <w:rFonts w:eastAsia="Times New Roman" w:cstheme="minorHAnsi"/>
+          <w:lang w:eastAsia="es-ES"/>
+        </w:rPr>
+        <w:t xml:space="preserve">Exportar los datos del sistema actual en Excel </w:t>
+      </w:r>
+    </w:p>
+    <w:p>
+      <w:pPr>
+        <w:pStyle w:val="Prrafodelista"/>
+        <w:numPr>
+          <w:ilvl w:val="1"/>
+          <w:numId w:val="23"/>
+        </w:numPr>
+        <w:spacing w:line="240" w:lineRule="auto"/>
+        <w:jc w:val="left"/>
+        <w:rPr>
+          <w:rFonts w:eastAsia="Times New Roman" w:cstheme="minorHAnsi"/>
+          <w:lang w:eastAsia="es-ES"/>
+        </w:rPr>
+      </w:pPr>
+      <w:r>
+        <w:rPr>
+          <w:rFonts w:eastAsia="Times New Roman" w:cstheme="minorHAnsi"/>
+          <w:lang w:eastAsia="es-ES"/>
+        </w:rPr>
+        <w:t xml:space="preserve">Adaptar los datos al formato CSV compatible con la aplicación </w:t>
+      </w:r>
+    </w:p>
+    <w:p>
+      <w:pPr>
+        <w:pStyle w:val="Prrafodelista"/>
+        <w:numPr>
+          <w:ilvl w:val="1"/>
+          <w:numId w:val="23"/>
+        </w:numPr>
+        <w:spacing w:line="240" w:lineRule="auto"/>
+        <w:jc w:val="left"/>
+        <w:rPr>
+          <w:rFonts w:eastAsia="Times New Roman" w:cstheme="minorHAnsi"/>
+          <w:lang w:eastAsia="es-ES"/>
+        </w:rPr>
+      </w:pPr>
+      <w:r>
+        <w:rPr>
+          <w:rFonts w:eastAsia="Times New Roman" w:cstheme="minorHAnsi"/>
+          <w:lang w:eastAsia="es-ES"/>
+        </w:rPr>
+        <w:t xml:space="preserve">Cargar los datos en la nueva base de datos </w:t>
+      </w:r>
+    </w:p>
+    <w:p>
+      <w:pPr>
+        <w:pStyle w:val="Prrafodelista"/>
+        <w:numPr>
+          <w:ilvl w:val="1"/>
+          <w:numId w:val="23"/>
+        </w:numPr>
+        <w:spacing w:line="240" w:lineRule="auto"/>
+        <w:jc w:val="left"/>
+        <w:rPr>
+          <w:rFonts w:eastAsia="Times New Roman" w:cstheme="minorHAnsi"/>
+          <w:lang w:eastAsia="es-ES"/>
+        </w:rPr>
+      </w:pPr>
+      <w:r>
+        <w:rPr>
+          <w:rFonts w:eastAsia="Times New Roman" w:cstheme="minorHAnsi"/>
+          <w:lang w:eastAsia="es-ES"/>
+        </w:rPr>
+        <w:t>Verificar que todos los datos se han migrado correctamente</w:t>
+      </w:r>
+      <w:r>
+        <w:rPr>
+          <w:rFonts w:cstheme="minorHAnsi"/>
+        </w:rPr>
         <w:tab/>
       </w:r>
     </w:p>
@@ -36249,12 +36510,105 @@
     </w:p>
     <w:p>
       <w:pPr>
+        <w:tabs>
+          <w:tab w:val="left" w:pos="567"/>
+          <w:tab w:val="left" w:pos="2835"/>
+          <w:tab w:val="left" w:pos="5670"/>
+          <w:tab w:val="left" w:pos="7938"/>
+        </w:tabs>
+      </w:pPr>
+    </w:p>
+    <w:p>
+      <w:pPr>
+        <w:tabs>
+          <w:tab w:val="left" w:pos="567"/>
+          <w:tab w:val="left" w:pos="2835"/>
+          <w:tab w:val="left" w:pos="5670"/>
+          <w:tab w:val="left" w:pos="7938"/>
+        </w:tabs>
+      </w:pPr>
+    </w:p>
+    <w:p>
+      <w:pPr>
+        <w:tabs>
+          <w:tab w:val="left" w:pos="567"/>
+          <w:tab w:val="left" w:pos="2835"/>
+          <w:tab w:val="left" w:pos="5670"/>
+          <w:tab w:val="left" w:pos="7938"/>
+        </w:tabs>
+      </w:pPr>
+    </w:p>
+    <w:p>
+      <w:pPr>
+        <w:tabs>
+          <w:tab w:val="left" w:pos="567"/>
+          <w:tab w:val="left" w:pos="2835"/>
+          <w:tab w:val="left" w:pos="5670"/>
+          <w:tab w:val="left" w:pos="7938"/>
+        </w:tabs>
+      </w:pPr>
+    </w:p>
+    <w:p>
+      <w:pPr>
+        <w:tabs>
+          <w:tab w:val="left" w:pos="567"/>
+          <w:tab w:val="left" w:pos="2835"/>
+          <w:tab w:val="left" w:pos="5670"/>
+          <w:tab w:val="left" w:pos="7938"/>
+        </w:tabs>
+      </w:pPr>
+    </w:p>
+    <w:p>
+      <w:pPr>
+        <w:tabs>
+          <w:tab w:val="left" w:pos="567"/>
+          <w:tab w:val="left" w:pos="2835"/>
+          <w:tab w:val="left" w:pos="5670"/>
+          <w:tab w:val="left" w:pos="7938"/>
+        </w:tabs>
+      </w:pPr>
+      <w:bookmarkStart w:id="156" w:name="_GoBack"/>
+      <w:bookmarkEnd w:id="156"/>
+    </w:p>
+    <w:p>
+      <w:pPr>
+        <w:tabs>
+          <w:tab w:val="left" w:pos="567"/>
+          <w:tab w:val="left" w:pos="2835"/>
+          <w:tab w:val="left" w:pos="5670"/>
+          <w:tab w:val="left" w:pos="7938"/>
+        </w:tabs>
+      </w:pPr>
+    </w:p>
+    <w:p>
+      <w:pPr>
+        <w:tabs>
+          <w:tab w:val="left" w:pos="567"/>
+          <w:tab w:val="left" w:pos="2835"/>
+          <w:tab w:val="left" w:pos="5670"/>
+          <w:tab w:val="left" w:pos="7938"/>
+        </w:tabs>
+      </w:pPr>
+    </w:p>
+    <w:p>
+      <w:pPr>
+        <w:tabs>
+          <w:tab w:val="left" w:pos="567"/>
+          <w:tab w:val="left" w:pos="2835"/>
+          <w:tab w:val="left" w:pos="5670"/>
+          <w:tab w:val="left" w:pos="7938"/>
+        </w:tabs>
+      </w:pPr>
+    </w:p>
+    <w:p>
+      <w:pPr>
         <w:pStyle w:val="Ttulo2"/>
       </w:pPr>
       <w:bookmarkStart w:id="157" w:name="_Toc49341865"/>
       <w:bookmarkStart w:id="158" w:name="_Toc170148375"/>
       <w:bookmarkStart w:id="159" w:name="_Toc170148688"/>
       <w:r>
+        <w:lastRenderedPageBreak/>
         <w:t>Manual de instalación</w:t>
       </w:r>
       <w:bookmarkEnd w:id="157"/>
@@ -36264,18 +36618,824 @@
     <w:p>
       <w:pPr>
         <w:pStyle w:val="Ttulo3"/>
-      </w:pPr>
-      <w:bookmarkStart w:id="160" w:name="_Toc37610656"/>
-      <w:bookmarkStart w:id="161" w:name="_Toc49341866"/>
-      <w:bookmarkStart w:id="162" w:name="_Toc170148376"/>
-      <w:bookmarkStart w:id="163" w:name="_Toc170148689"/>
-      <w:r>
-        <w:t>Instalación de la aplicación</w:t>
+        <w:numPr>
+          <w:ilvl w:val="0"/>
+          <w:numId w:val="25"/>
+        </w:numPr>
+        <w:rPr>
+          <w:rFonts w:asciiTheme="minorHAnsi" w:hAnsiTheme="minorHAnsi" w:cstheme="minorHAnsi"/>
+          <w:color w:val="auto"/>
+        </w:rPr>
+      </w:pPr>
+      <w:r>
+        <w:rPr>
+          <w:rFonts w:asciiTheme="minorHAnsi" w:hAnsiTheme="minorHAnsi" w:cstheme="minorHAnsi"/>
+          <w:color w:val="auto"/>
+        </w:rPr>
+        <w:t>Requisitos previos:</w:t>
+      </w:r>
+    </w:p>
+    <w:p>
+      <w:pPr>
+        <w:pStyle w:val="Prrafodelista"/>
+        <w:numPr>
+          <w:ilvl w:val="1"/>
+          <w:numId w:val="25"/>
+        </w:numPr>
+      </w:pPr>
+      <w:r>
+        <w:t>Ordenador con Windows 10/11</w:t>
+      </w:r>
+    </w:p>
+    <w:p>
+      <w:pPr>
+        <w:pStyle w:val="Prrafodelista"/>
+        <w:numPr>
+          <w:ilvl w:val="1"/>
+          <w:numId w:val="25"/>
+        </w:numPr>
+      </w:pPr>
+      <w:r>
+        <w:t>Conexión a internet para las descargas</w:t>
+      </w:r>
+    </w:p>
+    <w:p>
+      <w:pPr>
+        <w:pStyle w:val="Prrafodelista"/>
+        <w:ind w:left="1440"/>
+      </w:pPr>
+    </w:p>
+    <w:p>
+      <w:pPr>
+        <w:pStyle w:val="Prrafodelista"/>
+        <w:numPr>
+          <w:ilvl w:val="0"/>
+          <w:numId w:val="25"/>
+        </w:numPr>
+        <w:rPr>
+          <w:b/>
+        </w:rPr>
+      </w:pPr>
+      <w:r>
+        <w:rPr>
+          <w:b/>
+        </w:rPr>
+        <w:t>Paso 1 – instalar XAMPP:</w:t>
+      </w:r>
+    </w:p>
+    <w:p>
+      <w:pPr>
+        <w:pStyle w:val="Prrafodelista"/>
+        <w:numPr>
+          <w:ilvl w:val="1"/>
+          <w:numId w:val="25"/>
+        </w:numPr>
+      </w:pPr>
+      <w:r>
+        <w:t xml:space="preserve">Descargar XAMPP </w:t>
+      </w:r>
+      <w:r>
+        <w:t xml:space="preserve">desde </w:t>
+      </w:r>
+      <w:hyperlink r:id="rId36" w:history="1">
+        <w:r>
+          <w:rPr>
+            <w:rStyle w:val="Hipervnculo"/>
+          </w:rPr>
+          <w:t>https://www.apachefriends.org</w:t>
+        </w:r>
+      </w:hyperlink>
+    </w:p>
+    <w:p>
+      <w:pPr>
+        <w:pStyle w:val="Prrafodelista"/>
+        <w:numPr>
+          <w:ilvl w:val="1"/>
+          <w:numId w:val="25"/>
+        </w:numPr>
+      </w:pPr>
+      <w:r>
+        <w:t xml:space="preserve">Ejecutar el instalador. </w:t>
+      </w:r>
+    </w:p>
+    <w:p>
+      <w:pPr>
+        <w:pStyle w:val="Prrafodelista"/>
+        <w:numPr>
+          <w:ilvl w:val="1"/>
+          <w:numId w:val="25"/>
+        </w:numPr>
+      </w:pPr>
+      <w:r>
+        <w:t xml:space="preserve">Seleccionar los componentes Apache y </w:t>
+      </w:r>
+      <w:proofErr w:type="spellStart"/>
+      <w:r>
+        <w:t>MySQL</w:t>
+      </w:r>
+      <w:proofErr w:type="spellEnd"/>
+      <w:r>
+        <w:t xml:space="preserve">. </w:t>
+      </w:r>
+    </w:p>
+    <w:p>
+      <w:pPr>
+        <w:pStyle w:val="Prrafodelista"/>
+        <w:numPr>
+          <w:ilvl w:val="1"/>
+          <w:numId w:val="25"/>
+        </w:numPr>
+      </w:pPr>
+      <w:r>
+        <w:t xml:space="preserve">Completar la instalación. </w:t>
+      </w:r>
+    </w:p>
+    <w:p>
+      <w:pPr>
+        <w:pStyle w:val="Prrafodelista"/>
+        <w:numPr>
+          <w:ilvl w:val="1"/>
+          <w:numId w:val="25"/>
+        </w:numPr>
+      </w:pPr>
+      <w:r>
+        <w:t>Abrir el panel de control de XAMPP</w:t>
+      </w:r>
+    </w:p>
+    <w:p>
+      <w:pPr>
+        <w:pStyle w:val="Prrafodelista"/>
+        <w:numPr>
+          <w:ilvl w:val="1"/>
+          <w:numId w:val="25"/>
+        </w:numPr>
+      </w:pPr>
+      <w:r>
+        <w:t xml:space="preserve">Iniciar Apache y </w:t>
+      </w:r>
+      <w:proofErr w:type="spellStart"/>
+      <w:r>
+        <w:t>MySQL</w:t>
+      </w:r>
+      <w:proofErr w:type="spellEnd"/>
+      <w:r>
+        <w:t>.</w:t>
+      </w:r>
+    </w:p>
+    <w:p>
+      <w:pPr>
+        <w:pStyle w:val="Prrafodelista"/>
+        <w:ind w:left="1440"/>
+        <w:rPr>
+          <w:b/>
+        </w:rPr>
+      </w:pPr>
+    </w:p>
+    <w:p>
+      <w:pPr>
+        <w:pStyle w:val="Prrafodelista"/>
+        <w:numPr>
+          <w:ilvl w:val="0"/>
+          <w:numId w:val="25"/>
+        </w:numPr>
+        <w:rPr>
+          <w:b/>
+        </w:rPr>
+      </w:pPr>
+      <w:r>
+        <w:rPr>
+          <w:b/>
+        </w:rPr>
+        <w:t>Paso 2 – crear la base de datos:</w:t>
+      </w:r>
+    </w:p>
+    <w:p>
+      <w:pPr>
+        <w:pStyle w:val="Prrafodelista"/>
+        <w:numPr>
+          <w:ilvl w:val="1"/>
+          <w:numId w:val="25"/>
+        </w:numPr>
+      </w:pPr>
+      <w:r>
+        <w:t xml:space="preserve">Abrir el </w:t>
+      </w:r>
+      <w:r>
+        <w:t xml:space="preserve">navegador y acceder a </w:t>
+      </w:r>
+      <w:hyperlink r:id="rId37" w:history="1">
+        <w:r>
+          <w:rPr>
+            <w:rStyle w:val="Hipervnculo"/>
+          </w:rPr>
+          <w:t>http://localhost/phpmyadmin</w:t>
+        </w:r>
+      </w:hyperlink>
+    </w:p>
+    <w:p>
+      <w:pPr>
+        <w:pStyle w:val="Prrafodelista"/>
+        <w:numPr>
+          <w:ilvl w:val="1"/>
+          <w:numId w:val="25"/>
+        </w:numPr>
+      </w:pPr>
+      <w:r>
+        <w:t xml:space="preserve">Crear una base de datos llamada </w:t>
+      </w:r>
+      <w:proofErr w:type="spellStart"/>
+      <w:r>
+        <w:t>gestion_prestamos_libros</w:t>
+      </w:r>
+      <w:proofErr w:type="spellEnd"/>
+    </w:p>
+    <w:p>
+      <w:pPr>
+        <w:pStyle w:val="Prrafodelista"/>
+        <w:numPr>
+          <w:ilvl w:val="1"/>
+          <w:numId w:val="25"/>
+        </w:numPr>
+      </w:pPr>
+      <w:r>
+        <w:t>Seleccionar cotejamiento utf8_spanish2_ci</w:t>
+      </w:r>
+    </w:p>
+    <w:p>
+      <w:pPr>
+        <w:pStyle w:val="Prrafodelista"/>
+        <w:numPr>
+          <w:ilvl w:val="1"/>
+          <w:numId w:val="25"/>
+        </w:numPr>
+      </w:pPr>
+      <w:r>
+        <w:t>Ejecutar el fichero SQL de creación de tablas.</w:t>
+      </w:r>
+    </w:p>
+    <w:p>
+      <w:pPr>
+        <w:pStyle w:val="Prrafodelista"/>
+        <w:ind w:left="1440"/>
+      </w:pPr>
+      <w:r>
+        <w:t xml:space="preserve">  </w:t>
+      </w:r>
+    </w:p>
+    <w:p>
+      <w:pPr>
+        <w:pStyle w:val="Prrafodelista"/>
+        <w:numPr>
+          <w:ilvl w:val="0"/>
+          <w:numId w:val="25"/>
+        </w:numPr>
+        <w:rPr>
+          <w:b/>
+        </w:rPr>
+      </w:pPr>
+      <w:r>
+        <w:rPr>
+          <w:b/>
+        </w:rPr>
+        <w:t>Paso 3 – Instalar Python:</w:t>
+      </w:r>
+    </w:p>
+    <w:p>
+      <w:pPr>
+        <w:pStyle w:val="Prrafodelista"/>
+        <w:numPr>
+          <w:ilvl w:val="1"/>
+          <w:numId w:val="25"/>
+        </w:numPr>
+      </w:pPr>
+      <w:r>
+        <w:t xml:space="preserve">Descargar Python 3.13 desde </w:t>
+      </w:r>
+      <w:hyperlink r:id="rId38" w:history="1">
+        <w:r>
+          <w:rPr>
+            <w:rStyle w:val="Hipervnculo"/>
+          </w:rPr>
+          <w:t>https://www.python.org/downloads</w:t>
+        </w:r>
+      </w:hyperlink>
+    </w:p>
+    <w:p>
+      <w:pPr>
+        <w:pStyle w:val="Prrafodelista"/>
+        <w:numPr>
+          <w:ilvl w:val="1"/>
+          <w:numId w:val="25"/>
+        </w:numPr>
+      </w:pPr>
+      <w:r>
+        <w:t xml:space="preserve">Ejecutar el instalador. </w:t>
+      </w:r>
+    </w:p>
+    <w:p>
+      <w:pPr>
+        <w:pStyle w:val="Prrafodelista"/>
+        <w:numPr>
+          <w:ilvl w:val="1"/>
+          <w:numId w:val="25"/>
+        </w:numPr>
+      </w:pPr>
+      <w:r>
+        <w:t xml:space="preserve">Completar la instalación. </w:t>
+      </w:r>
+    </w:p>
+    <w:p>
+      <w:pPr>
+        <w:pStyle w:val="Prrafodelista"/>
+        <w:numPr>
+          <w:ilvl w:val="1"/>
+          <w:numId w:val="25"/>
+        </w:numPr>
+      </w:pPr>
+      <w:r>
+        <w:t>Verificar la instalación abriendo CMD y escribiendo: Python –</w:t>
+      </w:r>
+      <w:proofErr w:type="spellStart"/>
+      <w:r>
+        <w:t>version</w:t>
+      </w:r>
+      <w:proofErr w:type="spellEnd"/>
+    </w:p>
+    <w:p>
+      <w:pPr>
+        <w:pStyle w:val="Prrafodelista"/>
+        <w:ind w:left="1440"/>
+        <w:rPr>
+          <w:b/>
+        </w:rPr>
+      </w:pPr>
+    </w:p>
+    <w:p>
+      <w:pPr>
+        <w:pStyle w:val="Prrafodelista"/>
+        <w:numPr>
+          <w:ilvl w:val="0"/>
+          <w:numId w:val="25"/>
+        </w:numPr>
+        <w:rPr>
+          <w:b/>
+        </w:rPr>
+      </w:pPr>
+      <w:r>
+        <w:rPr>
+          <w:b/>
+        </w:rPr>
+        <w:t>Paso 4 – instalar librerías:</w:t>
+      </w:r>
+    </w:p>
+    <w:p>
+      <w:pPr>
+        <w:pStyle w:val="Prrafodelista"/>
+        <w:numPr>
+          <w:ilvl w:val="1"/>
+          <w:numId w:val="25"/>
+        </w:numPr>
+      </w:pPr>
+      <w:r>
+        <w:t>Abrir CMD.</w:t>
+      </w:r>
+    </w:p>
+    <w:p>
+      <w:pPr>
+        <w:pStyle w:val="Prrafodelista"/>
+        <w:numPr>
+          <w:ilvl w:val="1"/>
+          <w:numId w:val="25"/>
+        </w:numPr>
+      </w:pPr>
+      <w:r>
+        <w:t xml:space="preserve">Ejecutar el siguiente comando: </w:t>
+      </w:r>
+      <w:proofErr w:type="spellStart"/>
+      <w:r>
+        <w:t>pp</w:t>
+      </w:r>
+      <w:proofErr w:type="spellEnd"/>
+      <w:r>
+        <w:t xml:space="preserve"> </w:t>
+      </w:r>
+      <w:proofErr w:type="spellStart"/>
+      <w:r>
+        <w:t>install</w:t>
+      </w:r>
+      <w:proofErr w:type="spellEnd"/>
+      <w:r>
+        <w:t xml:space="preserve"> –r requirements.txt</w:t>
+      </w:r>
+    </w:p>
+    <w:p>
+      <w:pPr>
+        <w:pStyle w:val="Prrafodelista"/>
+        <w:ind w:left="1440"/>
+        <w:rPr>
+          <w:b/>
+        </w:rPr>
+      </w:pPr>
+    </w:p>
+    <w:p>
+      <w:pPr>
+        <w:pStyle w:val="Prrafodelista"/>
+        <w:numPr>
+          <w:ilvl w:val="0"/>
+          <w:numId w:val="25"/>
+        </w:numPr>
+        <w:rPr>
+          <w:b/>
+        </w:rPr>
+      </w:pPr>
+      <w:r>
+        <w:rPr>
+          <w:b/>
+        </w:rPr>
+        <w:t>Paso 5 – Configurar la aplicación:</w:t>
+      </w:r>
+    </w:p>
+    <w:p>
+      <w:pPr>
+        <w:pStyle w:val="Prrafodelista"/>
+        <w:numPr>
+          <w:ilvl w:val="1"/>
+          <w:numId w:val="25"/>
+        </w:numPr>
+        <w:rPr>
+          <w:b/>
+        </w:rPr>
+      </w:pPr>
+      <w:r>
+        <w:t xml:space="preserve">Abrir el fichero </w:t>
+      </w:r>
+      <w:r>
+        <w:rPr>
+          <w:rFonts w:eastAsia="Times New Roman" w:cstheme="minorHAnsi"/>
+          <w:lang w:eastAsia="es-ES"/>
+        </w:rPr>
+        <w:t>configuración_base_datos.py</w:t>
+      </w:r>
+    </w:p>
+    <w:p>
+      <w:pPr>
+        <w:pStyle w:val="Prrafodelista"/>
+        <w:numPr>
+          <w:ilvl w:val="1"/>
+          <w:numId w:val="25"/>
+        </w:numPr>
+      </w:pPr>
+      <w:r>
+        <w:t>Verificar que los datos de conexión son correctos:</w:t>
+      </w:r>
+    </w:p>
+    <w:p>
+      <w:pPr>
+        <w:pStyle w:val="Prrafodelista"/>
+        <w:ind w:left="2160"/>
+        <w:rPr>
+          <w:b/>
+        </w:rPr>
+      </w:pPr>
+      <w:proofErr w:type="spellStart"/>
+      <w:r>
+        <w:t>Configuracion</w:t>
+      </w:r>
+      <w:proofErr w:type="spellEnd"/>
+      <w:r>
+        <w:rPr>
+          <w:b/>
+        </w:rPr>
+        <w:t xml:space="preserve"> = {</w:t>
+      </w:r>
+    </w:p>
+    <w:p>
+      <w:pPr>
+        <w:pStyle w:val="Prrafodelista"/>
+        <w:ind w:left="2160"/>
+      </w:pPr>
+      <w:r>
+        <w:rPr>
+          <w:b/>
+        </w:rPr>
+        <w:tab/>
+      </w:r>
+      <w:r>
+        <w:rPr>
+          <w:rStyle w:val="token"/>
+        </w:rPr>
+        <w:t>'host':</w:t>
+      </w:r>
+      <w:r>
+        <w:t xml:space="preserve"> </w:t>
+      </w:r>
+      <w:r>
+        <w:rPr>
+          <w:rStyle w:val="token"/>
+        </w:rPr>
+        <w:t>'</w:t>
+      </w:r>
+      <w:proofErr w:type="spellStart"/>
+      <w:r>
+        <w:rPr>
+          <w:rStyle w:val="token"/>
+        </w:rPr>
+        <w:t>localhost</w:t>
+      </w:r>
+      <w:proofErr w:type="spellEnd"/>
+      <w:r>
+        <w:rPr>
+          <w:rStyle w:val="token"/>
+        </w:rPr>
+        <w:t>',</w:t>
+      </w:r>
+      <w:r>
+        <w:t xml:space="preserve"> </w:t>
+      </w:r>
+    </w:p>
+    <w:p>
+      <w:pPr>
+        <w:pStyle w:val="Prrafodelista"/>
+        <w:ind w:left="2160" w:firstLine="720"/>
+      </w:pPr>
+      <w:r>
+        <w:rPr>
+          <w:rStyle w:val="token"/>
+        </w:rPr>
+        <w:t>'</w:t>
+      </w:r>
+      <w:proofErr w:type="spellStart"/>
+      <w:r>
+        <w:rPr>
+          <w:rStyle w:val="token"/>
+        </w:rPr>
+        <w:t>user</w:t>
+      </w:r>
+      <w:proofErr w:type="spellEnd"/>
+      <w:r>
+        <w:rPr>
+          <w:rStyle w:val="token"/>
+        </w:rPr>
+        <w:t>':</w:t>
+      </w:r>
+      <w:r>
+        <w:t xml:space="preserve"> </w:t>
+      </w:r>
+      <w:r>
+        <w:rPr>
+          <w:rStyle w:val="token"/>
+        </w:rPr>
+        <w:t>'</w:t>
+      </w:r>
+      <w:proofErr w:type="spellStart"/>
+      <w:r>
+        <w:rPr>
+          <w:rStyle w:val="token"/>
+        </w:rPr>
+        <w:t>root</w:t>
+      </w:r>
+      <w:proofErr w:type="spellEnd"/>
+      <w:r>
+        <w:rPr>
+          <w:rStyle w:val="token"/>
+        </w:rPr>
+        <w:t>',</w:t>
+      </w:r>
+      <w:r>
+        <w:t xml:space="preserve"> </w:t>
+      </w:r>
+    </w:p>
+    <w:p>
+      <w:pPr>
+        <w:pStyle w:val="Prrafodelista"/>
+        <w:ind w:left="2160" w:firstLine="720"/>
+      </w:pPr>
+      <w:r>
+        <w:rPr>
+          <w:rStyle w:val="token"/>
+        </w:rPr>
+        <w:t>'</w:t>
+      </w:r>
+      <w:proofErr w:type="spellStart"/>
+      <w:r>
+        <w:rPr>
+          <w:rStyle w:val="token"/>
+        </w:rPr>
+        <w:t>password</w:t>
+      </w:r>
+      <w:proofErr w:type="spellEnd"/>
+      <w:r>
+        <w:rPr>
+          <w:rStyle w:val="token"/>
+        </w:rPr>
+        <w:t>':</w:t>
+      </w:r>
+      <w:r>
+        <w:t xml:space="preserve"> </w:t>
+      </w:r>
+      <w:r>
+        <w:rPr>
+          <w:rStyle w:val="token"/>
+        </w:rPr>
+        <w:t>'',</w:t>
+      </w:r>
+      <w:r>
+        <w:t xml:space="preserve"> </w:t>
+      </w:r>
+    </w:p>
+    <w:p>
+      <w:pPr>
+        <w:pStyle w:val="Prrafodelista"/>
+        <w:ind w:left="2160" w:firstLine="720"/>
+        <w:rPr>
+          <w:b/>
+        </w:rPr>
+      </w:pPr>
+      <w:r>
+        <w:rPr>
+          <w:rStyle w:val="token"/>
+        </w:rPr>
+        <w:t>'</w:t>
+      </w:r>
+      <w:proofErr w:type="spellStart"/>
+      <w:r>
+        <w:rPr>
+          <w:rStyle w:val="token"/>
+        </w:rPr>
+        <w:t>database</w:t>
+      </w:r>
+      <w:proofErr w:type="spellEnd"/>
+      <w:r>
+        <w:rPr>
+          <w:rStyle w:val="token"/>
+        </w:rPr>
+        <w:t>':</w:t>
+      </w:r>
+      <w:r>
+        <w:t xml:space="preserve"> </w:t>
+      </w:r>
+      <w:r>
+        <w:rPr>
+          <w:rStyle w:val="token"/>
+        </w:rPr>
+        <w:t>'</w:t>
+      </w:r>
+      <w:proofErr w:type="spellStart"/>
+      <w:r>
+        <w:rPr>
+          <w:rStyle w:val="token"/>
+        </w:rPr>
+        <w:t>gestion_prestamos_libros</w:t>
+      </w:r>
+      <w:proofErr w:type="spellEnd"/>
+      <w:r>
+        <w:rPr>
+          <w:rStyle w:val="token"/>
+        </w:rPr>
+        <w:t>'</w:t>
+      </w:r>
+    </w:p>
+    <w:p>
+      <w:pPr>
+        <w:pStyle w:val="Prrafodelista"/>
+        <w:ind w:left="2160"/>
+        <w:rPr>
+          <w:b/>
+        </w:rPr>
+      </w:pPr>
+      <w:r>
+        <w:rPr>
+          <w:b/>
+        </w:rPr>
+        <w:t xml:space="preserve">} </w:t>
+      </w:r>
+    </w:p>
+    <w:p>
+      <w:pPr>
+        <w:pStyle w:val="Prrafodelista"/>
+        <w:ind w:left="2160"/>
+        <w:rPr>
+          <w:b/>
+        </w:rPr>
+      </w:pPr>
+    </w:p>
+    <w:p>
+      <w:pPr>
+        <w:pStyle w:val="Prrafodelista"/>
+        <w:ind w:left="2160"/>
+        <w:rPr>
+          <w:b/>
+        </w:rPr>
+      </w:pPr>
+    </w:p>
+    <w:p>
+      <w:pPr>
+        <w:pStyle w:val="Prrafodelista"/>
+        <w:ind w:left="2160"/>
+        <w:rPr>
+          <w:b/>
+        </w:rPr>
+      </w:pPr>
+    </w:p>
+    <w:p>
+      <w:pPr>
+        <w:pStyle w:val="Prrafodelista"/>
+        <w:ind w:left="2160"/>
+        <w:rPr>
+          <w:b/>
+        </w:rPr>
+      </w:pPr>
+    </w:p>
+    <w:p>
+      <w:pPr>
+        <w:pStyle w:val="Prrafodelista"/>
+        <w:numPr>
+          <w:ilvl w:val="0"/>
+          <w:numId w:val="25"/>
+        </w:numPr>
+        <w:rPr>
+          <w:b/>
+        </w:rPr>
+      </w:pPr>
+      <w:r>
+        <w:rPr>
+          <w:b/>
+        </w:rPr>
+        <w:lastRenderedPageBreak/>
+        <w:t>Paso 6 – ejecutar la aplicación:</w:t>
+      </w:r>
+    </w:p>
+    <w:p>
+      <w:pPr>
+        <w:pStyle w:val="Prrafodelista"/>
+        <w:numPr>
+          <w:ilvl w:val="1"/>
+          <w:numId w:val="25"/>
+        </w:numPr>
+      </w:pPr>
+      <w:r>
+        <w:t xml:space="preserve">Abrir CMD </w:t>
+      </w:r>
+    </w:p>
+    <w:p>
+      <w:pPr>
+        <w:pStyle w:val="Prrafodelista"/>
+        <w:numPr>
+          <w:ilvl w:val="1"/>
+          <w:numId w:val="25"/>
+        </w:numPr>
+      </w:pPr>
+      <w:r>
+        <w:t xml:space="preserve">Navegar hasta la carpeta de la </w:t>
+      </w:r>
+      <w:proofErr w:type="spellStart"/>
+      <w:r>
+        <w:t>aplicacion</w:t>
+      </w:r>
+      <w:proofErr w:type="spellEnd"/>
+      <w:r>
+        <w:t xml:space="preserve">: cd </w:t>
+      </w:r>
+      <w:proofErr w:type="spellStart"/>
+      <w:r>
+        <w:t>proyectoDeProgramacion</w:t>
+      </w:r>
+      <w:proofErr w:type="spellEnd"/>
+    </w:p>
+    <w:p>
+      <w:pPr>
+        <w:pStyle w:val="Prrafodelista"/>
+        <w:numPr>
+          <w:ilvl w:val="1"/>
+          <w:numId w:val="25"/>
+        </w:numPr>
+      </w:pPr>
+      <w:r>
+        <w:t xml:space="preserve">Ejecutar la aplicación: </w:t>
+      </w:r>
+      <w:proofErr w:type="spellStart"/>
+      <w:r>
+        <w:t>python</w:t>
+      </w:r>
+      <w:proofErr w:type="spellEnd"/>
+      <w:r>
+        <w:t xml:space="preserve"> main.py </w:t>
+      </w:r>
+    </w:p>
+    <w:p/>
+    <w:p>
+      <w:pPr>
+        <w:pStyle w:val="Ttulo2"/>
+      </w:pPr>
+      <w:bookmarkStart w:id="160" w:name="_Toc49341876"/>
+      <w:bookmarkStart w:id="161" w:name="_Toc170148377"/>
+      <w:bookmarkStart w:id="162" w:name="_Toc170148690"/>
+      <w:r>
+        <w:t>Mejoras posibles</w:t>
       </w:r>
       <w:bookmarkEnd w:id="160"/>
       <w:bookmarkEnd w:id="161"/>
       <w:bookmarkEnd w:id="162"/>
-      <w:bookmarkEnd w:id="163"/>
     </w:p>
     <w:p>
       <w:pPr>
@@ -36289,55 +37449,27 @@
         </w:rPr>
         <w:t>Rellenar</w:t>
       </w:r>
+      <w:bookmarkStart w:id="163" w:name="_Toc49341877"/>
+      <w:bookmarkStart w:id="164" w:name="_Toc170148378"/>
     </w:p>
-    <w:p/>
     <w:p>
       <w:pPr>
+        <w:rPr>
+          <w:color w:val="FF0000"/>
+        </w:rPr>
+      </w:pPr>
+    </w:p>
+    <w:p>
+      <w:pPr>
         <w:pStyle w:val="Ttulo2"/>
       </w:pPr>
-      <w:bookmarkStart w:id="164" w:name="_Toc49341876"/>
-      <w:bookmarkStart w:id="165" w:name="_Toc170148377"/>
-      <w:bookmarkStart w:id="166" w:name="_Toc170148690"/>
-      <w:r>
-        <w:t>Mejoras posibles</w:t>
-      </w:r>
+      <w:bookmarkStart w:id="165" w:name="_Toc170148691"/>
+      <w:r>
+        <w:t>Manual de usuario</w:t>
+      </w:r>
+      <w:bookmarkEnd w:id="163"/>
       <w:bookmarkEnd w:id="164"/>
       <w:bookmarkEnd w:id="165"/>
-      <w:bookmarkEnd w:id="166"/>
-    </w:p>
-    <w:p>
-      <w:pPr>
-        <w:rPr>
-          <w:color w:val="FF0000"/>
-        </w:rPr>
-      </w:pPr>
-      <w:r>
-        <w:rPr>
-          <w:color w:val="FF0000"/>
-        </w:rPr>
-        <w:t>Rellenar</w:t>
-      </w:r>
-      <w:bookmarkStart w:id="167" w:name="_Toc49341877"/>
-      <w:bookmarkStart w:id="168" w:name="_Toc170148378"/>
-    </w:p>
-    <w:p>
-      <w:pPr>
-        <w:rPr>
-          <w:color w:val="FF0000"/>
-        </w:rPr>
-      </w:pPr>
-    </w:p>
-    <w:p>
-      <w:pPr>
-        <w:pStyle w:val="Ttulo2"/>
-      </w:pPr>
-      <w:bookmarkStart w:id="169" w:name="_Toc170148691"/>
-      <w:r>
-        <w:t>Manual de usuario</w:t>
-      </w:r>
-      <w:bookmarkEnd w:id="167"/>
-      <w:bookmarkEnd w:id="168"/>
-      <w:bookmarkEnd w:id="169"/>
     </w:p>
     <w:p>
       <w:pPr>
@@ -36362,8 +37494,8 @@
           <w:lang w:bidi="es-ES"/>
         </w:rPr>
       </w:pPr>
-      <w:bookmarkStart w:id="170" w:name="_Toc49341895"/>
-      <w:bookmarkStart w:id="171" w:name="_Toc170148379"/>
+      <w:bookmarkStart w:id="166" w:name="_Toc49341895"/>
+      <w:bookmarkStart w:id="167" w:name="_Toc170148379"/>
       <w:r>
         <w:rPr>
           <w:lang w:bidi="es-ES"/>
@@ -36381,7 +37513,7 @@
           <w:lang w:bidi="es-ES"/>
         </w:rPr>
       </w:pPr>
-      <w:bookmarkStart w:id="172" w:name="_Toc170148692"/>
+      <w:bookmarkStart w:id="168" w:name="_Toc170148692"/>
       <w:r>
         <w:rPr>
           <w:sz w:val="144"/>
@@ -36391,9 +37523,9 @@
         <w:lastRenderedPageBreak/>
         <w:t>Anexos</w:t>
       </w:r>
-      <w:bookmarkEnd w:id="170"/>
-      <w:bookmarkEnd w:id="171"/>
-      <w:bookmarkEnd w:id="172"/>
+      <w:bookmarkEnd w:id="166"/>
+      <w:bookmarkEnd w:id="167"/>
+      <w:bookmarkEnd w:id="168"/>
     </w:p>
     <w:sdt>
       <w:sdtPr>
@@ -36439,9 +37571,9 @@
               <w:b w:val="0"/>
             </w:rPr>
           </w:pPr>
-          <w:bookmarkStart w:id="173" w:name="_Toc49341896"/>
-          <w:bookmarkStart w:id="174" w:name="_Toc170148380"/>
-          <w:bookmarkStart w:id="175" w:name="_Toc170148693"/>
+          <w:bookmarkStart w:id="169" w:name="_Toc49341896"/>
+          <w:bookmarkStart w:id="170" w:name="_Toc170148380"/>
+          <w:bookmarkStart w:id="171" w:name="_Toc170148693"/>
           <w:r>
             <w:rPr>
               <w:b w:val="0"/>
@@ -36455,9 +37587,9 @@
             </w:rPr>
             <w:t>contrato usado</w:t>
           </w:r>
-          <w:bookmarkEnd w:id="173"/>
-          <w:bookmarkEnd w:id="174"/>
-          <w:bookmarkEnd w:id="175"/>
+          <w:bookmarkEnd w:id="169"/>
+          <w:bookmarkEnd w:id="170"/>
+          <w:bookmarkEnd w:id="171"/>
         </w:p>
         <w:p>
           <w:pPr>
@@ -36490,7 +37622,7 @@
                         </pic:cNvPicPr>
                       </pic:nvPicPr>
                       <pic:blipFill>
-                        <a:blip r:embed="rId36" cstate="print">
+                        <a:blip r:embed="rId39" cstate="print">
                           <a:extLst>
                             <a:ext uri="{28A0092B-C50C-407E-A947-70E740481C1C}">
                               <a14:useLocalDpi xmlns:a14="http://schemas.microsoft.com/office/drawing/2010/main" val="0"/>
@@ -36529,8 +37661,8 @@
               <w:b w:val="0"/>
             </w:rPr>
           </w:pPr>
-          <w:bookmarkStart w:id="176" w:name="_Toc170148381"/>
-          <w:bookmarkStart w:id="177" w:name="_Toc170148694"/>
+          <w:bookmarkStart w:id="172" w:name="_Toc170148381"/>
+          <w:bookmarkStart w:id="173" w:name="_Toc170148694"/>
           <w:r>
             <w:rPr>
               <w:b w:val="0"/>
@@ -36552,8 +37684,8 @@
             </w:rPr>
             <w:t xml:space="preserve"> (alumnos)</w:t>
           </w:r>
-          <w:bookmarkEnd w:id="176"/>
-          <w:bookmarkEnd w:id="177"/>
+          <w:bookmarkEnd w:id="172"/>
+          <w:bookmarkEnd w:id="173"/>
         </w:p>
         <w:p>
           <w:pPr>
@@ -36583,7 +37715,7 @@
                         </pic:cNvPicPr>
                       </pic:nvPicPr>
                       <pic:blipFill>
-                        <a:blip r:embed="rId37" cstate="print">
+                        <a:blip r:embed="rId40" cstate="print">
                           <a:extLst>
                             <a:ext uri="{28A0092B-C50C-407E-A947-70E740481C1C}">
                               <a14:useLocalDpi xmlns:a14="http://schemas.microsoft.com/office/drawing/2010/main" val="0"/>
@@ -36790,9 +37922,9 @@
           <w:b w:val="0"/>
         </w:rPr>
       </w:pPr>
-      <w:bookmarkStart w:id="178" w:name="_Toc49341898"/>
-      <w:bookmarkStart w:id="179" w:name="_Toc170148382"/>
-      <w:bookmarkStart w:id="180" w:name="_Toc170148695"/>
+      <w:bookmarkStart w:id="174" w:name="_Toc49341898"/>
+      <w:bookmarkStart w:id="175" w:name="_Toc170148382"/>
+      <w:bookmarkStart w:id="176" w:name="_Toc170148695"/>
       <w:r>
         <w:rPr>
           <w:b w:val="0"/>
@@ -36800,9 +37932,9 @@
         <w:lastRenderedPageBreak/>
         <w:t>Ejemplo de formulario de satisfacción</w:t>
       </w:r>
-      <w:bookmarkEnd w:id="178"/>
-      <w:bookmarkEnd w:id="179"/>
-      <w:bookmarkEnd w:id="180"/>
+      <w:bookmarkEnd w:id="174"/>
+      <w:bookmarkEnd w:id="175"/>
+      <w:bookmarkEnd w:id="176"/>
     </w:p>
     <w:p>
       <w:r>
@@ -39564,8 +40696,8 @@
           <w:b w:val="0"/>
         </w:rPr>
       </w:pPr>
-      <w:bookmarkStart w:id="181" w:name="_Toc170148383"/>
-      <w:bookmarkStart w:id="182" w:name="_Toc170148696"/>
+      <w:bookmarkStart w:id="177" w:name="_Toc170148383"/>
+      <w:bookmarkStart w:id="178" w:name="_Toc170148696"/>
       <w:r>
         <w:rPr>
           <w:b w:val="0"/>
@@ -39573,8 +40705,8 @@
         <w:lastRenderedPageBreak/>
         <w:t>Datos de prueba</w:t>
       </w:r>
-      <w:bookmarkEnd w:id="181"/>
-      <w:bookmarkEnd w:id="182"/>
+      <w:bookmarkEnd w:id="177"/>
+      <w:bookmarkEnd w:id="178"/>
     </w:p>
     <w:p>
       <w:pPr>
@@ -44426,8 +45558,8 @@
     <w:p/>
     <w:p/>
     <w:sectPr>
-      <w:headerReference w:type="default" r:id="rId38"/>
-      <w:footerReference w:type="default" r:id="rId39"/>
+      <w:headerReference w:type="default" r:id="rId41"/>
+      <w:footerReference w:type="default" r:id="rId42"/>
       <w:pgSz w:w="11906" w:h="16838" w:code="9"/>
       <w:pgMar w:top="1291" w:right="936" w:bottom="720" w:left="936" w:header="0" w:footer="289" w:gutter="0"/>
       <w:pgNumType w:start="1"/>
@@ -44502,7 +45634,7 @@
         <w:noProof/>
         <w:color w:val="024F75" w:themeColor="accent1"/>
       </w:rPr>
-      <w:t>49</w:t>
+      <w:t>45</w:t>
     </w:r>
     <w:r>
       <w:rPr>
@@ -45580,6 +46712,120 @@
     </w:lvl>
   </w:abstractNum>
   <w:abstractNum w:abstractNumId="9" w15:restartNumberingAfterBreak="0">
+    <w:nsid w:val="45F80D1A"/>
+    <w:multiLevelType w:val="hybridMultilevel"/>
+    <w:tmpl w:val="4BE60F60"/>
+    <w:lvl w:ilvl="0" w:tplc="BA387144">
+      <w:start w:val="1"/>
+      <w:numFmt w:val="bullet"/>
+      <w:lvlText w:val=""/>
+      <w:lvlJc w:val="left"/>
+      <w:pPr>
+        <w:ind w:left="720" w:hanging="360"/>
+      </w:pPr>
+      <w:rPr>
+        <w:rFonts w:ascii="Symbol" w:hAnsi="Symbol" w:hint="default"/>
+        <w:color w:val="auto"/>
+      </w:rPr>
+    </w:lvl>
+    <w:lvl w:ilvl="1" w:tplc="0C0A0003">
+      <w:start w:val="1"/>
+      <w:numFmt w:val="bullet"/>
+      <w:lvlText w:val="o"/>
+      <w:lvlJc w:val="left"/>
+      <w:pPr>
+        <w:ind w:left="1440" w:hanging="360"/>
+      </w:pPr>
+      <w:rPr>
+        <w:rFonts w:ascii="Courier New" w:hAnsi="Courier New" w:cs="Courier New" w:hint="default"/>
+      </w:rPr>
+    </w:lvl>
+    <w:lvl w:ilvl="2" w:tplc="0C0A0005">
+      <w:start w:val="1"/>
+      <w:numFmt w:val="bullet"/>
+      <w:lvlText w:val=""/>
+      <w:lvlJc w:val="left"/>
+      <w:pPr>
+        <w:ind w:left="2160" w:hanging="360"/>
+      </w:pPr>
+      <w:rPr>
+        <w:rFonts w:ascii="Wingdings" w:hAnsi="Wingdings" w:hint="default"/>
+      </w:rPr>
+    </w:lvl>
+    <w:lvl w:ilvl="3" w:tplc="0C0A0001" w:tentative="1">
+      <w:start w:val="1"/>
+      <w:numFmt w:val="bullet"/>
+      <w:lvlText w:val=""/>
+      <w:lvlJc w:val="left"/>
+      <w:pPr>
+        <w:ind w:left="2880" w:hanging="360"/>
+      </w:pPr>
+      <w:rPr>
+        <w:rFonts w:ascii="Symbol" w:hAnsi="Symbol" w:hint="default"/>
+      </w:rPr>
+    </w:lvl>
+    <w:lvl w:ilvl="4" w:tplc="0C0A0003" w:tentative="1">
+      <w:start w:val="1"/>
+      <w:numFmt w:val="bullet"/>
+      <w:lvlText w:val="o"/>
+      <w:lvlJc w:val="left"/>
+      <w:pPr>
+        <w:ind w:left="3600" w:hanging="360"/>
+      </w:pPr>
+      <w:rPr>
+        <w:rFonts w:ascii="Courier New" w:hAnsi="Courier New" w:cs="Courier New" w:hint="default"/>
+      </w:rPr>
+    </w:lvl>
+    <w:lvl w:ilvl="5" w:tplc="0C0A0005" w:tentative="1">
+      <w:start w:val="1"/>
+      <w:numFmt w:val="bullet"/>
+      <w:lvlText w:val=""/>
+      <w:lvlJc w:val="left"/>
+      <w:pPr>
+        <w:ind w:left="4320" w:hanging="360"/>
+      </w:pPr>
+      <w:rPr>
+        <w:rFonts w:ascii="Wingdings" w:hAnsi="Wingdings" w:hint="default"/>
+      </w:rPr>
+    </w:lvl>
+    <w:lvl w:ilvl="6" w:tplc="0C0A0001" w:tentative="1">
+      <w:start w:val="1"/>
+      <w:numFmt w:val="bullet"/>
+      <w:lvlText w:val=""/>
+      <w:lvlJc w:val="left"/>
+      <w:pPr>
+        <w:ind w:left="5040" w:hanging="360"/>
+      </w:pPr>
+      <w:rPr>
+        <w:rFonts w:ascii="Symbol" w:hAnsi="Symbol" w:hint="default"/>
+      </w:rPr>
+    </w:lvl>
+    <w:lvl w:ilvl="7" w:tplc="0C0A0003" w:tentative="1">
+      <w:start w:val="1"/>
+      <w:numFmt w:val="bullet"/>
+      <w:lvlText w:val="o"/>
+      <w:lvlJc w:val="left"/>
+      <w:pPr>
+        <w:ind w:left="5760" w:hanging="360"/>
+      </w:pPr>
+      <w:rPr>
+        <w:rFonts w:ascii="Courier New" w:hAnsi="Courier New" w:cs="Courier New" w:hint="default"/>
+      </w:rPr>
+    </w:lvl>
+    <w:lvl w:ilvl="8" w:tplc="0C0A0005" w:tentative="1">
+      <w:start w:val="1"/>
+      <w:numFmt w:val="bullet"/>
+      <w:lvlText w:val=""/>
+      <w:lvlJc w:val="left"/>
+      <w:pPr>
+        <w:ind w:left="6480" w:hanging="360"/>
+      </w:pPr>
+      <w:rPr>
+        <w:rFonts w:ascii="Wingdings" w:hAnsi="Wingdings" w:hint="default"/>
+      </w:rPr>
+    </w:lvl>
+  </w:abstractNum>
+  <w:abstractNum w:abstractNumId="10" w15:restartNumberingAfterBreak="0">
     <w:nsid w:val="46D2207E"/>
     <w:multiLevelType w:val="hybridMultilevel"/>
     <w:tmpl w:val="7F6A73AA"/>
@@ -45692,7 +46938,7 @@
       </w:rPr>
     </w:lvl>
   </w:abstractNum>
-  <w:abstractNum w:abstractNumId="10" w15:restartNumberingAfterBreak="0">
+  <w:abstractNum w:abstractNumId="11" w15:restartNumberingAfterBreak="0">
     <w:nsid w:val="49174A88"/>
     <w:multiLevelType w:val="hybridMultilevel"/>
     <w:tmpl w:val="A3DEF222"/>
@@ -45805,7 +47051,120 @@
       </w:rPr>
     </w:lvl>
   </w:abstractNum>
-  <w:abstractNum w:abstractNumId="11" w15:restartNumberingAfterBreak="0">
+  <w:abstractNum w:abstractNumId="12" w15:restartNumberingAfterBreak="0">
+    <w:nsid w:val="493673B4"/>
+    <w:multiLevelType w:val="hybridMultilevel"/>
+    <w:tmpl w:val="1520F2F2"/>
+    <w:lvl w:ilvl="0" w:tplc="0C0A0003">
+      <w:start w:val="1"/>
+      <w:numFmt w:val="bullet"/>
+      <w:lvlText w:val="o"/>
+      <w:lvlJc w:val="left"/>
+      <w:pPr>
+        <w:ind w:left="1080" w:hanging="360"/>
+      </w:pPr>
+      <w:rPr>
+        <w:rFonts w:ascii="Courier New" w:hAnsi="Courier New" w:cs="Courier New" w:hint="default"/>
+      </w:rPr>
+    </w:lvl>
+    <w:lvl w:ilvl="1" w:tplc="0C0A0003" w:tentative="1">
+      <w:start w:val="1"/>
+      <w:numFmt w:val="bullet"/>
+      <w:lvlText w:val="o"/>
+      <w:lvlJc w:val="left"/>
+      <w:pPr>
+        <w:ind w:left="1800" w:hanging="360"/>
+      </w:pPr>
+      <w:rPr>
+        <w:rFonts w:ascii="Courier New" w:hAnsi="Courier New" w:cs="Courier New" w:hint="default"/>
+      </w:rPr>
+    </w:lvl>
+    <w:lvl w:ilvl="2" w:tplc="0C0A0005" w:tentative="1">
+      <w:start w:val="1"/>
+      <w:numFmt w:val="bullet"/>
+      <w:lvlText w:val=""/>
+      <w:lvlJc w:val="left"/>
+      <w:pPr>
+        <w:ind w:left="2520" w:hanging="360"/>
+      </w:pPr>
+      <w:rPr>
+        <w:rFonts w:ascii="Wingdings" w:hAnsi="Wingdings" w:hint="default"/>
+      </w:rPr>
+    </w:lvl>
+    <w:lvl w:ilvl="3" w:tplc="0C0A0001" w:tentative="1">
+      <w:start w:val="1"/>
+      <w:numFmt w:val="bullet"/>
+      <w:lvlText w:val=""/>
+      <w:lvlJc w:val="left"/>
+      <w:pPr>
+        <w:ind w:left="3240" w:hanging="360"/>
+      </w:pPr>
+      <w:rPr>
+        <w:rFonts w:ascii="Symbol" w:hAnsi="Symbol" w:hint="default"/>
+      </w:rPr>
+    </w:lvl>
+    <w:lvl w:ilvl="4" w:tplc="0C0A0003" w:tentative="1">
+      <w:start w:val="1"/>
+      <w:numFmt w:val="bullet"/>
+      <w:lvlText w:val="o"/>
+      <w:lvlJc w:val="left"/>
+      <w:pPr>
+        <w:ind w:left="3960" w:hanging="360"/>
+      </w:pPr>
+      <w:rPr>
+        <w:rFonts w:ascii="Courier New" w:hAnsi="Courier New" w:cs="Courier New" w:hint="default"/>
+      </w:rPr>
+    </w:lvl>
+    <w:lvl w:ilvl="5" w:tplc="0C0A0005" w:tentative="1">
+      <w:start w:val="1"/>
+      <w:numFmt w:val="bullet"/>
+      <w:lvlText w:val=""/>
+      <w:lvlJc w:val="left"/>
+      <w:pPr>
+        <w:ind w:left="4680" w:hanging="360"/>
+      </w:pPr>
+      <w:rPr>
+        <w:rFonts w:ascii="Wingdings" w:hAnsi="Wingdings" w:hint="default"/>
+      </w:rPr>
+    </w:lvl>
+    <w:lvl w:ilvl="6" w:tplc="0C0A0001" w:tentative="1">
+      <w:start w:val="1"/>
+      <w:numFmt w:val="bullet"/>
+      <w:lvlText w:val=""/>
+      <w:lvlJc w:val="left"/>
+      <w:pPr>
+        <w:ind w:left="5400" w:hanging="360"/>
+      </w:pPr>
+      <w:rPr>
+        <w:rFonts w:ascii="Symbol" w:hAnsi="Symbol" w:hint="default"/>
+      </w:rPr>
+    </w:lvl>
+    <w:lvl w:ilvl="7" w:tplc="0C0A0003" w:tentative="1">
+      <w:start w:val="1"/>
+      <w:numFmt w:val="bullet"/>
+      <w:lvlText w:val="o"/>
+      <w:lvlJc w:val="left"/>
+      <w:pPr>
+        <w:ind w:left="6120" w:hanging="360"/>
+      </w:pPr>
+      <w:rPr>
+        <w:rFonts w:ascii="Courier New" w:hAnsi="Courier New" w:cs="Courier New" w:hint="default"/>
+      </w:rPr>
+    </w:lvl>
+    <w:lvl w:ilvl="8" w:tplc="0C0A0005" w:tentative="1">
+      <w:start w:val="1"/>
+      <w:numFmt w:val="bullet"/>
+      <w:lvlText w:val=""/>
+      <w:lvlJc w:val="left"/>
+      <w:pPr>
+        <w:ind w:left="6840" w:hanging="360"/>
+      </w:pPr>
+      <w:rPr>
+        <w:rFonts w:ascii="Wingdings" w:hAnsi="Wingdings" w:hint="default"/>
+      </w:rPr>
+    </w:lvl>
+  </w:abstractNum>
+  <w:abstractNum w:abstractNumId="13" w15:restartNumberingAfterBreak="0">
     <w:nsid w:val="4C27462A"/>
     <w:multiLevelType w:val="hybridMultilevel"/>
     <w:tmpl w:val="D5AE26E6"/>
@@ -45918,7 +47277,7 @@
       </w:rPr>
     </w:lvl>
   </w:abstractNum>
-  <w:abstractNum w:abstractNumId="12" w15:restartNumberingAfterBreak="0">
+  <w:abstractNum w:abstractNumId="14" w15:restartNumberingAfterBreak="0">
     <w:nsid w:val="54E76D80"/>
     <w:multiLevelType w:val="hybridMultilevel"/>
     <w:tmpl w:val="4CAAA5CC"/>
@@ -46031,7 +47390,7 @@
       </w:rPr>
     </w:lvl>
   </w:abstractNum>
-  <w:abstractNum w:abstractNumId="13" w15:restartNumberingAfterBreak="0">
+  <w:abstractNum w:abstractNumId="15" w15:restartNumberingAfterBreak="0">
     <w:nsid w:val="56DC0F4F"/>
     <w:multiLevelType w:val="hybridMultilevel"/>
     <w:tmpl w:val="DBDE6AE6"/>
@@ -46144,7 +47503,7 @@
       </w:rPr>
     </w:lvl>
   </w:abstractNum>
-  <w:abstractNum w:abstractNumId="14" w15:restartNumberingAfterBreak="0">
+  <w:abstractNum w:abstractNumId="16" w15:restartNumberingAfterBreak="0">
     <w:nsid w:val="584108BF"/>
     <w:multiLevelType w:val="hybridMultilevel"/>
     <w:tmpl w:val="720A6B12"/>
@@ -46257,7 +47616,7 @@
       </w:rPr>
     </w:lvl>
   </w:abstractNum>
-  <w:abstractNum w:abstractNumId="15" w15:restartNumberingAfterBreak="0">
+  <w:abstractNum w:abstractNumId="17" w15:restartNumberingAfterBreak="0">
     <w:nsid w:val="60056615"/>
     <w:multiLevelType w:val="hybridMultilevel"/>
     <w:tmpl w:val="1DA212B2"/>
@@ -46370,7 +47729,7 @@
       </w:rPr>
     </w:lvl>
   </w:abstractNum>
-  <w:abstractNum w:abstractNumId="16" w15:restartNumberingAfterBreak="0">
+  <w:abstractNum w:abstractNumId="18" w15:restartNumberingAfterBreak="0">
     <w:nsid w:val="63C01A14"/>
     <w:multiLevelType w:val="hybridMultilevel"/>
     <w:tmpl w:val="664020B8"/>
@@ -46483,7 +47842,120 @@
       </w:rPr>
     </w:lvl>
   </w:abstractNum>
-  <w:abstractNum w:abstractNumId="17" w15:restartNumberingAfterBreak="0">
+  <w:abstractNum w:abstractNumId="19" w15:restartNumberingAfterBreak="0">
+    <w:nsid w:val="6B7B1346"/>
+    <w:multiLevelType w:val="hybridMultilevel"/>
+    <w:tmpl w:val="63EE2276"/>
+    <w:lvl w:ilvl="0" w:tplc="0C0A0001">
+      <w:start w:val="1"/>
+      <w:numFmt w:val="bullet"/>
+      <w:lvlText w:val=""/>
+      <w:lvlJc w:val="left"/>
+      <w:pPr>
+        <w:ind w:left="720" w:hanging="360"/>
+      </w:pPr>
+      <w:rPr>
+        <w:rFonts w:ascii="Symbol" w:hAnsi="Symbol" w:hint="default"/>
+      </w:rPr>
+    </w:lvl>
+    <w:lvl w:ilvl="1" w:tplc="0C0A0003">
+      <w:start w:val="1"/>
+      <w:numFmt w:val="bullet"/>
+      <w:lvlText w:val="o"/>
+      <w:lvlJc w:val="left"/>
+      <w:pPr>
+        <w:ind w:left="1440" w:hanging="360"/>
+      </w:pPr>
+      <w:rPr>
+        <w:rFonts w:ascii="Courier New" w:hAnsi="Courier New" w:cs="Courier New" w:hint="default"/>
+      </w:rPr>
+    </w:lvl>
+    <w:lvl w:ilvl="2" w:tplc="0C0A0005" w:tentative="1">
+      <w:start w:val="1"/>
+      <w:numFmt w:val="bullet"/>
+      <w:lvlText w:val=""/>
+      <w:lvlJc w:val="left"/>
+      <w:pPr>
+        <w:ind w:left="2160" w:hanging="360"/>
+      </w:pPr>
+      <w:rPr>
+        <w:rFonts w:ascii="Wingdings" w:hAnsi="Wingdings" w:hint="default"/>
+      </w:rPr>
+    </w:lvl>
+    <w:lvl w:ilvl="3" w:tplc="0C0A0001" w:tentative="1">
+      <w:start w:val="1"/>
+      <w:numFmt w:val="bullet"/>
+      <w:lvlText w:val=""/>
+      <w:lvlJc w:val="left"/>
+      <w:pPr>
+        <w:ind w:left="2880" w:hanging="360"/>
+      </w:pPr>
+      <w:rPr>
+        <w:rFonts w:ascii="Symbol" w:hAnsi="Symbol" w:hint="default"/>
+      </w:rPr>
+    </w:lvl>
+    <w:lvl w:ilvl="4" w:tplc="0C0A0003" w:tentative="1">
+      <w:start w:val="1"/>
+      <w:numFmt w:val="bullet"/>
+      <w:lvlText w:val="o"/>
+      <w:lvlJc w:val="left"/>
+      <w:pPr>
+        <w:ind w:left="3600" w:hanging="360"/>
+      </w:pPr>
+      <w:rPr>
+        <w:rFonts w:ascii="Courier New" w:hAnsi="Courier New" w:cs="Courier New" w:hint="default"/>
+      </w:rPr>
+    </w:lvl>
+    <w:lvl w:ilvl="5" w:tplc="0C0A0005" w:tentative="1">
+      <w:start w:val="1"/>
+      <w:numFmt w:val="bullet"/>
+      <w:lvlText w:val=""/>
+      <w:lvlJc w:val="left"/>
+      <w:pPr>
+        <w:ind w:left="4320" w:hanging="360"/>
+      </w:pPr>
+      <w:rPr>
+        <w:rFonts w:ascii="Wingdings" w:hAnsi="Wingdings" w:hint="default"/>
+      </w:rPr>
+    </w:lvl>
+    <w:lvl w:ilvl="6" w:tplc="0C0A0001" w:tentative="1">
+      <w:start w:val="1"/>
+      <w:numFmt w:val="bullet"/>
+      <w:lvlText w:val=""/>
+      <w:lvlJc w:val="left"/>
+      <w:pPr>
+        <w:ind w:left="5040" w:hanging="360"/>
+      </w:pPr>
+      <w:rPr>
+        <w:rFonts w:ascii="Symbol" w:hAnsi="Symbol" w:hint="default"/>
+      </w:rPr>
+    </w:lvl>
+    <w:lvl w:ilvl="7" w:tplc="0C0A0003" w:tentative="1">
+      <w:start w:val="1"/>
+      <w:numFmt w:val="bullet"/>
+      <w:lvlText w:val="o"/>
+      <w:lvlJc w:val="left"/>
+      <w:pPr>
+        <w:ind w:left="5760" w:hanging="360"/>
+      </w:pPr>
+      <w:rPr>
+        <w:rFonts w:ascii="Courier New" w:hAnsi="Courier New" w:cs="Courier New" w:hint="default"/>
+      </w:rPr>
+    </w:lvl>
+    <w:lvl w:ilvl="8" w:tplc="0C0A0005" w:tentative="1">
+      <w:start w:val="1"/>
+      <w:numFmt w:val="bullet"/>
+      <w:lvlText w:val=""/>
+      <w:lvlJc w:val="left"/>
+      <w:pPr>
+        <w:ind w:left="6480" w:hanging="360"/>
+      </w:pPr>
+      <w:rPr>
+        <w:rFonts w:ascii="Wingdings" w:hAnsi="Wingdings" w:hint="default"/>
+      </w:rPr>
+    </w:lvl>
+  </w:abstractNum>
+  <w:abstractNum w:abstractNumId="20" w15:restartNumberingAfterBreak="0">
     <w:nsid w:val="6C750F61"/>
     <w:multiLevelType w:val="hybridMultilevel"/>
     <w:tmpl w:val="66AC513E"/>
@@ -46572,7 +48044,7 @@
       </w:pPr>
     </w:lvl>
   </w:abstractNum>
-  <w:abstractNum w:abstractNumId="18" w15:restartNumberingAfterBreak="0">
+  <w:abstractNum w:abstractNumId="21" w15:restartNumberingAfterBreak="0">
     <w:nsid w:val="71A93B23"/>
     <w:multiLevelType w:val="hybridMultilevel"/>
     <w:tmpl w:val="F6AA92EA"/>
@@ -46685,7 +48157,7 @@
       </w:rPr>
     </w:lvl>
   </w:abstractNum>
-  <w:abstractNum w:abstractNumId="19" w15:restartNumberingAfterBreak="0">
+  <w:abstractNum w:abstractNumId="22" w15:restartNumberingAfterBreak="0">
     <w:nsid w:val="755472A8"/>
     <w:multiLevelType w:val="hybridMultilevel"/>
     <w:tmpl w:val="BFEEAE78"/>
@@ -46798,7 +48270,7 @@
       </w:rPr>
     </w:lvl>
   </w:abstractNum>
-  <w:abstractNum w:abstractNumId="20" w15:restartNumberingAfterBreak="0">
+  <w:abstractNum w:abstractNumId="23" w15:restartNumberingAfterBreak="0">
     <w:nsid w:val="780E04D7"/>
     <w:multiLevelType w:val="hybridMultilevel"/>
     <w:tmpl w:val="AAA02FD2"/>
@@ -46911,7 +48383,7 @@
       </w:rPr>
     </w:lvl>
   </w:abstractNum>
-  <w:abstractNum w:abstractNumId="21" w15:restartNumberingAfterBreak="0">
+  <w:abstractNum w:abstractNumId="24" w15:restartNumberingAfterBreak="0">
     <w:nsid w:val="79306B18"/>
     <w:multiLevelType w:val="hybridMultilevel"/>
     <w:tmpl w:val="B02AD490"/>
@@ -47025,16 +48497,16 @@
     </w:lvl>
   </w:abstractNum>
   <w:num w:numId="1">
-    <w:abstractNumId w:val="20"/>
+    <w:abstractNumId w:val="23"/>
   </w:num>
   <w:num w:numId="2">
-    <w:abstractNumId w:val="12"/>
+    <w:abstractNumId w:val="14"/>
   </w:num>
   <w:num w:numId="3">
     <w:abstractNumId w:val="3"/>
   </w:num>
   <w:num w:numId="4">
-    <w:abstractNumId w:val="10"/>
+    <w:abstractNumId w:val="11"/>
   </w:num>
   <w:num w:numId="5">
     <w:abstractNumId w:val="8"/>
@@ -47043,22 +48515,22 @@
     <w:abstractNumId w:val="4"/>
   </w:num>
   <w:num w:numId="7">
-    <w:abstractNumId w:val="14"/>
+    <w:abstractNumId w:val="16"/>
   </w:num>
   <w:num w:numId="8">
     <w:abstractNumId w:val="6"/>
   </w:num>
   <w:num w:numId="9">
-    <w:abstractNumId w:val="9"/>
+    <w:abstractNumId w:val="10"/>
   </w:num>
   <w:num w:numId="10">
+    <w:abstractNumId w:val="15"/>
+  </w:num>
+  <w:num w:numId="11">
     <w:abstractNumId w:val="13"/>
   </w:num>
-  <w:num w:numId="11">
-    <w:abstractNumId w:val="11"/>
-  </w:num>
   <w:num w:numId="12">
-    <w:abstractNumId w:val="21"/>
+    <w:abstractNumId w:val="24"/>
   </w:num>
   <w:num w:numId="13">
     <w:abstractNumId w:val="0"/>
@@ -47067,28 +48539,37 @@
     <w:abstractNumId w:val="7"/>
   </w:num>
   <w:num w:numId="15">
-    <w:abstractNumId w:val="17"/>
+    <w:abstractNumId w:val="20"/>
   </w:num>
   <w:num w:numId="16">
     <w:abstractNumId w:val="2"/>
   </w:num>
   <w:num w:numId="17">
-    <w:abstractNumId w:val="18"/>
+    <w:abstractNumId w:val="21"/>
   </w:num>
   <w:num w:numId="18">
     <w:abstractNumId w:val="5"/>
   </w:num>
   <w:num w:numId="19">
-    <w:abstractNumId w:val="15"/>
+    <w:abstractNumId w:val="17"/>
   </w:num>
   <w:num w:numId="20">
     <w:abstractNumId w:val="1"/>
   </w:num>
   <w:num w:numId="21">
+    <w:abstractNumId w:val="22"/>
+  </w:num>
+  <w:num w:numId="22">
+    <w:abstractNumId w:val="18"/>
+  </w:num>
+  <w:num w:numId="23">
     <w:abstractNumId w:val="19"/>
   </w:num>
-  <w:num w:numId="22">
-    <w:abstractNumId w:val="16"/>
+  <w:num w:numId="24">
+    <w:abstractNumId w:val="12"/>
+  </w:num>
+  <w:num w:numId="25">
+    <w:abstractNumId w:val="9"/>
   </w:num>
   <w:numIdMacAtCleanup w:val="9"/>
 </w:numbering>
@@ -47199,7 +48680,7 @@
     <w:lsdException w:name="Block Text" w:semiHidden="1" w:uiPriority="3" w:unhideWhenUsed="1" w:qFormat="1"/>
     <w:lsdException w:name="Hyperlink" w:semiHidden="1" w:unhideWhenUsed="1"/>
     <w:lsdException w:name="FollowedHyperlink" w:semiHidden="1" w:unhideWhenUsed="1"/>
-    <w:lsdException w:name="Strong" w:semiHidden="1" w:uiPriority="2" w:unhideWhenUsed="1" w:qFormat="1"/>
+    <w:lsdException w:name="Strong" w:semiHidden="1" w:uiPriority="22" w:unhideWhenUsed="1" w:qFormat="1"/>
     <w:lsdException w:name="Emphasis" w:semiHidden="1" w:uiPriority="2" w:unhideWhenUsed="1" w:qFormat="1"/>
     <w:lsdException w:name="Document Map" w:semiHidden="1" w:unhideWhenUsed="1"/>
     <w:lsdException w:name="Plain Text" w:semiHidden="1" w:unhideWhenUsed="1"/>
@@ -48557,6 +50038,35 @@
       <w:shd w:val="clear" w:color="auto" w:fill="E1DFDD"/>
     </w:rPr>
   </w:style>
+  <w:style w:type="character" w:styleId="CdigoHTML">
+    <w:name w:val="HTML Code"/>
+    <w:basedOn w:val="Fuentedeprrafopredeter"/>
+    <w:uiPriority w:val="99"/>
+    <w:semiHidden/>
+    <w:unhideWhenUsed/>
+    <w:rsid w:val="00904A2F"/>
+    <w:rPr>
+      <w:rFonts w:ascii="Courier New" w:eastAsia="Times New Roman" w:hAnsi="Courier New" w:cs="Courier New"/>
+      <w:sz w:val="20"/>
+      <w:szCs w:val="20"/>
+    </w:rPr>
+  </w:style>
+  <w:style w:type="character" w:styleId="Textoennegrita">
+    <w:name w:val="Strong"/>
+    <w:basedOn w:val="Fuentedeprrafopredeter"/>
+    <w:uiPriority w:val="22"/>
+    <w:qFormat/>
+    <w:rsid w:val="00904A2F"/>
+    <w:rPr>
+      <w:b/>
+      <w:bCs/>
+    </w:rPr>
+  </w:style>
+  <w:style w:type="character" w:customStyle="1" w:styleId="token">
+    <w:name w:val="token"/>
+    <w:basedOn w:val="Fuentedeprrafopredeter"/>
+    <w:rsid w:val="0013587D"/>
+  </w:style>
 </w:styles>
 </file>
 
@@ -48944,6 +50454,7 @@
     <w:rsid w:val="001370FA"/>
     <w:rsid w:val="001C78F4"/>
     <w:rsid w:val="00216802"/>
+    <w:rsid w:val="002362B9"/>
     <w:rsid w:val="00236FE3"/>
     <w:rsid w:val="002416C9"/>
     <w:rsid w:val="00250258"/>
@@ -49005,6 +50516,7 @@
     <w:rsid w:val="009D0F67"/>
     <w:rsid w:val="009F7343"/>
     <w:rsid w:val="00A015F9"/>
+    <w:rsid w:val="00A641D3"/>
     <w:rsid w:val="00A71D6A"/>
     <w:rsid w:val="00A94268"/>
     <w:rsid w:val="00AC11EA"/>
@@ -49837,7 +51349,7 @@
 </file>
 
 <file path=customXml/itemProps2.xml><?xml version="1.0" encoding="utf-8"?>
-<ds:datastoreItem xmlns:ds="http://schemas.openxmlformats.org/officeDocument/2006/customXml" ds:itemID="{74BE525B-0704-4230-9878-AE555396D811}">
+<ds:datastoreItem xmlns:ds="http://schemas.openxmlformats.org/officeDocument/2006/customXml" ds:itemID="{C3ABB51E-38BA-42CF-A1CE-A7BA7CEC5885}">
   <ds:schemaRefs>
     <ds:schemaRef ds:uri="http://schemas.openxmlformats.org/officeDocument/2006/bibliography"/>
   </ds:schemaRefs>

</xml_diff>